<commit_message>
Commented out Composite Layout upload until it works but put all the right docx file into the system.
</commit_message>
<xml_diff>
--- a/src/Layers/W1/BaseApp/Foundation/Reporting/HeaderfooterDesign/ExternalDefault.docx
+++ b/src/Layers/W1/BaseApp/Foundation/Reporting/HeaderfooterDesign/ExternalDefault.docx
@@ -495,7 +495,14 @@
                   <w:rFonts w:cs="Segoe UI"/>
                   <w:color w:val="242424"/>
                 </w:rPr>
-                <w:t>www.xxss.dk</w:t>
+                <w:t>www.</w:t>
+              </w:r>
+              <w:r>
+                <w:rPr>
+                  <w:rFonts w:cs="Segoe UI"/>
+                  <w:color w:val="242424"/>
+                </w:rPr>
+                <w:t>contoso.com</w:t>
               </w:r>
             </w:sdtContent>
           </w:sdt>
@@ -536,7 +543,7 @@
                   <w:rFonts w:cs="Segoe UI"/>
                   <w:color w:val="242424"/>
                 </w:rPr>
-                <w:t>34-2345667</w:t>
+                <w:t>0666-666-6666</w:t>
               </w:r>
             </w:p>
           </w:sdtContent>
@@ -577,7 +584,7 @@
                   <w:rFonts w:cs="Segoe UI"/>
                   <w:color w:val="242424"/>
                 </w:rPr>
-                <w:t>dfdfd@dfdfd.dfd</w:t>
+                <w:t>John.doe@contoso.com</w:t>
               </w:r>
             </w:p>
           </w:sdtContent>
@@ -595,7 +602,7 @@
               <w:color w:val="242424"/>
             </w:rPr>
             <w:alias w:val="CompanyFax"/>
-            <w:tag w:val="#BC:InsertDataItem,BCReportInformation/CompanyMetadata/CompanyFax"/>
+            <w:tag w:val="#BC:InsertDataItem,BCReportInformation/CompanyMetadata/CompanyFaxNo"/>
             <w:id w:val="-1203696550"/>
             <w:placeholder>
               <w:docPart w:val="7104214807C1491D9DA3C558DAF34463"/>
@@ -618,7 +625,7 @@
                   <w:rFonts w:cs="Segoe UI"/>
                   <w:color w:val="242424"/>
                 </w:rPr>
-                <w:t>12345678</w:t>
+                <w:t>0666-666-6660</w:t>
               </w:r>
             </w:p>
           </w:sdtContent>
@@ -688,6 +695,7 @@
               <w15:color w:val="808080"/>
               <w:text/>
             </w:sdtPr>
+            <w:sdtEndPr/>
             <w:sdtContent>
               <w:r>
                 <w:rPr>
@@ -722,13 +730,21 @@
               <w15:color w:val="808080"/>
               <w:text/>
             </w:sdtPr>
+            <w:sdtEndPr/>
             <w:sdtContent>
               <w:r>
                 <w:rPr>
                   <w:rFonts w:cs="Segoe UI"/>
                   <w:color w:val="242424"/>
                 </w:rPr>
-                <w:t>www.xxss.dk</w:t>
+                <w:t>www.</w:t>
+              </w:r>
+              <w:r>
+                <w:rPr>
+                  <w:rFonts w:cs="Segoe UI"/>
+                  <w:color w:val="242424"/>
+                </w:rPr>
+                <w:t>contoso.com</w:t>
               </w:r>
             </w:sdtContent>
           </w:sdt>
@@ -763,6 +779,7 @@
               <w15:color w:val="808080"/>
               <w:text/>
             </w:sdtPr>
+            <w:sdtEndPr/>
             <w:sdtContent>
               <w:r>
                 <w:rPr>
@@ -797,13 +814,14 @@
               <w15:color w:val="808080"/>
               <w:text/>
             </w:sdtPr>
+            <w:sdtEndPr/>
             <w:sdtContent>
               <w:r>
                 <w:rPr>
                   <w:rFonts w:cs="Segoe UI"/>
                   <w:color w:val="242424"/>
                 </w:rPr>
-                <w:t>34-2345667</w:t>
+                <w:t>0666-666-6666</w:t>
               </w:r>
             </w:sdtContent>
           </w:sdt>
@@ -863,13 +881,14 @@
               <w15:color w:val="808080"/>
               <w:text/>
             </w:sdtPr>
+            <w:sdtEndPr/>
             <w:sdtContent>
               <w:r>
                 <w:rPr>
                   <w:rFonts w:cs="Segoe UI"/>
                   <w:color w:val="242424"/>
                 </w:rPr>
-                <w:t>dfdfd@dfdfd.dfd</w:t>
+                <w:t>john.doe@contoso.com</w:t>
               </w:r>
             </w:sdtContent>
           </w:sdt>
@@ -909,11 +928,13 @@
           <w:sdt>
             <w:sdtPr>
               <w:rPr>
-                <w:rFonts w:cs="Segoe UI"/>
-                <w:color w:val="242424"/>
+                <w:rFonts w:ascii="Courier New" w:hAnsi="Courier New" w:cs="Courier New"/>
+                <w:color w:val="000000"/>
+                <w:sz w:val="20"/>
+                <w:szCs w:val="20"/>
               </w:rPr>
               <w:alias w:val="CompanyFax"/>
-              <w:tag w:val="#BC:InsertDataItem,BCReportInformation/CompanyMetadata/CompanyFax"/>
+              <w:tag w:val="#BC:InsertDataItem,BCReportInformation/CompanyMetadata/CompanyFaxNo"/>
               <w:id w:val="-1719971171"/>
               <w:placeholder>
                 <w:docPart w:val="6043B991FB864B7387533FC57F806BE3"/>
@@ -921,13 +942,16 @@
               <w15:color w:val="808080"/>
               <w:text/>
             </w:sdtPr>
+            <w:sdtEndPr/>
             <w:sdtContent>
               <w:r>
                 <w:rPr>
-                  <w:rFonts w:cs="Segoe UI"/>
-                  <w:color w:val="242424"/>
+                  <w:rFonts w:ascii="Courier New" w:hAnsi="Courier New" w:cs="Courier New"/>
+                  <w:color w:val="000000"/>
+                  <w:sz w:val="20"/>
+                  <w:szCs w:val="20"/>
                 </w:rPr>
-                <w:t>12345678</w:t>
+                <w:t>0666-666-6660</w:t>
               </w:r>
             </w:sdtContent>
           </w:sdt>
@@ -1007,7 +1031,7 @@
               <w:pPr>
                 <w:pStyle w:val="Title"/>
                 <w:rPr>
-                  <w:rFonts w:ascii="Segoe UI" w:hAnsi="Segoe UI" w:eastAsia="Times New Roman" w:cs="Segoe UI"/>
+                  <w:rFonts w:ascii="Segoe UI" w:eastAsia="Times New Roman" w:hAnsi="Segoe UI" w:cs="Segoe UI"/>
                   <w:spacing w:val="-10"/>
                   <w:kern w:val="28"/>
                   <w:sz w:val="56"/>
@@ -1102,42 +1126,22 @@
           <w:pPr>
             <w:spacing w:before="120" w:after="0" w:line="278" w:lineRule="auto"/>
             <w:rPr>
-              <w:rFonts w:ascii="Aptos" w:hAnsi="Aptos" w:eastAsia="Aptos" w:cs="Times New Roman"/>
+              <w:rFonts w:ascii="Aptos" w:eastAsia="Aptos" w:hAnsi="Aptos" w:cs="Times New Roman"/>
             </w:rPr>
           </w:pPr>
         </w:p>
       </w:tc>
-      <w:sdt>
-        <w:sdtPr>
-          <w:alias w:val="DocumentDate"/>
-          <w:tag w:val="#BC:InsertDataItem,DataItems/Header/DocumentDate"/>
-          <w:id w:val="870340531"/>
-          <w:placeholder>
-            <w:docPart w:val="DefaultPlaceholder_-1854013440"/>
-          </w:placeholder>
-          <w15:color w:val="808080"/>
-          <w:text/>
-        </w:sdtPr>
-        <w:sdtEndPr/>
-        <w:sdtContent>
-          <w:tc>
-            <w:tcPr>
-              <w:tcW w:w="2621" w:type="pct"/>
-            </w:tcPr>
-            <w:p>
-              <w:pPr>
-                <w:pStyle w:val="NoSpacing"/>
-                <w:jc w:val="right"/>
-              </w:pPr>
-              <w:proofErr w:type="spellStart"/>
-              <w:r>
-                <w:t>DocumentDate</w:t>
-              </w:r>
-              <w:proofErr w:type="spellEnd"/>
-            </w:p>
-          </w:tc>
-        </w:sdtContent>
-      </w:sdt>
+      <w:tc>
+        <w:tcPr>
+          <w:tcW w:w="2621" w:type="pct"/>
+        </w:tcPr>
+        <w:p>
+          <w:pPr>
+            <w:pStyle w:val="NoSpacing"/>
+            <w:jc w:val="right"/>
+          </w:pPr>
+        </w:p>
+      </w:tc>
     </w:tr>
     <w:tr>
       <w:trPr>
@@ -1152,7 +1156,7 @@
           <w:pPr>
             <w:spacing w:before="120" w:after="0" w:line="278" w:lineRule="auto"/>
             <w:rPr>
-              <w:rFonts w:ascii="Aptos" w:hAnsi="Aptos" w:eastAsia="Aptos" w:cs="Times New Roman"/>
+              <w:rFonts w:ascii="Aptos" w:eastAsia="Aptos" w:hAnsi="Aptos" w:cs="Times New Roman"/>
             </w:rPr>
           </w:pPr>
         </w:p>
@@ -1180,7 +1184,15 @@
             <w:sdtEndPr/>
             <w:sdtContent>
               <w:r>
-                <w:t>Company Name</w:t>
+                <w:t xml:space="preserve">Contoso </w:t>
+              </w:r>
+              <w:proofErr w:type="spellStart"/>
+              <w:r>
+                <w:t>Internaltion</w:t>
+              </w:r>
+              <w:proofErr w:type="spellEnd"/>
+              <w:r>
+                <w:t xml:space="preserve"> Ltd.</w:t>
               </w:r>
             </w:sdtContent>
           </w:sdt>
@@ -1203,7 +1215,7 @@
 </file>
 
 <file path=word/header2.xml><?xml version="1.0" encoding="utf-8"?>
-<w:hdr xmlns:a="http://schemas.openxmlformats.org/drawingml/2006/main" xmlns:pic="http://schemas.openxmlformats.org/drawingml/2006/picture" xmlns:a14="http://schemas.microsoft.com/office/drawing/2010/main" xmlns:wpc="http://schemas.microsoft.com/office/word/2010/wordprocessingCanvas" xmlns:cx="http://schemas.microsoft.com/office/drawing/2014/chartex" xmlns:cx1="http://schemas.microsoft.com/office/drawing/2015/9/8/chartex" xmlns:cx2="http://schemas.microsoft.com/office/drawing/2015/10/21/chartex" xmlns:cx3="http://schemas.microsoft.com/office/drawing/2016/5/9/chartex" xmlns:cx4="http://schemas.microsoft.com/office/drawing/2016/5/10/chartex" xmlns:cx5="http://schemas.microsoft.com/office/drawing/2016/5/11/chartex" xmlns:cx6="http://schemas.microsoft.com/office/drawing/2016/5/12/chartex" xmlns:cx7="http://schemas.microsoft.com/office/drawing/2016/5/13/chartex" xmlns:cx8="http://schemas.microsoft.com/office/drawing/2016/5/14/chartex" xmlns:mc="http://schemas.openxmlformats.org/markup-compatibility/2006" xmlns:aink="http://schemas.microsoft.com/office/drawing/2016/ink" xmlns:am3d="http://schemas.microsoft.com/office/drawing/2017/model3d" xmlns:o="urn:schemas-microsoft-com:office:office" xmlns:oel="http://schemas.microsoft.com/office/2019/extlst" xmlns:r="http://schemas.openxmlformats.org/officeDocument/2006/relationships" xmlns:m="http://schemas.openxmlformats.org/officeDocument/2006/math" xmlns:v="urn:schemas-microsoft-com:vml" xmlns:wp14="http://schemas.microsoft.com/office/word/2010/wordprocessingDrawing" xmlns:wp="http://schemas.openxmlformats.org/drawingml/2006/wordprocessingDrawing" xmlns:w10="urn:schemas-microsoft-com:office:word" xmlns:w="http://schemas.openxmlformats.org/wordprocessingml/2006/main" xmlns:w14="http://schemas.microsoft.com/office/word/2010/wordml" xmlns:w15="http://schemas.microsoft.com/office/word/2012/wordml" xmlns:w16cei="http://schemas.microsoft.com/office/word/2026/wordml/cei" xmlns:w16cex="http://schemas.microsoft.com/office/word/2018/wordml/cex" xmlns:w16cid="http://schemas.microsoft.com/office/word/2016/wordml/cid" xmlns:w16="http://schemas.microsoft.com/office/word/2018/wordml" xmlns:w16du="http://schemas.microsoft.com/office/word/2023/wordml/word16du" xmlns:w16sdtdh="http://schemas.microsoft.com/office/word/2020/wordml/sdtdatahash" xmlns:w16sdtfl="http://schemas.microsoft.com/office/word/2024/wordml/sdtformatlock" xmlns:w16se="http://schemas.microsoft.com/office/word/2015/wordml/symex" xmlns:wpg="http://schemas.microsoft.com/office/word/2010/wordprocessingGroup" xmlns:wpi="http://schemas.microsoft.com/office/word/2010/wordprocessingInk" xmlns:wne="http://schemas.microsoft.com/office/word/2006/wordml" xmlns:wps="http://schemas.microsoft.com/office/word/2010/wordprocessingShape" mc:Ignorable="w14 w15 w16se w16cid w16 w16cex w16sdtdh w16sdtfl w16du wp14">
+<w:hdr xmlns:wpc="http://schemas.microsoft.com/office/word/2010/wordprocessingCanvas" xmlns:cx="http://schemas.microsoft.com/office/drawing/2014/chartex" xmlns:cx1="http://schemas.microsoft.com/office/drawing/2015/9/8/chartex" xmlns:cx2="http://schemas.microsoft.com/office/drawing/2015/10/21/chartex" xmlns:cx3="http://schemas.microsoft.com/office/drawing/2016/5/9/chartex" xmlns:cx4="http://schemas.microsoft.com/office/drawing/2016/5/10/chartex" xmlns:cx5="http://schemas.microsoft.com/office/drawing/2016/5/11/chartex" xmlns:cx6="http://schemas.microsoft.com/office/drawing/2016/5/12/chartex" xmlns:cx7="http://schemas.microsoft.com/office/drawing/2016/5/13/chartex" xmlns:cx8="http://schemas.microsoft.com/office/drawing/2016/5/14/chartex" xmlns:mc="http://schemas.openxmlformats.org/markup-compatibility/2006" xmlns:aink="http://schemas.microsoft.com/office/drawing/2016/ink" xmlns:am3d="http://schemas.microsoft.com/office/drawing/2017/model3d" xmlns:o="urn:schemas-microsoft-com:office:office" xmlns:oel="http://schemas.microsoft.com/office/2019/extlst" xmlns:r="http://schemas.openxmlformats.org/officeDocument/2006/relationships" xmlns:m="http://schemas.openxmlformats.org/officeDocument/2006/math" xmlns:v="urn:schemas-microsoft-com:vml" xmlns:wp14="http://schemas.microsoft.com/office/word/2010/wordprocessingDrawing" xmlns:wp="http://schemas.openxmlformats.org/drawingml/2006/wordprocessingDrawing" xmlns:w10="urn:schemas-microsoft-com:office:word" xmlns:w="http://schemas.openxmlformats.org/wordprocessingml/2006/main" xmlns:w14="http://schemas.microsoft.com/office/word/2010/wordml" xmlns:w15="http://schemas.microsoft.com/office/word/2012/wordml" xmlns:w16cei="http://schemas.microsoft.com/office/word/2026/wordml/cei" xmlns:w16cex="http://schemas.microsoft.com/office/word/2018/wordml/cex" xmlns:w16cid="http://schemas.microsoft.com/office/word/2016/wordml/cid" xmlns:w16="http://schemas.microsoft.com/office/word/2018/wordml" xmlns:w16du="http://schemas.microsoft.com/office/word/2023/wordml/word16du" xmlns:w16sdtdh="http://schemas.microsoft.com/office/word/2020/wordml/sdtdatahash" xmlns:w16sdtfl="http://schemas.microsoft.com/office/word/2024/wordml/sdtformatlock" xmlns:w16se="http://schemas.microsoft.com/office/word/2015/wordml/symex" xmlns:wpg="http://schemas.microsoft.com/office/word/2010/wordprocessingGroup" xmlns:wpi="http://schemas.microsoft.com/office/word/2010/wordprocessingInk" xmlns:wne="http://schemas.microsoft.com/office/word/2006/wordml" xmlns:wps="http://schemas.microsoft.com/office/word/2010/wordprocessingShape" mc:Ignorable="w14 w15 w16se w16cid w16 w16cex w16sdtdh w16sdtfl w16du wp14">
   <w:tbl>
     <w:tblPr>
       <w:tblStyle w:val="BCBlockTable"/>
@@ -1373,6 +1385,7 @@
               <w:id w:val="943343575"/>
               <w:picture/>
             </w:sdtPr>
+            <w:sdtEndPr/>
             <w:sdtContent>
               <w:r>
                 <w:rPr>
@@ -2667,32 +2680,6 @@
     </w:docPart>
     <w:docPart>
       <w:docPartPr>
-        <w:name w:val="DefaultPlaceholder_-1854013440"/>
-        <w:category>
-          <w:name w:val="General"/>
-          <w:gallery w:val="placeholder"/>
-        </w:category>
-        <w:types>
-          <w:type w:val="bbPlcHdr"/>
-        </w:types>
-        <w:behaviors>
-          <w:behavior w:val="content"/>
-        </w:behaviors>
-        <w:guid w:val="{70E4257D-7402-443B-9628-759911265749}"/>
-      </w:docPartPr>
-      <w:docPartBody>
-        <w:p>
-          <w:r>
-            <w:rPr>
-              <w:rStyle w:val="PlaceholderText"/>
-            </w:rPr>
-            <w:t>Click or tap here to enter text.</w:t>
-          </w:r>
-        </w:p>
-      </w:docPartBody>
-    </w:docPart>
-    <w:docPart>
-      <w:docPartPr>
         <w:name w:val="C6377B5B0A7C484C8A8C034B5AC1C9DB"/>
         <w:category>
           <w:name w:val="General"/>
@@ -2914,14 +2901,19 @@
     <w:sig w:usb0="80000023" w:usb1="00000000" w:usb2="00020000" w:usb3="00000000" w:csb0="00000001" w:csb1="00000000"/>
   </w:font>
   <w:font w:name="Aptos">
-    <w:panose1 w:val="020B0004020202020204"/>
     <w:charset w:val="00"/>
     <w:family w:val="swiss"/>
     <w:pitch w:val="variable"/>
     <w:sig w:usb0="20000287" w:usb1="00000003" w:usb2="00000000" w:usb3="00000000" w:csb0="0000019F" w:csb1="00000000"/>
   </w:font>
+  <w:font w:name="Courier New">
+    <w:panose1 w:val="02070309020205020404"/>
+    <w:charset w:val="00"/>
+    <w:family w:val="modern"/>
+    <w:pitch w:val="fixed"/>
+    <w:sig w:usb0="E0002EFF" w:usb1="C0007843" w:usb2="00000009" w:usb3="00000000" w:csb0="000001FF" w:csb1="00000000"/>
+  </w:font>
   <w:font w:name="Aptos Display">
-    <w:panose1 w:val="020B0004020202020204"/>
     <w:charset w:val="00"/>
     <w:family w:val="swiss"/>
     <w:pitch w:val="variable"/>
@@ -2949,18 +2941,21 @@
     <w:rsidRoot w:val="005E35BE"/>
     <w:rsid w:val="00003B56"/>
     <w:rsid w:val="0003303F"/>
+    <w:rsid w:val="00042276"/>
     <w:rsid w:val="000706A7"/>
     <w:rsid w:val="00073078"/>
     <w:rsid w:val="00082B18"/>
     <w:rsid w:val="0009355D"/>
     <w:rsid w:val="001024F7"/>
     <w:rsid w:val="00133336"/>
+    <w:rsid w:val="00182A4D"/>
     <w:rsid w:val="001A2258"/>
     <w:rsid w:val="001D6FE3"/>
     <w:rsid w:val="001F6C15"/>
     <w:rsid w:val="0027442B"/>
     <w:rsid w:val="002839BD"/>
     <w:rsid w:val="002A6E8F"/>
+    <w:rsid w:val="002B26E2"/>
     <w:rsid w:val="002B3B07"/>
     <w:rsid w:val="002B4421"/>
     <w:rsid w:val="002B6532"/>
@@ -2976,6 +2971,7 @@
     <w:rsid w:val="003E037C"/>
     <w:rsid w:val="003F5C4E"/>
     <w:rsid w:val="00401EE8"/>
+    <w:rsid w:val="00425095"/>
     <w:rsid w:val="0042793B"/>
     <w:rsid w:val="0043381F"/>
     <w:rsid w:val="00441283"/>
@@ -2988,6 +2984,7 @@
     <w:rsid w:val="00591BD2"/>
     <w:rsid w:val="005E35BE"/>
     <w:rsid w:val="006330A6"/>
+    <w:rsid w:val="006C0148"/>
     <w:rsid w:val="006E220A"/>
     <w:rsid w:val="006F7175"/>
     <w:rsid w:val="0077336F"/>
@@ -2999,6 +2996,7 @@
     <w:rsid w:val="0080614B"/>
     <w:rsid w:val="00822ACB"/>
     <w:rsid w:val="00825186"/>
+    <w:rsid w:val="0085166E"/>
     <w:rsid w:val="0089757A"/>
     <w:rsid w:val="008A720C"/>
     <w:rsid w:val="008C225B"/>
@@ -3028,6 +3026,7 @@
     <w:rsid w:val="00CD6CA3"/>
     <w:rsid w:val="00CE4C52"/>
     <w:rsid w:val="00D52343"/>
+    <w:rsid w:val="00E428EF"/>
     <w:rsid w:val="00E70BBF"/>
     <w:rsid w:val="00E82213"/>
     <w:rsid w:val="00F635C5"/>
@@ -3053,8 +3052,8 @@
   </m:mathPr>
   <w:themeFontLang w:val="en-US"/>
   <w:clrSchemeMapping w:bg1="light1" w:t1="dark1" w:bg2="light2" w:t2="dark2" w:accent1="accent1" w:accent2="accent2" w:accent3="accent3" w:accent4="accent4" w:accent5="accent5" w:accent6="accent6" w:hyperlink="hyperlink" w:followedHyperlink="followedHyperlink"/>
-  <w:decimalSymbol w:val="."/>
-  <w:listSeparator w:val=","/>
+  <w:decimalSymbol w:val=","/>
+  <w:listSeparator w:val=";"/>
   <w15:chartTrackingRefBased/>
 </w:settings>
 </file>
@@ -3508,20 +3507,6 @@
       <w14:ligatures w14:val="standardContextual"/>
     </w:rPr>
   </w:style>
-  <w:style w:type="paragraph" w:customStyle="1" w:styleId="AAD4F146BDB346E0A7FA644A3F6EE994">
-    <w:name w:val="AAD4F146BDB346E0A7FA644A3F6EE994"/>
-    <w:rsid w:val="0077336F"/>
-    <w:pPr>
-      <w:spacing w:line="278" w:lineRule="auto"/>
-    </w:pPr>
-    <w:rPr>
-      <w:kern w:val="2"/>
-      <w:sz w:val="24"/>
-      <w:szCs w:val="24"/>
-      <w:lang w:val="en-DK" w:eastAsia="en-DK"/>
-      <w14:ligatures w14:val="standardContextual"/>
-    </w:rPr>
-  </w:style>
   <w:style w:type="paragraph" w:customStyle="1" w:styleId="9351E1828E2647B397589986DFAEE98B">
     <w:name w:val="9351E1828E2647B397589986DFAEE98B"/>
     <w:rsid w:val="0043381F"/>
@@ -3587,80 +3572,6 @@
       <w14:ligatures w14:val="standardContextual"/>
     </w:rPr>
   </w:style>
-  <w:style w:type="paragraph" w:customStyle="1" w:styleId="1FBF8F7D7F3D41FC8253C041E23D4142">
-    <w:name w:val="1FBF8F7D7F3D41FC8253C041E23D4142"/>
-    <w:rsid w:val="00FC36D2"/>
-    <w:pPr>
-      <w:spacing w:line="278" w:lineRule="auto"/>
-    </w:pPr>
-    <w:rPr>
-      <w:kern w:val="2"/>
-      <w:sz w:val="24"/>
-      <w:szCs w:val="24"/>
-      <w14:ligatures w14:val="standardContextual"/>
-    </w:rPr>
-  </w:style>
-  <w:style w:type="paragraph" w:customStyle="1" w:styleId="568E8CB4D7A94ED2BC0C28819883F940">
-    <w:name w:val="568E8CB4D7A94ED2BC0C28819883F940"/>
-    <w:rsid w:val="00FC36D2"/>
-    <w:pPr>
-      <w:spacing w:line="278" w:lineRule="auto"/>
-    </w:pPr>
-    <w:rPr>
-      <w:kern w:val="2"/>
-      <w:sz w:val="24"/>
-      <w:szCs w:val="24"/>
-      <w14:ligatures w14:val="standardContextual"/>
-    </w:rPr>
-  </w:style>
-  <w:style w:type="paragraph" w:customStyle="1" w:styleId="B75C26F232864BBA98FEA5CC3E4E6D76">
-    <w:name w:val="B75C26F232864BBA98FEA5CC3E4E6D76"/>
-    <w:pPr>
-      <w:spacing w:line="278" w:lineRule="auto"/>
-    </w:pPr>
-    <w:rPr>
-      <w:kern w:val="2"/>
-      <w:sz w:val="24"/>
-      <w:szCs w:val="24"/>
-      <w14:ligatures w14:val="standardContextual"/>
-    </w:rPr>
-  </w:style>
-  <w:style w:type="paragraph" w:customStyle="1" w:styleId="13DA3897C3BE45CB9B021CE7F34B7F97">
-    <w:name w:val="13DA3897C3BE45CB9B021CE7F34B7F97"/>
-    <w:pPr>
-      <w:spacing w:line="278" w:lineRule="auto"/>
-    </w:pPr>
-    <w:rPr>
-      <w:kern w:val="2"/>
-      <w:sz w:val="24"/>
-      <w:szCs w:val="24"/>
-      <w14:ligatures w14:val="standardContextual"/>
-    </w:rPr>
-  </w:style>
-  <w:style w:type="paragraph" w:customStyle="1" w:styleId="655CA755D3494AF08EB08276E73994B6">
-    <w:name w:val="655CA755D3494AF08EB08276E73994B6"/>
-    <w:pPr>
-      <w:spacing w:line="278" w:lineRule="auto"/>
-    </w:pPr>
-    <w:rPr>
-      <w:kern w:val="2"/>
-      <w:sz w:val="24"/>
-      <w:szCs w:val="24"/>
-      <w14:ligatures w14:val="standardContextual"/>
-    </w:rPr>
-  </w:style>
-  <w:style w:type="paragraph" w:customStyle="1" w:styleId="C6D3783FBFDB4D67BA1D50999B7F7E52">
-    <w:name w:val="C6D3783FBFDB4D67BA1D50999B7F7E52"/>
-    <w:pPr>
-      <w:spacing w:line="278" w:lineRule="auto"/>
-    </w:pPr>
-    <w:rPr>
-      <w:kern w:val="2"/>
-      <w:sz w:val="24"/>
-      <w:szCs w:val="24"/>
-      <w14:ligatures w14:val="standardContextual"/>
-    </w:rPr>
-  </w:style>
   <w:style w:type="paragraph" w:customStyle="1" w:styleId="7104214807C1491D9DA3C558DAF34463">
     <w:name w:val="7104214807C1491D9DA3C558DAF34463"/>
     <w:pPr>
@@ -3670,412 +3581,6 @@
       <w:kern w:val="2"/>
       <w:sz w:val="24"/>
       <w:szCs w:val="24"/>
-      <w14:ligatures w14:val="standardContextual"/>
-    </w:rPr>
-  </w:style>
-  <w:style w:type="paragraph" w:customStyle="1" w:styleId="5AF7091283F542418F5CF5052EE6FB5B">
-    <w:name w:val="5AF7091283F542418F5CF5052EE6FB5B"/>
-    <w:rsid w:val="0077336F"/>
-    <w:pPr>
-      <w:spacing w:line="278" w:lineRule="auto"/>
-    </w:pPr>
-    <w:rPr>
-      <w:kern w:val="2"/>
-      <w:sz w:val="24"/>
-      <w:szCs w:val="24"/>
-      <w:lang w:val="en-DK" w:eastAsia="en-DK"/>
-      <w14:ligatures w14:val="standardContextual"/>
-    </w:rPr>
-  </w:style>
-  <w:style w:type="paragraph" w:customStyle="1" w:styleId="E06C5FC169B549918C741DBC41A1E9D6">
-    <w:name w:val="E06C5FC169B549918C741DBC41A1E9D6"/>
-    <w:rsid w:val="0077336F"/>
-    <w:pPr>
-      <w:spacing w:line="278" w:lineRule="auto"/>
-    </w:pPr>
-    <w:rPr>
-      <w:kern w:val="2"/>
-      <w:sz w:val="24"/>
-      <w:szCs w:val="24"/>
-      <w:lang w:val="en-DK" w:eastAsia="en-DK"/>
-      <w14:ligatures w14:val="standardContextual"/>
-    </w:rPr>
-  </w:style>
-  <w:style w:type="paragraph" w:customStyle="1" w:styleId="20BDF5489B784C8D8BD9E59CAC9C8AF0">
-    <w:name w:val="20BDF5489B784C8D8BD9E59CAC9C8AF0"/>
-    <w:rsid w:val="0077336F"/>
-    <w:pPr>
-      <w:spacing w:line="278" w:lineRule="auto"/>
-    </w:pPr>
-    <w:rPr>
-      <w:kern w:val="2"/>
-      <w:sz w:val="24"/>
-      <w:szCs w:val="24"/>
-      <w:lang w:val="en-DK" w:eastAsia="en-DK"/>
-      <w14:ligatures w14:val="standardContextual"/>
-    </w:rPr>
-  </w:style>
-  <w:style w:type="paragraph" w:customStyle="1" w:styleId="C55B6109727B495B91F4FDC7212522E9">
-    <w:name w:val="C55B6109727B495B91F4FDC7212522E9"/>
-    <w:rsid w:val="0077336F"/>
-    <w:pPr>
-      <w:spacing w:line="278" w:lineRule="auto"/>
-    </w:pPr>
-    <w:rPr>
-      <w:kern w:val="2"/>
-      <w:sz w:val="24"/>
-      <w:szCs w:val="24"/>
-      <w:lang w:val="en-DK" w:eastAsia="en-DK"/>
-      <w14:ligatures w14:val="standardContextual"/>
-    </w:rPr>
-  </w:style>
-  <w:style w:type="paragraph" w:customStyle="1" w:styleId="9FF5B0761D83451DBBCCF710971801C0">
-    <w:name w:val="9FF5B0761D83451DBBCCF710971801C0"/>
-    <w:rsid w:val="0077336F"/>
-    <w:pPr>
-      <w:spacing w:line="278" w:lineRule="auto"/>
-    </w:pPr>
-    <w:rPr>
-      <w:kern w:val="2"/>
-      <w:sz w:val="24"/>
-      <w:szCs w:val="24"/>
-      <w:lang w:val="en-DK" w:eastAsia="en-DK"/>
-      <w14:ligatures w14:val="standardContextual"/>
-    </w:rPr>
-  </w:style>
-  <w:style w:type="paragraph" w:customStyle="1" w:styleId="D33D3E4946364C60A3E207B15835BD1C">
-    <w:name w:val="D33D3E4946364C60A3E207B15835BD1C"/>
-    <w:rsid w:val="0077336F"/>
-    <w:pPr>
-      <w:spacing w:line="278" w:lineRule="auto"/>
-    </w:pPr>
-    <w:rPr>
-      <w:kern w:val="2"/>
-      <w:sz w:val="24"/>
-      <w:szCs w:val="24"/>
-      <w:lang w:val="en-DK" w:eastAsia="en-DK"/>
-      <w14:ligatures w14:val="standardContextual"/>
-    </w:rPr>
-  </w:style>
-  <w:style w:type="paragraph" w:customStyle="1" w:styleId="8E0B3C5223F0421189A8DD97FF475A04">
-    <w:name w:val="8E0B3C5223F0421189A8DD97FF475A04"/>
-    <w:rsid w:val="0077336F"/>
-    <w:pPr>
-      <w:spacing w:line="278" w:lineRule="auto"/>
-    </w:pPr>
-    <w:rPr>
-      <w:kern w:val="2"/>
-      <w:sz w:val="24"/>
-      <w:szCs w:val="24"/>
-      <w:lang w:val="en-DK" w:eastAsia="en-DK"/>
-      <w14:ligatures w14:val="standardContextual"/>
-    </w:rPr>
-  </w:style>
-  <w:style w:type="paragraph" w:customStyle="1" w:styleId="F8682CB70DA04AB0BF4B05F1F60ACD38">
-    <w:name w:val="F8682CB70DA04AB0BF4B05F1F60ACD38"/>
-    <w:rsid w:val="0077336F"/>
-    <w:pPr>
-      <w:spacing w:line="278" w:lineRule="auto"/>
-    </w:pPr>
-    <w:rPr>
-      <w:kern w:val="2"/>
-      <w:sz w:val="24"/>
-      <w:szCs w:val="24"/>
-      <w:lang w:val="en-DK" w:eastAsia="en-DK"/>
-      <w14:ligatures w14:val="standardContextual"/>
-    </w:rPr>
-  </w:style>
-  <w:style w:type="paragraph" w:customStyle="1" w:styleId="FEC4971E941247BAA181D8D9CAEA03BE">
-    <w:name w:val="FEC4971E941247BAA181D8D9CAEA03BE"/>
-    <w:rsid w:val="0077336F"/>
-    <w:pPr>
-      <w:spacing w:line="278" w:lineRule="auto"/>
-    </w:pPr>
-    <w:rPr>
-      <w:kern w:val="2"/>
-      <w:sz w:val="24"/>
-      <w:szCs w:val="24"/>
-      <w:lang w:val="en-DK" w:eastAsia="en-DK"/>
-      <w14:ligatures w14:val="standardContextual"/>
-    </w:rPr>
-  </w:style>
-  <w:style w:type="paragraph" w:customStyle="1" w:styleId="176776BF8B9A48BDB03E446D1AF9F24B">
-    <w:name w:val="176776BF8B9A48BDB03E446D1AF9F24B"/>
-    <w:rsid w:val="0077336F"/>
-    <w:pPr>
-      <w:spacing w:line="278" w:lineRule="auto"/>
-    </w:pPr>
-    <w:rPr>
-      <w:kern w:val="2"/>
-      <w:sz w:val="24"/>
-      <w:szCs w:val="24"/>
-      <w:lang w:val="en-DK" w:eastAsia="en-DK"/>
-      <w14:ligatures w14:val="standardContextual"/>
-    </w:rPr>
-  </w:style>
-  <w:style w:type="paragraph" w:customStyle="1" w:styleId="22DD7701450C4B708BA9F4E6DFF7CD52">
-    <w:name w:val="22DD7701450C4B708BA9F4E6DFF7CD52"/>
-    <w:rsid w:val="0077336F"/>
-    <w:pPr>
-      <w:spacing w:line="278" w:lineRule="auto"/>
-    </w:pPr>
-    <w:rPr>
-      <w:kern w:val="2"/>
-      <w:sz w:val="24"/>
-      <w:szCs w:val="24"/>
-      <w:lang w:val="en-DK" w:eastAsia="en-DK"/>
-      <w14:ligatures w14:val="standardContextual"/>
-    </w:rPr>
-  </w:style>
-  <w:style w:type="paragraph" w:customStyle="1" w:styleId="23E007ACFAD54EA083D8C1C9562345F0">
-    <w:name w:val="23E007ACFAD54EA083D8C1C9562345F0"/>
-    <w:rsid w:val="0077336F"/>
-    <w:pPr>
-      <w:spacing w:line="278" w:lineRule="auto"/>
-    </w:pPr>
-    <w:rPr>
-      <w:kern w:val="2"/>
-      <w:sz w:val="24"/>
-      <w:szCs w:val="24"/>
-      <w:lang w:val="en-DK" w:eastAsia="en-DK"/>
-      <w14:ligatures w14:val="standardContextual"/>
-    </w:rPr>
-  </w:style>
-  <w:style w:type="paragraph" w:customStyle="1" w:styleId="9BCB18BAC2214C9EB90DF45A13194094">
-    <w:name w:val="9BCB18BAC2214C9EB90DF45A13194094"/>
-    <w:rsid w:val="0077336F"/>
-    <w:pPr>
-      <w:spacing w:line="278" w:lineRule="auto"/>
-    </w:pPr>
-    <w:rPr>
-      <w:kern w:val="2"/>
-      <w:sz w:val="24"/>
-      <w:szCs w:val="24"/>
-      <w:lang w:val="en-DK" w:eastAsia="en-DK"/>
-      <w14:ligatures w14:val="standardContextual"/>
-    </w:rPr>
-  </w:style>
-  <w:style w:type="paragraph" w:customStyle="1" w:styleId="84ABE84115DB418AAD7C26303179340B">
-    <w:name w:val="84ABE84115DB418AAD7C26303179340B"/>
-    <w:rsid w:val="0077336F"/>
-    <w:pPr>
-      <w:spacing w:line="278" w:lineRule="auto"/>
-    </w:pPr>
-    <w:rPr>
-      <w:kern w:val="2"/>
-      <w:sz w:val="24"/>
-      <w:szCs w:val="24"/>
-      <w:lang w:val="en-DK" w:eastAsia="en-DK"/>
-      <w14:ligatures w14:val="standardContextual"/>
-    </w:rPr>
-  </w:style>
-  <w:style w:type="paragraph" w:customStyle="1" w:styleId="E9E9021162B8413DBC9989479AE8E38B">
-    <w:name w:val="E9E9021162B8413DBC9989479AE8E38B"/>
-    <w:rsid w:val="0077336F"/>
-    <w:pPr>
-      <w:spacing w:line="278" w:lineRule="auto"/>
-    </w:pPr>
-    <w:rPr>
-      <w:kern w:val="2"/>
-      <w:sz w:val="24"/>
-      <w:szCs w:val="24"/>
-      <w:lang w:val="en-DK" w:eastAsia="en-DK"/>
-      <w14:ligatures w14:val="standardContextual"/>
-    </w:rPr>
-  </w:style>
-  <w:style w:type="paragraph" w:customStyle="1" w:styleId="3EC2F97A61AD4CAD9C59E9930B3E09B3">
-    <w:name w:val="3EC2F97A61AD4CAD9C59E9930B3E09B3"/>
-    <w:rsid w:val="0077336F"/>
-    <w:pPr>
-      <w:spacing w:line="278" w:lineRule="auto"/>
-    </w:pPr>
-    <w:rPr>
-      <w:kern w:val="2"/>
-      <w:sz w:val="24"/>
-      <w:szCs w:val="24"/>
-      <w:lang w:val="en-DK" w:eastAsia="en-DK"/>
-      <w14:ligatures w14:val="standardContextual"/>
-    </w:rPr>
-  </w:style>
-  <w:style w:type="paragraph" w:customStyle="1" w:styleId="2814F20814CC4C1BB5CA35B237CD5966">
-    <w:name w:val="2814F20814CC4C1BB5CA35B237CD5966"/>
-    <w:rsid w:val="0077336F"/>
-    <w:pPr>
-      <w:spacing w:line="278" w:lineRule="auto"/>
-    </w:pPr>
-    <w:rPr>
-      <w:kern w:val="2"/>
-      <w:sz w:val="24"/>
-      <w:szCs w:val="24"/>
-      <w:lang w:val="en-DK" w:eastAsia="en-DK"/>
-      <w14:ligatures w14:val="standardContextual"/>
-    </w:rPr>
-  </w:style>
-  <w:style w:type="paragraph" w:customStyle="1" w:styleId="689FC5CF058540BBBF43DB1FE25E190C">
-    <w:name w:val="689FC5CF058540BBBF43DB1FE25E190C"/>
-    <w:rsid w:val="0077336F"/>
-    <w:pPr>
-      <w:spacing w:line="278" w:lineRule="auto"/>
-    </w:pPr>
-    <w:rPr>
-      <w:kern w:val="2"/>
-      <w:sz w:val="24"/>
-      <w:szCs w:val="24"/>
-      <w:lang w:val="en-DK" w:eastAsia="en-DK"/>
-      <w14:ligatures w14:val="standardContextual"/>
-    </w:rPr>
-  </w:style>
-  <w:style w:type="paragraph" w:customStyle="1" w:styleId="534A07E9203B426D870F16457291027E">
-    <w:name w:val="534A07E9203B426D870F16457291027E"/>
-    <w:rsid w:val="0077336F"/>
-    <w:pPr>
-      <w:spacing w:line="278" w:lineRule="auto"/>
-    </w:pPr>
-    <w:rPr>
-      <w:kern w:val="2"/>
-      <w:sz w:val="24"/>
-      <w:szCs w:val="24"/>
-      <w:lang w:val="en-DK" w:eastAsia="en-DK"/>
-      <w14:ligatures w14:val="standardContextual"/>
-    </w:rPr>
-  </w:style>
-  <w:style w:type="paragraph" w:customStyle="1" w:styleId="8A09728821A8487791FF18B233F52668">
-    <w:name w:val="8A09728821A8487791FF18B233F52668"/>
-    <w:rsid w:val="0077336F"/>
-    <w:pPr>
-      <w:spacing w:line="278" w:lineRule="auto"/>
-    </w:pPr>
-    <w:rPr>
-      <w:kern w:val="2"/>
-      <w:sz w:val="24"/>
-      <w:szCs w:val="24"/>
-      <w:lang w:val="en-DK" w:eastAsia="en-DK"/>
-      <w14:ligatures w14:val="standardContextual"/>
-    </w:rPr>
-  </w:style>
-  <w:style w:type="paragraph" w:customStyle="1" w:styleId="EB4401229BFF40B9AA62A1016B122D77">
-    <w:name w:val="EB4401229BFF40B9AA62A1016B122D77"/>
-    <w:rsid w:val="0077336F"/>
-    <w:pPr>
-      <w:spacing w:line="278" w:lineRule="auto"/>
-    </w:pPr>
-    <w:rPr>
-      <w:kern w:val="2"/>
-      <w:sz w:val="24"/>
-      <w:szCs w:val="24"/>
-      <w:lang w:val="en-DK" w:eastAsia="en-DK"/>
-      <w14:ligatures w14:val="standardContextual"/>
-    </w:rPr>
-  </w:style>
-  <w:style w:type="paragraph" w:customStyle="1" w:styleId="0A107FA365044CC4B088D8734CD8D532">
-    <w:name w:val="0A107FA365044CC4B088D8734CD8D532"/>
-    <w:rsid w:val="0077336F"/>
-    <w:pPr>
-      <w:spacing w:line="278" w:lineRule="auto"/>
-    </w:pPr>
-    <w:rPr>
-      <w:kern w:val="2"/>
-      <w:sz w:val="24"/>
-      <w:szCs w:val="24"/>
-      <w:lang w:val="en-DK" w:eastAsia="en-DK"/>
-      <w14:ligatures w14:val="standardContextual"/>
-    </w:rPr>
-  </w:style>
-  <w:style w:type="paragraph" w:customStyle="1" w:styleId="0DE5DDD376CC4168A14F403FA689982E">
-    <w:name w:val="0DE5DDD376CC4168A14F403FA689982E"/>
-    <w:rsid w:val="0077336F"/>
-    <w:pPr>
-      <w:spacing w:line="278" w:lineRule="auto"/>
-    </w:pPr>
-    <w:rPr>
-      <w:kern w:val="2"/>
-      <w:sz w:val="24"/>
-      <w:szCs w:val="24"/>
-      <w:lang w:val="en-DK" w:eastAsia="en-DK"/>
-      <w14:ligatures w14:val="standardContextual"/>
-    </w:rPr>
-  </w:style>
-  <w:style w:type="paragraph" w:customStyle="1" w:styleId="E3676ABDAAB94245881DE2F4A39CCBE6">
-    <w:name w:val="E3676ABDAAB94245881DE2F4A39CCBE6"/>
-    <w:rsid w:val="0077336F"/>
-    <w:pPr>
-      <w:spacing w:line="278" w:lineRule="auto"/>
-    </w:pPr>
-    <w:rPr>
-      <w:kern w:val="2"/>
-      <w:sz w:val="24"/>
-      <w:szCs w:val="24"/>
-      <w:lang w:val="en-DK" w:eastAsia="en-DK"/>
-      <w14:ligatures w14:val="standardContextual"/>
-    </w:rPr>
-  </w:style>
-  <w:style w:type="paragraph" w:customStyle="1" w:styleId="6ABCE90085D24C1B987024F2F94EEBDD">
-    <w:name w:val="6ABCE90085D24C1B987024F2F94EEBDD"/>
-    <w:rsid w:val="0077336F"/>
-    <w:pPr>
-      <w:spacing w:line="278" w:lineRule="auto"/>
-    </w:pPr>
-    <w:rPr>
-      <w:kern w:val="2"/>
-      <w:sz w:val="24"/>
-      <w:szCs w:val="24"/>
-      <w:lang w:val="en-DK" w:eastAsia="en-DK"/>
-      <w14:ligatures w14:val="standardContextual"/>
-    </w:rPr>
-  </w:style>
-  <w:style w:type="paragraph" w:customStyle="1" w:styleId="B092B6DD8D7F4C83A5E5425C5046F24A">
-    <w:name w:val="B092B6DD8D7F4C83A5E5425C5046F24A"/>
-    <w:rsid w:val="0077336F"/>
-    <w:pPr>
-      <w:spacing w:line="278" w:lineRule="auto"/>
-    </w:pPr>
-    <w:rPr>
-      <w:kern w:val="2"/>
-      <w:sz w:val="24"/>
-      <w:szCs w:val="24"/>
-      <w:lang w:val="en-DK" w:eastAsia="en-DK"/>
-      <w14:ligatures w14:val="standardContextual"/>
-    </w:rPr>
-  </w:style>
-  <w:style w:type="paragraph" w:customStyle="1" w:styleId="E1DC368792CE49CA80D257FD6C2D281A">
-    <w:name w:val="E1DC368792CE49CA80D257FD6C2D281A"/>
-    <w:rsid w:val="0077336F"/>
-    <w:pPr>
-      <w:spacing w:line="278" w:lineRule="auto"/>
-    </w:pPr>
-    <w:rPr>
-      <w:kern w:val="2"/>
-      <w:sz w:val="24"/>
-      <w:szCs w:val="24"/>
-      <w:lang w:val="en-DK" w:eastAsia="en-DK"/>
-      <w14:ligatures w14:val="standardContextual"/>
-    </w:rPr>
-  </w:style>
-  <w:style w:type="paragraph" w:customStyle="1" w:styleId="EE3469F1AB4B45C498E4D00456C4C26A">
-    <w:name w:val="EE3469F1AB4B45C498E4D00456C4C26A"/>
-    <w:rsid w:val="0077336F"/>
-    <w:pPr>
-      <w:spacing w:line="278" w:lineRule="auto"/>
-    </w:pPr>
-    <w:rPr>
-      <w:kern w:val="2"/>
-      <w:sz w:val="24"/>
-      <w:szCs w:val="24"/>
-      <w:lang w:val="en-DK" w:eastAsia="en-DK"/>
-      <w14:ligatures w14:val="standardContextual"/>
-    </w:rPr>
-  </w:style>
-  <w:style w:type="paragraph" w:customStyle="1" w:styleId="3F66238DBBE64DB38DB8B33397D49B76">
-    <w:name w:val="3F66238DBBE64DB38DB8B33397D49B76"/>
-    <w:rsid w:val="0077336F"/>
-    <w:pPr>
-      <w:spacing w:line="278" w:lineRule="auto"/>
-    </w:pPr>
-    <w:rPr>
-      <w:kern w:val="2"/>
-      <w:sz w:val="24"/>
-      <w:szCs w:val="24"/>
-      <w:lang w:val="en-DK" w:eastAsia="en-DK"/>
       <w14:ligatures w14:val="standardContextual"/>
     </w:rPr>
   </w:style>
@@ -4089,7 +3594,6 @@
       <w:kern w:val="2"/>
       <w:sz w:val="24"/>
       <w:szCs w:val="24"/>
-      <w:lang w:val="en-DK" w:eastAsia="en-DK"/>
       <w14:ligatures w14:val="standardContextual"/>
     </w:rPr>
   </w:style>
@@ -4103,7 +3607,6 @@
       <w:kern w:val="2"/>
       <w:sz w:val="24"/>
       <w:szCs w:val="24"/>
-      <w:lang w:val="en-DK" w:eastAsia="en-DK"/>
       <w14:ligatures w14:val="standardContextual"/>
     </w:rPr>
   </w:style>
@@ -4117,7 +3620,6 @@
       <w:kern w:val="2"/>
       <w:sz w:val="24"/>
       <w:szCs w:val="24"/>
-      <w:lang w:val="en-DK" w:eastAsia="en-DK"/>
       <w14:ligatures w14:val="standardContextual"/>
     </w:rPr>
   </w:style>
@@ -4131,7 +3633,6 @@
       <w:kern w:val="2"/>
       <w:sz w:val="24"/>
       <w:szCs w:val="24"/>
-      <w:lang w:val="en-DK" w:eastAsia="en-DK"/>
       <w14:ligatures w14:val="standardContextual"/>
     </w:rPr>
   </w:style>
@@ -4145,7 +3646,6 @@
       <w:kern w:val="2"/>
       <w:sz w:val="24"/>
       <w:szCs w:val="24"/>
-      <w:lang w:val="en-DK" w:eastAsia="en-DK"/>
       <w14:ligatures w14:val="standardContextual"/>
     </w:rPr>
   </w:style>
@@ -4159,7 +3659,6 @@
       <w:kern w:val="2"/>
       <w:sz w:val="24"/>
       <w:szCs w:val="24"/>
-      <w:lang w:val="en-DK" w:eastAsia="en-DK"/>
       <w14:ligatures w14:val="standardContextual"/>
     </w:rPr>
   </w:style>
@@ -4455,35 +3954,6 @@
 </file>
 
 <file path=customXml/item1.xml><?xml version="1.0" encoding="utf-8"?>
-<?mso-contentType ?>
-<FormTemplates xmlns="http://schemas.microsoft.com/sharepoint/v3/contenttype/forms">
-  <Display>DocumentLibraryForm</Display>
-  <Edit>DocumentLibraryForm</Edit>
-  <New>DocumentLibraryForm</New>
-</FormTemplates>
-</file>
-
-<file path=customXml/item2.xml><?xml version="1.0" encoding="utf-8"?>
-<b:Sources xmlns:b="http://schemas.openxmlformats.org/officeDocument/2006/bibliography" xmlns="http://schemas.openxmlformats.org/officeDocument/2006/bibliography" SelectedStyle="\APASixthEditionOfficeOnline.xsl" StyleName="APA" Version="6"/>
-</file>
-
-<file path=customXml/item5.xml><?xml version="1.0" encoding="utf-8"?>
-<p:properties xmlns:p="http://schemas.microsoft.com/office/2006/metadata/properties" xmlns:xsi="http://www.w3.org/2001/XMLSchema-instance" xmlns:pc="http://schemas.microsoft.com/office/infopath/2007/PartnerControls">
-  <documentManagement>
-    <Package xmlns="178f68d8-b893-4efd-8406-fab0f21873e4" xsi:nil="true"/>
-    <lcf76f155ced4ddcb4097134ff3c332f xmlns="178f68d8-b893-4efd-8406-fab0f21873e4">
-      <Terms xmlns="http://schemas.microsoft.com/office/infopath/2007/PartnerControls"/>
-    </lcf76f155ced4ddcb4097134ff3c332f>
-    <_ip_UnifiedCompliancePolicyUIAction xmlns="http://schemas.microsoft.com/sharepoint/v3" xsi:nil="true"/>
-    <TaxCatchAll xmlns="b83e059f-de16-406c-a902-3d56d4e79ec8" xsi:nil="true"/>
-    <Audience xmlns="178f68d8-b893-4efd-8406-fab0f21873e4" xsi:nil="true"/>
-    <_ip_UnifiedCompliancePolicyProperties xmlns="http://schemas.microsoft.com/sharepoint/v3" xsi:nil="true"/>
-    <DocumentType xmlns="178f68d8-b893-4efd-8406-fab0f21873e4" xsi:nil="true"/>
-  </documentManagement>
-</p:properties>
-</file>
-
-<file path=customXml/item6.xml><?xml version="1.0" encoding="utf-8"?>
 <ct:contentTypeSchema xmlns:ct="http://schemas.microsoft.com/office/2006/metadata/contentType" xmlns:ma="http://schemas.microsoft.com/office/2006/metadata/properties/metaAttributes" ct:_="" ma:_="" ma:contentTypeName="Document" ma:contentTypeID="0x0101001DCAE6B6EBFA5442B0B9E84E60AFF245" ma:contentTypeVersion="18" ma:contentTypeDescription="Create a new document." ma:contentTypeScope="" ma:versionID="69eec3b24558e1297a79cd42e69b0397">
   <xsd:schema xmlns:xsd="http://www.w3.org/2001/XMLSchema" xmlns:xs="http://www.w3.org/2001/XMLSchema" xmlns:p="http://schemas.microsoft.com/office/2006/metadata/properties" xmlns:ns1="http://schemas.microsoft.com/sharepoint/v3" xmlns:ns2="178f68d8-b893-4efd-8406-fab0f21873e4" xmlns:ns3="b83e059f-de16-406c-a902-3d56d4e79ec8" targetNamespace="http://schemas.microsoft.com/office/2006/metadata/properties" ma:root="true" ma:fieldsID="0f52a3acd42ec0bd0d267ba89c916a39" ns1:_="" ns2:_="" ns3:_="">
     <xsd:import namespace="http://schemas.microsoft.com/sharepoint/v3"/>
@@ -4749,9 +4219,20 @@
 </ct:contentTypeSchema>
 </file>
 
-<file path=customXml/item7.xml>��< ? x m l   v e r s i o n = " 1 . 0 "   e n c o d i n g = " u t f - 1 6 " ? > - 
- < N a v W o r d R e p o r t X m l P a r t   x m l n s = " u r n : m i c r o s o f t - d y n a m i c s - n a v / r e p o r t s / C o m p o s i t e _ L a y o u t _ D e s i g n s / 1 1 7 5 / " > +<file path=customXml/item2.xml><?xml version="1.0" encoding="utf-8"?>
+<?mso-contentType ?>
+<FormTemplates xmlns="http://schemas.microsoft.com/sharepoint/v3/contenttype/forms">
+  <Display>DocumentLibraryForm</Display>
+  <Edit>DocumentLibraryForm</Edit>
+  <New>DocumentLibraryForm</New>
+</FormTemplates>
+</file>
+
+<file path=customXml/item3.xml><?xml version="1.0" encoding="utf-8"?>
+<b:Sources xmlns:b="http://schemas.openxmlformats.org/officeDocument/2006/bibliography" xmlns="http://schemas.openxmlformats.org/officeDocument/2006/bibliography" SelectedStyle="\APASixthEditionOfficeOnline.xsl" StyleName="APA" Version="6"/>
+</file>
+
+<file path=customXml/item4.xml>��< ? x m l   v e r s i o n = " 1 . 0 "   e n c o d i n g = " u t f - 1 6 " ? > < N a v W o r d R e p o r t X m l P a r t   x m l n s = " u r n : m i c r o s o f t - d y n a m i c s - b u s i n e s s c e n t r a l / i n t e r n a l / e x t e n d e d / r e p o r t s / S t a n d a r d _ S a l e s _ I n v o i c e / 1 3 0 6 / " >   
      < B C R e p o r t I n f o r m a t i o n >   
@@ -4769,8 +4250,6 @@
  
              < R e p o r t N a m e > R e p o r t   N a m e < / R e p o r t N a m e >   
-             < R e p o r t C a p t i o n > R e p o r t   C a p t i o n < / R e p o r t C a p t i o n > - 
              < A b o u t T h i s R e p o r t T i t l e > A b o u t   T h i s   R e p o r t   T i t l e < / A b o u t T h i s R e p o r t T i t l e >   
              < A b o u t T h i s R e p o r t T e x t > A b o u t   T h i s   R e p o r t   T e x t < / A b o u t T h i s R e p o r t T e x t > @@ -4817,92 +4296,686 @@
  
          < / R e p o r t R e q u e s t >   
-         < C o m p a n y M e t a d a t a > - 
-             < C o m p a n y N a m e > C o m p a n y   N a m e < / C o m p a n y N a m e > - 
-             < C o m p a n y D i s p l a y N a m e > C o m p a n y   D i s p l a y   N a m e < / C o m p a n y D i s p l a y N a m e > - 
-             < C o m p a n y A d d r e s s L i n e s > - 
-                 < C o m p a n y A d d r e s s L i n e 1 > C o m p a n y   A d d r e s s   L i n e   1 < / C o m p a n y A d d r e s s L i n e 1 > - 
-                 < C o m p a n y A d d r e s s L i n e 2 > C o m p a n y   A d d r e s s   L i n e   2 < / C o m p a n y A d d r e s s L i n e 2 > - 
-                 < C o m p a n y A d d r e s s L i n e 3 > C o m p a n y   A d d r e s s   L i n e   3 < / C o m p a n y A d d r e s s L i n e 3 > - 
-                 < C o m p a n y A d d r e s s L i n e 4 > C o m p a n y   A d d r e s s   L i n e   4 < / C o m p a n y A d d r e s s L i n e 4 > - 
-                 < C o m p a n y A d d r e s s L i n e 5 > C o m p a n y   A d d r e s s   L i n e   5 < / C o m p a n y A d d r e s s L i n e 5 > - 
-                 < C o m p a n y A d d r e s s L i n e 6 > C o m p a n y   A d d r e s s   L i n e   6 < / C o m p a n y A d d r e s s L i n e 6 > - 
-                 < C o m p a n y A d d r e s s L i n e 7 > C o m p a n y   A d d r e s s   L i n e   7 < / C o m p a n y A d d r e s s L i n e 7 > - 
-                 < C o m p a n y A d d r e s s L i n e 8 > C o m p a n y   A d d r e s s   L i n e   8 < / C o m p a n y A d d r e s s L i n e 8 > - 
-             < / C o m p a n y A d d r e s s L i n e s > - 
-             < C o m p a n y P h o n e > C o m p a n y   P h o n e < / C o m p a n y P h o n e > - 
-             < C o m p a n y P h o n e C a p t i o n > C o m p a n y   P h o n e   C a p t i o n < / C o m p a n y P h o n e C a p t i o n > - 
-             < C o m p a n y F a x N o > C o m p a n y   F a x   N o . < / C o m p a n y F a x N o > - 
-             < C o m p a n y F a x N o C a p t i o n > C o m p a n y   F a x   N o .   C a p t i o n < / C o m p a n y F a x N o C a p t i o n > - 
-             < C o m p a n y E m a i l > C o m p a n y   E m a i l < / C o m p a n y E m a i l > - 
-             < C o m p a n y E m a i l C a p t i o n > C o m p a n y   E m a i l   C a p t i o n < / C o m p a n y E m a i l C a p t i o n > - 
-             < C o m p a n y H o m e P a g e > C o m p a n y   H o m e   P a g e < / C o m p a n y H o m e P a g e > - 
-             < C o m p a n y H o m e P a g e C a p t i o n > C o m p a n y   H o m e   P a g e   C a p t i o n < / C o m p a n y H o m e P a g e C a p t i o n > - 
-             < C o m p a n y L o g o > C o m p a n y   L o g o < / C o m p a n y L o g o > - 
-             < C o m p a n y V A T R e g i s t r a t i o n N o > C o m p a n y   V A T   R e g i s t r a t i o n   N o . < / C o m p a n y V A T R e g i s t r a t i o n N o > - 
-             < C o m p a n y V A T R e g i s t r a t i o n N o C a p t i o n > C o m p a n y   V A T   R e g i s t r a t i o n   N o .   C a p t i o n < / C o m p a n y V A T R e g i s t r a t i o n N o C a p t i o n > - 
-             < C o m p a n y R e g i s t r a t i o n N o > C o m p a n y   R e g i s t r a t i o n   N o . < / C o m p a n y R e g i s t r a t i o n N o > - 
-             < C o m p a n y R e g i s t r a t i o n N o C a p t i o n > C o m p a n y   R e g i s t r a t i o n   N o .   C a p t i o n < / C o m p a n y R e g i s t r a t i o n N o C a p t i o n > - 
-             < C o m p a n y B a n k N a m e > C o m p a n y   B a n k   N a m e < / C o m p a n y B a n k N a m e > - 
-             < C o m p a n y B a n k N a m e C a p t i o n > C o m p a n y   B a n k   N a m e   C a p t i o n < / C o m p a n y B a n k N a m e C a p t i o n > - 
-             < C o m p a n y B a n k A c c o u n t N o > C o m p a n y   B a n k   A c c o u n t   N o . < / C o m p a n y B a n k A c c o u n t N o > - 
-             < C o m p a n y B a n k A c c o u n t N o C a p t i o n > C o m p a n y   B a n k   A c c o u n t   N o .   C a p t i o n < / C o m p a n y B a n k A c c o u n t N o C a p t i o n > - 
-             < C o m p a n y B a n k B r a n c h N o > C o m p a n y   B a n k   B r a n c h   N o . < / C o m p a n y B a n k B r a n c h N o > - 
-             < C o m p a n y B a n k B r a n c h N o C a p t i o n > C o m p a n y   B a n k   B r a n c h   N o .   C a p t i o n < / C o m p a n y B a n k B r a n c h N o C a p t i o n > - 
-             < C o m p a n y I B A N > C o m p a n y   I B A N < / C o m p a n y I B A N > - 
-             < C o m p a n y I B A N C a p t i o n > C o m p a n y   I B A N   C a p t i o n < / C o m p a n y I B A N C a p t i o n > - 
-             < C o m p a n y B a n k S W I F T > C o m p a n y   B a n k   S W I F T < / C o m p a n y B a n k S W I F T > - 
-             < C o m p a n y B a n k S W I F T C a p t i o n > C o m p a n y   B a n k   S W I F T   C a p t i o n < / C o m p a n y B a n k S W I F T C a p t i o n > - 
-             < C o m p a n y G i r o N o > C o m p a n y   G i r o   N o . < / C o m p a n y G i r o N o > - 
-             < C o m p a n y G i r o N o C a p t i o n > C o m p a n y   G i r o   N o .   C a p t i o n < / C o m p a n y G i r o N o C a p t i o n > - 
-         < / C o m p a n y M e t a d a t a > - 
      < / B C R e p o r t I n f o r m a t i o n > + 
+     < T o o l t i p s / > + 
+     < H e a d e r   E l e m e n t T y p e = " D a t a I t e m "   E l e m e n t I d = " 1 2 4 0 3 7 3 8 8 6 " > + 
+         < B i l l e d T o _ L b l   E l e m e n t T y p e = " C o l u m n "   E l e m e n t I d = " 1 7 4 5 4 4 9 0 7 9 "   D a t a T y p e = " T e x t C o n s t " > B i l l e d T o _ L b l < / B i l l e d T o _ L b l > + 
+         < B i l l T o C o n t a c t E m a i l   E l e m e n t T y p e = " C o l u m n "   E l e m e n t I d = " 3 3 5 8 2 7 8 9 5 "   D a t a T y p e = " T e x t " > B i l l T o C o n t a c t E m a i l < / B i l l T o C o n t a c t E m a i l > + 
+         < B i l l T o C o n t a c t E m a i l L b l   E l e m e n t T y p e = " C o l u m n "   E l e m e n t I d = " 2 9 6 4 7 8 3 6 5 "   D a t a T y p e = " T e x t C o n s t " > B i l l T o C o n t a c t E m a i l L b l < / B i l l T o C o n t a c t E m a i l L b l > + 
+         < B i l l T o C o n t a c t M o b i l e P h o n e N o   E l e m e n t T y p e = " C o l u m n "   E l e m e n t I d = " 2 4 8 4 8 8 6 9 6 "   D a t a T y p e = " T e x t " > B i l l T o C o n t a c t M o b i l e P h o n e N o < / B i l l T o C o n t a c t M o b i l e P h o n e N o > + 
+         < B i l l T o C o n t a c t M o b i l e P h o n e N o L b l   E l e m e n t T y p e = " C o l u m n "   E l e m e n t I d = " 2 7 6 3 1 1 3 3 8 "   D a t a T y p e = " T e x t C o n s t " > B i l l T o C o n t a c t M o b i l e P h o n e N o L b l < / B i l l T o C o n t a c t M o b i l e P h o n e N o L b l > + 
+         < B i l l T o C o n t a c t P h o n e N o   E l e m e n t T y p e = " C o l u m n "   E l e m e n t I d = " 3 6 2 4 7 7 4 8 8 "   D a t a T y p e = " T e x t " > B i l l T o C o n t a c t P h o n e N o < / B i l l T o C o n t a c t P h o n e N o > + 
+         < B i l l T o C o n t a c t P h o n e N o L b l   E l e m e n t T y p e = " C o l u m n "   E l e m e n t I d = " 2 1 2 3 3 4 5 9 6 6 "   D a t a T y p e = " T e x t C o n s t " > B i l l T o C o n t a c t P h o n e N o L b l < / B i l l T o C o n t a c t P h o n e N o L b l > + 
+         < B i l l t o C u s t o m e r N o _ L b l   E l e m e n t T y p e = " C o l u m n "   E l e m e n t I d = " 3 6 9 3 0 7 8 1 3 "   D a t a T y p e = " S t r i n g " > B i l l t o C u s t o m e r N o _ L b l < / B i l l t o C u s t o m e r N o _ L b l > + 
+         < B i l l t o C u s t u m e r N o   E l e m e n t T y p e = " C o l u m n "   E l e m e n t I d = " 2 8 0 4 7 3 0 5 8 "   D a t a T y p e = " C o d e " > B i l l t o C u s t u m e r N o < / B i l l t o C u s t u m e r N o > + 
+         < C h e c k s P a y a b l e _ L b l   E l e m e n t T y p e = " C o l u m n "   E l e m e n t I d = " 1 0 5 3 1 5 6 0 6 5 "   D a t a T y p e = " T e x t " > C h e c k s P a y a b l e _ L b l < / C h e c k s P a y a b l e _ L b l > + 
+         < C O 2 e P e r U n i t _ L b l   E l e m e n t T y p e = " C o l u m n "   E l e m e n t I d = " 6 0 8 7 4 6 8 0 2 "   D a t a T y p e = " T e x t " > C O 2 e P e r U n i t _ L b l < / C O 2 e P e r U n i t _ L b l > + 
+         < C o m p a n y A d d r e s s 1   E l e m e n t T y p e = " C o l u m n "   E l e m e n t I d = " 1 8 8 4 1 6 4 3 2 3 "   D a t a T y p e = " T e x t " > C o m p a n y A d d r e s s 1 < / C o m p a n y A d d r e s s 1 > + 
+         < C o m p a n y A d d r e s s 2   E l e m e n t T y p e = " C o l u m n "   E l e m e n t I d = " 1 2 4 6 4 6 7 7 0 6 "   D a t a T y p e = " T e x t " > C o m p a n y A d d r e s s 2 < / C o m p a n y A d d r e s s 2 > + 
+         < C o m p a n y A d d r e s s 3   E l e m e n t T y p e = " C o l u m n "   E l e m e n t I d = " 6 0 8 7 7 1 0 8 9 "   D a t a T y p e = " T e x t " > C o m p a n y A d d r e s s 3 < / C o m p a n y A d d r e s s 3 > + 
+         < C o m p a n y A d d r e s s 4   E l e m e n t T y p e = " C o l u m n "   E l e m e n t I d = " 7 7 7 6 8 0 1 1 2 "   D a t a T y p e = " T e x t " > C o m p a n y A d d r e s s 4 < / C o m p a n y A d d r e s s 4 > + 
+         < C o m p a n y A d d r e s s 5   E l e m e n t T y p e = " C o l u m n "   E l e m e n t I d = " 1 3 9 9 8 3 4 9 5 "   D a t a T y p e = " T e x t " > C o m p a n y A d d r e s s 5 < / C o m p a n y A d d r e s s 5 > + 
+         < C o m p a n y A d d r e s s 6   E l e m e n t T y p e = " C o l u m n "   E l e m e n t I d = " 4 9 7 7 1 3 1 2 2 "   D a t a T y p e = " T e x t " > C o m p a n y A d d r e s s 6 < / C o m p a n y A d d r e s s 6 > + 
+         < C o m p a n y A d d r e s s 7   E l e m e n t T y p e = " C o l u m n "   E l e m e n t I d = " 1 1 3 5 4 0 9 7 3 9 "   D a t a T y p e = " T e x t " > C o m p a n y A d d r e s s 7 < / C o m p a n y A d d r e s s 7 > + 
+         < C o m p a n y A d d r e s s 8   E l e m e n t T y p e = " C o l u m n "   E l e m e n t I d = " 1 7 1 5 2 5 5 3 0 0 "   D a t a T y p e = " T e x t " > C o m p a n y A d d r e s s 8 < / C o m p a n y A d d r e s s 8 > + 
+         < C o m p a n y B a n k A c c o u n t N o   E l e m e n t T y p e = " C o l u m n "   E l e m e n t I d = " 3 0 1 4 0 2 0 4 "   D a t a T y p e = " T e x t " > C o m p a n y B a n k A c c o u n t N o < / C o m p a n y B a n k A c c o u n t N o > + 
+         < C o m p a n y B a n k A c c o u n t N o _ L b l   E l e m e n t T y p e = " C o l u m n "   E l e m e n t I d = " 1 0 9 7 7 4 3 3 4 5 "   D a t a T y p e = " T e x t C o n s t " > C o m p a n y B a n k A c c o u n t N o _ L b l < / C o m p a n y B a n k A c c o u n t N o _ L b l > + 
+         < C o m p a n y B a n k B r a n c h N o   E l e m e n t T y p e = " C o l u m n "   E l e m e n t I d = " 7 9 3 1 3 3 0 5 7 "   D a t a T y p e = " T e x t " > C o m p a n y B a n k B r a n c h N o < / C o m p a n y B a n k B r a n c h N o > + 
+         < C o m p a n y B a n k B r a n c h N o _ L b l   E l e m e n t T y p e = " C o l u m n "   E l e m e n t I d = " 3 2 7 9 0 6 6 9 2 "   D a t a T y p e = " S t r i n g " > C o m p a n y B a n k B r a n c h N o _ L b l < / C o m p a n y B a n k B r a n c h N o _ L b l > + 
+         < C o m p a n y B a n k N a m e   E l e m e n t T y p e = " C o l u m n "   E l e m e n t I d = " 1 5 3 4 9 0 5 6 0 5 "   D a t a T y p e = " T e x t " > C o m p a n y B a n k N a m e < / C o m p a n y B a n k N a m e > + 
+         < C o m p a n y B a n k N a m e _ L b l   E l e m e n t T y p e = " C o l u m n "   E l e m e n t I d = " 1 2 0 4 3 0 7 0 1 4 "   D a t a T y p e = " T e x t C o n s t " > C o m p a n y B a n k N a m e _ L b l < / C o m p a n y B a n k N a m e _ L b l > + 
+         < C o m p a n y C u s t o m G i r o   E l e m e n t T y p e = " C o l u m n "   E l e m e n t I d = " 1 6 7 0 4 7 5 7 9 8 "   D a t a T y p e = " T e x t " > C o m p a n y C u s t o m G i r o < / C o m p a n y C u s t o m G i r o > + 
+         < C o m p a n y C u s t o m G i r o _ L b l   E l e m e n t T y p e = " C o l u m n "   E l e m e n t I d = " 8 9 1 4 3 9 6 2 5 "   D a t a T y p e = " T e x t " > C o m p a n y C u s t o m G i r o _ L b l < / C o m p a n y C u s t o m G i r o _ L b l > + 
+         < C o m p a n y E M a i l   E l e m e n t T y p e = " C o l u m n "   E l e m e n t I d = " 1 6 7 7 0 7 4 0 5 8 "   D a t a T y p e = " T e x t " > C o m p a n y E M a i l < / C o m p a n y E M a i l > + 
+         < C o m p a n y G i r o N o   E l e m e n t T y p e = " C o l u m n "   E l e m e n t I d = " 1 3 6 0 1 9 6 3 2 0 "   D a t a T y p e = " T e x t " > C o m p a n y G i r o N o < / C o m p a n y G i r o N o > + 
+         < C o m p a n y G i r o N o _ L b l   E l e m e n t T y p e = " C o l u m n "   E l e m e n t I d = " 8 6 1 6 0 2 1 1 5 "   D a t a T y p e = " T e x t C o n s t " > C o m p a n y G i r o N o _ L b l < / C o m p a n y G i r o N o _ L b l > + 
+         < C o m p a n y H o m e P a g e   E l e m e n t T y p e = " C o l u m n "   E l e m e n t I d = " 1 9 8 9 1 8 8 7 0 "   D a t a T y p e = " T e x t " > C o m p a n y H o m e P a g e < / C o m p a n y H o m e P a g e > + 
+         < C o m p a n y I B A N   E l e m e n t T y p e = " C o l u m n "   E l e m e n t I d = " 9 0 6 5 4 9 1 8 2 "   D a t a T y p e = " C o d e " > C o m p a n y I B A N < / C o m p a n y I B A N > + 
+         < C o m p a n y I B A N _ L b l   E l e m e n t T y p e = " C o l u m n "   E l e m e n t I d = " 1 2 6 7 9 5 2 2 2 7 "   D a t a T y p e = " S t r i n g " > C o m p a n y I B A N _ L b l < / C o m p a n y I B A N _ L b l > + 
+         < C o m p a n y L e g a l O f f i c e   E l e m e n t T y p e = " C o l u m n "   E l e m e n t I d = " 7 1 4 2 5 8 1 1 1 "   D a t a T y p e = " T e x t " > C o m p a n y L e g a l O f f i c e < / C o m p a n y L e g a l O f f i c e > + 
+         < C o m p a n y L e g a l O f f i c e _ L b l   E l e m e n t T y p e = " C o l u m n "   E l e m e n t I d = " 1 5 3 3 1 7 5 1 0 8 "   D a t a T y p e = " T e x t " > C o m p a n y L e g a l O f f i c e _ L b l < / C o m p a n y L e g a l O f f i c e _ L b l > + 
+         < C o m p a n y L e g a l S t a t e m e n t   E l e m e n t T y p e = " C o l u m n "   E l e m e n t I d = " 4 4 8 3 5 8 8 7 6 "   D a t a T y p e = " T e x t " > C o m p a n y L e g a l S t a t e m e n t < / C o m p a n y L e g a l S t a t e m e n t > + 
+         < C o m p a n y L o g o P o s i t i o n   E l e m e n t T y p e = " C o l u m n "   E l e m e n t I d = " 1 4 2 5 2 6 6 6 8 8 "   D a t a T y p e = " I n t e g e r " > C o m p a n y L o g o P o s i t i o n < / C o m p a n y L o g o P o s i t i o n > + 
+         < C o m p a n y P h o n e N o   E l e m e n t T y p e = " C o l u m n "   E l e m e n t I d = " 2 5 0 4 4 0 6 5 5 "   D a t a T y p e = " T e x t " > C o m p a n y P h o n e N o < / C o m p a n y P h o n e N o > + 
+         < C o m p a n y P h o n e N o _ L b l   E l e m e n t T y p e = " C o l u m n "   E l e m e n t I d = " 5 5 8 5 9 3 5 8 6 "   D a t a T y p e = " T e x t C o n s t " > C o m p a n y P h o n e N o _ L b l < / C o m p a n y P h o n e N o _ L b l > + 
+         < C o m p a n y P i c t u r e   E l e m e n t T y p e = " C o l u m n "   E l e m e n t I d = " 1 3 9 7 4 1 1 0 7 4 "   D a t a T y p e = " B L O B " / > + 
+         < C o m p a n y R e g i s t r a t i o n N u m b e r   E l e m e n t T y p e = " C o l u m n "   E l e m e n t I d = " 2 0 2 3 6 3 9 4 2 4 "   D a t a T y p e = " T e x t " > C o m p a n y R e g i s t r a t i o n N u m b e r < / C o m p a n y R e g i s t r a t i o n N u m b e r > + 
+         < C o m p a n y R e g i s t r a t i o n N u m b e r _ L b l   E l e m e n t T y p e = " C o l u m n "   E l e m e n t I d = " 1 8 3 3 1 0 6 6 5 3 "   D a t a T y p e = " T e x t " > C o m p a n y R e g i s t r a t i o n N u m b e r _ L b l < / C o m p a n y R e g i s t r a t i o n N u m b e r _ L b l > + 
+         < C o m p a n y S W I F T   E l e m e n t T y p e = " C o l u m n "   E l e m e n t I d = " 6 6 8 2 5 0 2 4 5 "   D a t a T y p e = " C o d e " > C o m p a n y S W I F T < / C o m p a n y S W I F T > + 
+         < C o m p a n y S W I F T _ L b l   E l e m e n t T y p e = " C o l u m n "   E l e m e n t I d = " 2 0 2 9 5 9 7 3 8 4 "   D a t a T y p e = " S t r i n g " > C o m p a n y S W I F T _ L b l < / C o m p a n y S W I F T _ L b l > + 
+         < C o m p a n y V A T R e g i s t r a t i o n N o   E l e m e n t T y p e = " C o l u m n "   E l e m e n t I d = " 1 9 1 4 0 1 3 6 4 9 "   D a t a T y p e = " T e x t " > C o m p a n y V A T R e g i s t r a t i o n N o < / C o m p a n y V A T R e g i s t r a t i o n N o > + 
+         < C o m p a n y V A T R e g i s t r a t i o n N o _ L b l   E l e m e n t T y p e = " C o l u m n "   E l e m e n t I d = " 9 2 4 5 0 3 1 2 4 "   D a t a T y p e = " T e x t " > C o m p a n y V A T R e g i s t r a t i o n N o _ L b l < / C o m p a n y V A T R e g i s t r a t i o n N o _ L b l > + 
+         < C o m p a n y V A T R e g N o   E l e m e n t T y p e = " C o l u m n "   E l e m e n t I d = " 1 7 1 4 3 1 9 3 6 "   D a t a T y p e = " T e x t " > C o m p a n y V A T R e g N o < / C o m p a n y V A T R e g N o > + 
+         < C o m p a n y V A T R e g N o _ L b l   E l e m e n t T y p e = " C o l u m n "   E l e m e n t I d = " 7 7 3 2 0 1 5 0 1 "   D a t a T y p e = " T e x t " > C o m p a n y V A T R e g N o _ L b l < / C o m p a n y V A T R e g N o _ L b l > + 
+         < C o n t a c t _ L b l   E l e m e n t T y p e = " C o l u m n "   E l e m e n t I d = " 1 1 5 5 0 9 4 7 5 2 "   D a t a T y p e = " T e x t " > C o n t a c t _ L b l < / C o n t a c t _ L b l > + 
+         < C o p y _ L b l   E l e m e n t T y p e = " C o l u m n "   E l e m e n t I d = " 6 0 4 7 8 2 7 8 1 "   D a t a T y p e = " T e x t C o n s t " > C o p y _ L b l < / C o p y _ L b l > + 
+         < C u s t o m e r A d d r e s s 1   E l e m e n t T y p e = " C o l u m n "   E l e m e n t I d = " 1 8 0 1 9 6 6 4 5 4 "   D a t a T y p e = " T e x t " > C u s t o m e r A d d r e s s 1 < / C u s t o m e r A d d r e s s 1 > + 
+         < C u s t o m e r A d d r e s s 2   E l e m e n t T y p e = " C o l u m n "   E l e m e n t I d = " 1 1 6 4 2 6 9 8 3 7 "   D a t a T y p e = " T e x t " > C u s t o m e r A d d r e s s 2 < / C u s t o m e r A d d r e s s 2 > + 
+         < C u s t o m e r A d d r e s s 3   E l e m e n t T y p e = " C o l u m n "   E l e m e n t I d = " 5 2 6 5 7 3 2 2 0 "   D a t a T y p e = " T e x t " > C u s t o m e r A d d r e s s 3 < / C u s t o m e r A d d r e s s 3 > + 
+         < C u s t o m e r A d d r e s s 4   E l e m e n t T y p e = " C o l u m n "   E l e m e n t I d = " 1 1 1 1 2 3 3 9 7 "   D a t a T y p e = " T e x t " > C u s t o m e r A d d r e s s 4 < / C u s t o m e r A d d r e s s 4 > + 
+         < C u s t o m e r A d d r e s s 5   E l e m e n t T y p e = " C o l u m n "   E l e m e n t I d = " 7 4 8 8 2 0 0 1 4 "   D a t a T y p e = " T e x t " > C u s t o m e r A d d r e s s 5 < / C u s t o m e r A d d r e s s 5 > + 
+         < C u s t o m e r A d d r e s s 6   E l e m e n t T y p e = " C o l u m n "   E l e m e n t I d = " 1 3 8 6 5 1 6 6 3 1 "   D a t a T y p e = " T e x t " > C u s t o m e r A d d r e s s 6 < / C u s t o m e r A d d r e s s 6 > + 
+         < C u s t o m e r A d d r e s s 7   E l e m e n t T y p e = " C o l u m n "   E l e m e n t I d = " 2 0 2 4 2 1 3 2 4 8 "   D a t a T y p e = " T e x t " > C u s t o m e r A d d r e s s 7 < / C u s t o m e r A d d r e s s 7 > + 
+         < C u s t o m e r A d d r e s s 8   E l e m e n t T y p e = " C o l u m n "   E l e m e n t I d = " 1 0 4 8 6 9 8 5 8 5 "   D a t a T y p e = " T e x t " > C u s t o m e r A d d r e s s 8 < / C u s t o m e r A d d r e s s 8 > + 
+         < C u s t o m e r P o s t a l B a r C o d e   E l e m e n t T y p e = " C o l u m n "   E l e m e n t I d = " 3 9 8 5 8 0 6 8 8 "   D a t a T y p e = " T e x t " > C u s t o m e r P o s t a l B a r C o d e < / C u s t o m e r P o s t a l B a r C o d e > + 
+         < D i s c l a i m e r _ L b l   E l e m e n t T y p e = " C o l u m n "   E l e m e n t I d = " 3 8 1 6 6 9 2 0 5 "   D a t a T y p e = " T e x t " > D i s c l a i m e r _ L b l < / D i s c l a i m e r _ L b l > + 
+         < D i s p l a y A d d i t i o n a l F e e N o t e   E l e m e n t T y p e = " C o l u m n "   E l e m e n t I d = " 1 9 3 1 7 6 6 6 8 8 "   D a t a T y p e = " B o o l e a n " > D i s p l a y A d d i t i o n a l F e e N o t e < / D i s p l a y A d d i t i o n a l F e e N o t e > + 
+         < D o c u m e n t D a t e   E l e m e n t T y p e = " C o l u m n "   E l e m e n t I d = " 5 5 2 8 7 1 9 1 4 "   D a t a T y p e = " S t r i n g " > D o c u m e n t D a t e < / D o c u m e n t D a t e > + 
+         < D o c u m e n t D a t e _ L b l   E l e m e n t T y p e = " C o l u m n "   E l e m e n t I d = " 1 0 2 6 4 9 4 8 3 "   D a t a T y p e = " S t r i n g " > D o c u m e n t D a t e _ L b l < / D o c u m e n t D a t e _ L b l > + 
+         < D o c u m e n t N o   E l e m e n t T y p e = " C o l u m n "   E l e m e n t I d = " 9 7 0 3 5 0 5 3 9 "   D a t a T y p e = " C o d e " > D o c u m e n t N o < / D o c u m e n t N o > + 
+         < D o c u m e n t N o _ L b l   E l e m e n t T y p e = " C o l u m n "   E l e m e n t I d = " 7 8 9 7 9 5 9 7 8 "   D a t a T y p e = " T e x t C o n s t " > D o c u m e n t N o _ L b l < / D o c u m e n t N o _ L b l > + 
+         < D o c u m e n t T i t l e _ L b l   E l e m e n t T y p e = " C o l u m n "   E l e m e n t I d = " 8 5 8 4 2 3 9 2 9 "   D a t a T y p e = " T e x t " > D o c u m e n t T i t l e _ L b l < / D o c u m e n t T i t l e _ L b l > + 
+         < D u e D a t e   E l e m e n t T y p e = " C o l u m n "   E l e m e n t I d = " 7 4 5 1 7 0 2 0 3 "   D a t a T y p e = " S t r i n g " > D u e D a t e < / D u e D a t e > + 
+         < D u e D a t e _ L b l   E l e m e n t T y p e = " C o l u m n "   E l e m e n t I d = " 1 6 4 8 2 8 4 6 4 8 "   D a t a T y p e = " S t r i n g " > D u e D a t e _ L b l < / D u e D a t e _ L b l > + 
+         < E M a i l _ H e a d e r _ L b l   E l e m e n t T y p e = " C o l u m n "   E l e m e n t I d = " 5 1 3 1 7 0 8 0 4 "   D a t a T y p e = " T e x t C o n s t " > E M a i l _ H e a d e r _ L b l < / E M a i l _ H e a d e r _ L b l > + 
+         < E x c h a n g e R a t e A s T e x t   E l e m e n t T y p e = " C o l u m n "   E l e m e n t I d = " 5 9 2 9 5 5 8 4 5 "   D a t a T y p e = " T e x t " > E x c h a n g e R a t e A s T e x t < / E x c h a n g e R a t e A s T e x t > + 
+         < E x t e r n a l D o c u m e n t N o   E l e m e n t T y p e = " C o l u m n "   E l e m e n t I d = " 7 3 3 9 5 3 9 6 6 "   D a t a T y p e = " C o d e " > E x t e r n a l D o c u m e n t N o < / E x t e r n a l D o c u m e n t N o > + 
+         < E x t e r n a l D o c u m e n t N o _ L b l   E l e m e n t T y p e = " C o l u m n "   E l e m e n t I d = " 4 2 3 3 1 2 2 6 9 "   D a t a T y p e = " S t r i n g " > E x t e r n a l D o c u m e n t N o _ L b l < / E x t e r n a l D o c u m e n t N o _ L b l > + 
+         < F r o m _ L b l   E l e m e n t T y p e = " C o l u m n "   E l e m e n t I d = " 4 8 5 4 2 6 1 3 8 "   D a t a T y p e = " T e x t C o n s t " > F r o m _ L b l < / F r o m _ L b l > + 
+         < G l o b a l L o c a t i o n N u m b e r   E l e m e n t T y p e = " C o l u m n "   E l e m e n t I d = " 1 5 0 0 3 7 2 8 0 0 "   D a t a T y p e = " T e x t " > G l o b a l L o c a t i o n N u m b e r < / G l o b a l L o c a t i o n N u m b e r > + 
+         < G l o b a l L o c a t i o n N u m b e r _ L b l   E l e m e n t T y p e = " C o l u m n "   E l e m e n t I d = " 1 7 5 0 9 1 3 8 9 1 "   D a t a T y p e = " T e x t " > G l o b a l L o c a t i o n N u m b e r _ L b l < / G l o b a l L o c a t i o n N u m b e r _ L b l > + 
+         < H o m e P a g e _ H e a d e r _ L b l   E l e m e n t T y p e = " C o l u m n "   E l e m e n t I d = " 1 8 7 9 7 2 5 0 8 4 "   D a t a T y p e = " T e x t C o n s t " > H o m e P a g e _ H e a d e r _ L b l < / H o m e P a g e _ H e a d e r _ L b l > + 
+         < I n v o i c e D i s c o u n t A m o u n t _ L b l   E l e m e n t T y p e = " C o l u m n "   E l e m e n t I d = " 1 5 9 3 0 1 2 7 3 6 "   D a t a T y p e = " T e x t C o n s t " > I n v o i c e D i s c o u n t A m o u n t _ L b l < / I n v o i c e D i s c o u n t A m o u n t _ L b l > + 
+         < I n v o i c e D i s c o u n t B a s e A m o u n t _ L b l   E l e m e n t T y p e = " C o l u m n "   E l e m e n t I d = " 2 0 2 9 2 6 6 8 7 5 "   D a t a T y p e = " T e x t C o n s t " > I n v o i c e D i s c o u n t B a s e A m o u n t _ L b l < / I n v o i c e D i s c o u n t B a s e A m o u n t _ L b l > + 
+         < L e g a l E n t i t y T y p e   E l e m e n t T y p e = " C o l u m n "   E l e m e n t I d = " 2 0 5 1 8 7 3 5 6 3 "   D a t a T y p e = " T e x t " > L e g a l E n t i t y T y p e < / L e g a l E n t i t y T y p e > + 
+         < L e g a l E n t i t y T y p e _ L b l   E l e m e n t T y p e = " C o l u m n "   E l e m e n t I d = " 2 0 8 0 2 2 4 7 9 2 "   D a t a T y p e = " T e x t " > L e g a l E n t i t y T y p e _ L b l < / L e g a l E n t i t y T y p e _ L b l > + 
+         < L i n e A m o u n t A f t e r I n v o i c e D i s c o u n t _ L b l   E l e m e n t T y p e = " C o l u m n "   E l e m e n t I d = " 6 7 3 7 2 1 0 9 4 "   D a t a T y p e = " T e x t C o n s t " > L i n e A m o u n t A f t e r I n v o i c e D i s c o u n t _ L b l < / L i n e A m o u n t A f t e r I n v o i c e D i s c o u n t _ L b l > + 
+         < L o c a l C u r r e n c y _ L b l   E l e m e n t T y p e = " C o l u m n "   E l e m e n t I d = " 1 5 5 9 6 9 3 4 2 2 "   D a t a T y p e = " T e x t C o n s t " > L o c a l C u r r e n c y _ L b l < / L o c a l C u r r e n c y _ L b l > + 
+         < O r d e r N o   E l e m e n t T y p e = " C o l u m n "   E l e m e n t I d = " 1 4 6 6 4 7 3 8 8 6 "   D a t a T y p e = " C o d e " > O r d e r N o < / O r d e r N o > + 
+         < O r d e r N o _ L b l   E l e m e n t T y p e = " C o l u m n "   E l e m e n t I d = " 1 9 9 1 0 6 2 5 2 9 "   D a t a T y p e = " S t r i n g " > O r d e r N o _ L b l < / O r d e r N o _ L b l > + 
+         < P a c k a g e T r a c k i n g N o   E l e m e n t T y p e = " C o l u m n "   E l e m e n t I d = " 1 2 4 4 8 2 6 1 5 9 "   D a t a T y p e = " T e x t " > P a c k a g e T r a c k i n g N o < / P a c k a g e T r a c k i n g N o > + 
+         < P a c k a g e T r a c k i n g N o _ L b l   E l e m e n t T y p e = " C o l u m n "   E l e m e n t I d = " 2 1 9 3 5 6 7 5 6 "   D a t a T y p e = " S t r i n g " > P a c k a g e T r a c k i n g N o _ L b l < / P a c k a g e T r a c k i n g N o _ L b l > + 
+         < P a g e _ L b l   E l e m e n t T y p e = " C o l u m n "   E l e m e n t I d = " 6 8 0 6 4 8 0 9 1 "   D a t a T y p e = " T e x t C o n s t " > P a g e _ L b l < / P a g e _ L b l > + 
+         < P a y m e n t I n s t r u c t i o n s _ T x t   E l e m e n t T y p e = " C o l u m n "   E l e m e n t I d = " 1 8 7 2 0 8 8 3 "   D a t a T y p e = " T e x t " > P a y m e n t I n s t r u c t i o n s _ T x t < / P a y m e n t I n s t r u c t i o n s _ T x t > + 
+         < P a y m e n t M e t h o d D e s c r i p t i o n   E l e m e n t T y p e = " C o l u m n "   E l e m e n t I d = " 5 8 5 7 5 7 9 7 4 "   D a t a T y p e = " T e x t " > P a y m e n t M e t h o d D e s c r i p t i o n < / P a y m e n t M e t h o d D e s c r i p t i o n > + 
+         < P a y m e n t M e t h o d D e s c r i p t i o n _ L b l   E l e m e n t T y p e = " C o l u m n "   E l e m e n t I d = " 7 9 7 1 1 7 3 2 3 "   D a t a T y p e = " T e x t C o n s t " > P a y m e n t M e t h o d D e s c r i p t i o n _ L b l < / P a y m e n t M e t h o d D e s c r i p t i o n _ L b l > + 
+         < P a y m e n t R e f e r e n c e   E l e m e n t T y p e = " C o l u m n "   E l e m e n t I d = " 3 3 5 4 9 7 0 1 2 "   D a t a T y p e = " T e x t " > P a y m e n t R e f e r e n c e < / P a y m e n t R e f e r e n c e > + 
+         < P a y m e n t R e f e r e n c e _ L b l   E l e m e n t T y p e = " C o l u m n "   E l e m e n t I d = " 8 6 4 7 4 2 0 3 3 "   D a t a T y p e = " T e x t " > P a y m e n t R e f e r e n c e _ L b l < / P a y m e n t R e f e r e n c e _ L b l > + 
+         < P a y m e n t T e r m s D e s c r i p t i o n   E l e m e n t T y p e = " C o l u m n "   E l e m e n t I d = " 2 0 3 8 7 4 2 7 0 0 "   D a t a T y p e = " T e x t " > P a y m e n t T e r m s D e s c r i p t i o n < / P a y m e n t T e r m s D e s c r i p t i o n > + 
+         < P a y m e n t T e r m s D e s c r i p t i o n _ L b l   E l e m e n t T y p e = " C o l u m n "   E l e m e n t I d = " 1 8 7 4 4 9 4 3 2 1 "   D a t a T y p e = " T e x t C o n s t " > P a y m e n t T e r m s D e s c r i p t i o n _ L b l < / P a y m e n t T e r m s D e s c r i p t i o n _ L b l > + 
+         < P r i c e s I n c l u d i n g V A T   E l e m e n t T y p e = " C o l u m n "   E l e m e n t I d = " 5 1 8 8 1 7 1 6 7 "   D a t a T y p e = " B o o l e a n " > P r i c e s I n c l u d i n g V A T < / P r i c e s I n c l u d i n g V A T > + 
+         < P r i c e s I n c l u d i n g V A T _ L b l   E l e m e n t T y p e = " C o l u m n "   E l e m e n t I d = " 1 3 7 7 9 7 9 4 4 4 "   D a t a T y p e = " S t r i n g " > P r i c e s I n c l u d i n g V A T _ L b l < / P r i c e s I n c l u d i n g V A T _ L b l > + 
+         < P r i c e s I n c l u d i n g V A T Y e s N o   E l e m e n t T y p e = " C o l u m n "   E l e m e n t I d = " 1 4 1 1 1 4 7 5 9 9 "   D a t a T y p e = " S t r i n g " > P r i c e s I n c l u d i n g V A T Y e s N o < / P r i c e s I n c l u d i n g V A T Y e s N o > + 
+         < Q R _ C o d e _ I m a g e   E l e m e n t T y p e = " C o l u m n "   E l e m e n t I d = " 2 0 7 9 6 8 0 8 3 6 "   D a t a T y p e = " M e d i a S e t " > Q R _ C o d e _ I m a g e < / Q R _ C o d e _ I m a g e > + 
+         < Q R _ C o d e _ I m a g e _ L b l   E l e m e n t T y p e = " C o l u m n "   E l e m e n t I d = " 1 2 2 9 4 4 6 0 7 "   D a t a T y p e = " S t r i n g " > Q R _ C o d e _ I m a g e _ L b l < / Q R _ C o d e _ I m a g e _ L b l > + 
+         < Q u e s t i o n s _ L b l   E l e m e n t T y p e = " C o l u m n "   E l e m e n t I d = " 2 0 7 0 8 9 0 0 1 9 "   D a t a T y p e = " T e x t C o n s t " > Q u e s t i o n s _ L b l < / Q u e s t i o n s _ L b l > + 
+         < R e c u r r i n g B i l l i n g   E l e m e n t T y p e = " C o l u m n "   E l e m e n t I d = " 4 8 0 8 6 9 9 3 "   D a t a T y p e = " B o o l e a n " > R e c u r r i n g B i l l i n g < / R e c u r r i n g B i l l i n g > + 
+         < R e m a i n i n g A m o u n t   E l e m e n t T y p e = " C o l u m n "   E l e m e n t I d = " 3 5 3 2 6 4 1 3 1 "   D a t a T y p e = " D e c i m a l " > R e m a i n i n g A m o u n t < / R e m a i n i n g A m o u n t > + 
+         < R e m a i n i n g A m o u n t T e x t   E l e m e n t T y p e = " C o l u m n "   E l e m e n t I d = " 1 8 1 3 6 1 2 0 "   D a t a T y p e = " T e x t " > R e m a i n i n g A m o u n t T e x t < / R e m a i n i n g A m o u n t T e x t > + 
+         < S a l e s I n v o i c e L i n e D i s c o u n t _ L b l   E l e m e n t T y p e = " C o l u m n "   E l e m e n t I d = " 6 6 4 6 0 1 5 8 2 "   D a t a T y p e = " T e x t C o n s t " > S a l e s I n v o i c e L i n e D i s c o u n t _ L b l < / S a l e s I n v o i c e L i n e D i s c o u n t _ L b l > + 
+         < S a l e s P e r s o n _ L b l   E l e m e n t T y p e = " C o l u m n "   E l e m e n t I d = " 1 5 6 4 1 9 6 3 6 5 "   D a t a T y p e = " T e x t C o n s t " > S a l e s P e r s o n _ L b l < / S a l e s P e r s o n _ L b l > + 
+         < S a l e s P e r s o n B l a n k _ L b l   E l e m e n t T y p e = " C o l u m n "   E l e m e n t I d = " 6 5 4 6 2 4 6 0 1 "   D a t a T y p e = " T e x t " > S a l e s P e r s o n B l a n k _ L b l < / S a l e s P e r s o n B l a n k _ L b l > + 
+         < S a l e s P e r s o n N a m e   E l e m e n t T y p e = " C o l u m n "   E l e m e n t I d = " 8 7 1 4 9 2 9 8 3 "   D a t a T y p e = " T e x t " > S a l e s P e r s o n N a m e < / S a l e s P e r s o n N a m e > + 
+         < S e l l T o C o n t a c t E m a i l   E l e m e n t T y p e = " C o l u m n "   E l e m e n t I d = " 2 6 2 8 2 4 5 6 4 "   D a t a T y p e = " T e x t " > S e l l T o C o n t a c t E m a i l < / S e l l T o C o n t a c t E m a i l > + 
+         < S e l l T o C o n t a c t E m a i l L b l   E l e m e n t T y p e = " C o l u m n "   E l e m e n t I d = " 3 7 0 9 2 0 3 7 4 "   D a t a T y p e = " T e x t C o n s t " > S e l l T o C o n t a c t E m a i l L b l < / S e l l T o C o n t a c t E m a i l L b l > + 
+         < S e l l T o C o n t a c t M o b i l e P h o n e N o   E l e m e n t T y p e = " C o l u m n "   E l e m e n t I d = " 1 8 4 3 5 8 7 4 7 "   D a t a T y p e = " T e x t " > S e l l T o C o n t a c t M o b i l e P h o n e N o < / S e l l T o C o n t a c t M o b i l e P h o n e N o > + 
+         < S e l l T o C o n t a c t M o b i l e P h o n e N o L b l   E l e m e n t T y p e = " C o l u m n "   E l e m e n t I d = " 1 4 5 7 5 2 8 4 1 7 "   D a t a T y p e = " T e x t C o n s t " > S e l l T o C o n t a c t M o b i l e P h o n e N o L b l < / S e l l T o C o n t a c t M o b i l e P h o n e N o L b l > + 
+         < S e l l T o C o n t a c t P h o n e N o   E l e m e n t T y p e = " C o l u m n "   E l e m e n t I d = " 1 6 1 3 8 2 2 4 8 3 "   D a t a T y p e = " T e x t " > S e l l T o C o n t a c t P h o n e N o < / S e l l T o C o n t a c t P h o n e N o > + 
+         < S e l l T o C o n t a c t P h o n e N o L b l   E l e m e n t T y p e = " C o l u m n "   E l e m e n t I d = " 1 0 5 0 6 8 6 8 0 9 "   D a t a T y p e = " T e x t C o n s t " > S e l l T o C o n t a c t P h o n e N o L b l < / S e l l T o C o n t a c t P h o n e N o L b l > + 
+         < S e l l t o C u s t o m e r N o   E l e m e n t T y p e = " C o l u m n "   E l e m e n t I d = " 2 0 5 0 6 4 7 3 4 9 "   D a t a T y p e = " C o d e " > S e l l t o C u s t o m e r N o < / S e l l t o C u s t o m e r N o > + 
+         < S e l l t o C u s t o m e r N o _ L b l   E l e m e n t T y p e = " C o l u m n "   E l e m e n t I d = " 2 9 8 3 8 1 5 1 2 "   D a t a T y p e = " S t r i n g " > S e l l t o C u s t o m e r N o _ L b l < / S e l l t o C u s t o m e r N o _ L b l > + 
+         < S e l l T o F a x N o   E l e m e n t T y p e = " C o l u m n "   E l e m e n t I d = " 8 6 0 8 2 8 4 3 4 "   D a t a T y p e = " T e x t " > S e l l T o F a x N o < / S e l l T o F a x N o > + 
+         < S e l l T o P h o n e N o   E l e m e n t T y p e = " C o l u m n "   E l e m e n t I d = " 7 5 1 9 3 1 8 4 3 "   D a t a T y p e = " T e x t " > S e l l T o P h o n e N o < / S e l l T o P h o n e N o > + 
+         < S h i p m e n t _ L b l   E l e m e n t T y p e = " C o l u m n "   E l e m e n t I d = " 2 0 8 5 7 6 7 1 2 0 "   D a t a T y p e = " T e x t C o n s t " > S h i p m e n t _ L b l < / S h i p m e n t _ L b l > + 
+         < S h i p m e n t D a t e   E l e m e n t T y p e = " C o l u m n "   E l e m e n t I d = " 9 3 1 1 1 1 4 6 5 "   D a t a T y p e = " S t r i n g " > S h i p m e n t D a t e < / S h i p m e n t D a t e > + 
+         < S h i p m e n t D a t e _ L b l   E l e m e n t T y p e = " C o l u m n "   E l e m e n t I d = " 6 1 4 4 0 0 3 6 4 "   D a t a T y p e = " S t r i n g " > S h i p m e n t D a t e _ L b l < / S h i p m e n t D a t e _ L b l > + 
+         < S h i p m e n t M e t h o d D e s c r i p t i o n   E l e m e n t T y p e = " C o l u m n "   E l e m e n t I d = " 2 0 5 9 4 0 3 2 6 0 "   D a t a T y p e = " T e x t " > S h i p m e n t M e t h o d D e s c r i p t i o n < / S h i p m e n t M e t h o d D e s c r i p t i o n > + 
+         < S h i p m e n t M e t h o d D e s c r i p t i o n _ L b l   E l e m e n t T y p e = " C o l u m n "   E l e m e n t I d = " 1 1 7 9 9 7 8 4 6 5 "   D a t a T y p e = " T e x t C o n s t " > S h i p m e n t M e t h o d D e s c r i p t i o n _ L b l < / S h i p m e n t M e t h o d D e s c r i p t i o n _ L b l > + 
+         < S h i p p i n g A g e n t C o d e   E l e m e n t T y p e = " C o l u m n "   E l e m e n t I d = " 1 6 7 0 1 5 5 2 6 9 "   D a t a T y p e = " C o d e " > S h i p p i n g A g e n t C o d e < / S h i p p i n g A g e n t C o d e > + 
+         < S h i p p i n g A g e n t C o d e _ L b l   E l e m e n t T y p e = " C o l u m n "   E l e m e n t I d = " 1 1 5 3 2 0 1 3 4 "   D a t a T y p e = " S t r i n g " > S h i p p i n g A g e n t C o d e _ L b l < / S h i p p i n g A g e n t C o d e _ L b l > + 
+         < S h i p T o A d d r e s s _ L b l   E l e m e n t T y p e = " C o l u m n "   E l e m e n t I d = " 1 6 5 0 5 0 5 0 1 7 "   D a t a T y p e = " T e x t C o n s t " > S h i p T o A d d r e s s _ L b l < / S h i p T o A d d r e s s _ L b l > + 
+         < S h i p T o A d d r e s s 1   E l e m e n t T y p e = " C o l u m n "   E l e m e n t I d = " 1 3 5 7 6 7 2 8 6 1 "   D a t a T y p e = " T e x t " > S h i p T o A d d r e s s 1 < / S h i p T o A d d r e s s 1 > + 
+         < S h i p T o A d d r e s s 2   E l e m e n t T y p e = " C o l u m n "   E l e m e n t I d = " 1 0 2 4 2 0 4 5 8 4 "   D a t a T y p e = " T e x t " > S h i p T o A d d r e s s 2 < / S h i p T o A d d r e s s 2 > + 
+         < S h i p T o A d d r e s s 3   E l e m e n t T y p e = " C o l u m n "   E l e m e n t I d = " 1 6 6 1 9 0 1 2 0 1 "   D a t a T y p e = " T e x t " > S h i p T o A d d r e s s 3 < / S h i p T o A d d r e s s 3 > + 
+         < S h i p T o A d d r e s s 4   E l e m e n t T y p e = " C o l u m n "   E l e m e n t I d = " 5 5 5 4 1 6 9 9 0 "   D a t a T y p e = " T e x t " > S h i p T o A d d r e s s 4 < / S h i p T o A d d r e s s 4 > + 
+         < S h i p T o A d d r e s s 5   E l e m e n t T y p e = " C o l u m n "   E l e m e n t I d = " 1 1 9 3 1 1 3 6 0 7 "   D a t a T y p e = " T e x t " > S h i p T o A d d r e s s 5 < / S h i p T o A d d r e s s 5 > + 
+         < S h i p T o A d d r e s s 6   E l e m e n t T y p e = " C o l u m n "   E l e m e n t I d = " 7 1 9 9 7 6 2 4 4 "   D a t a T y p e = " T e x t " > S h i p T o A d d r e s s 6 < / S h i p T o A d d r e s s 6 > + 
+         < S h i p T o A d d r e s s 7   E l e m e n t T y p e = " C o l u m n "   E l e m e n t I d = " 8 2 2 7 9 6 2 7 "   D a t a T y p e = " T e x t " > S h i p T o A d d r e s s 7 < / S h i p T o A d d r e s s 7 > + 
+         < S h i p T o A d d r e s s 8   E l e m e n t T y p e = " C o l u m n "   E l e m e n t I d = " 1 4 9 2 9 9 2 1 7 8 "   D a t a T y p e = " T e x t " > S h i p T o A d d r e s s 8 < / S h i p T o A d d r e s s 8 > + 
+         < S h i p T o P h o n e N o   E l e m e n t T y p e = " C o l u m n "   E l e m e n t I d = " 3 6 9 7 0 2 2 5 5 "   D a t a T y p e = " T e x t " > S h i p T o P h o n e N o < / S h i p T o P h o n e N o > + 
+         < S h o w S h i p p i n g A d d r e s s   E l e m e n t T y p e = " C o l u m n "   E l e m e n t I d = " 1 1 2 0 0 7 1 2 6 6 "   D a t a T y p e = " B o o l e a n " > S h o w S h i p p i n g A d d r e s s < / S h o w S h i p p i n g A d d r e s s > + 
+         < S h o w W o r k D e s c r i p t i o n   E l e m e n t T y p e = " C o l u m n "   E l e m e n t I d = " 7 8 5 4 6 8 8 6 5 "   D a t a T y p e = " B o o l e a n " > S h o w W o r k D e s c r i p t i o n < / S h o w W o r k D e s c r i p t i o n > + 
+         < S u b t o t a l _ L b l   E l e m e n t T y p e = " C o l u m n "   E l e m e n t I d = " 1 9 6 7 7 9 5 1 4 2 "   D a t a T y p e = " T e x t C o n s t " > S u b t o t a l _ L b l < / S u b t o t a l _ L b l > + 
+         < T h a n k s _ L b l   E l e m e n t T y p e = " C o l u m n "   E l e m e n t I d = " 2 1 0 3 3 0 5 5 2 5 "   D a t a T y p e = " T e x t C o n s t " > T h a n k s _ L b l < / T h a n k s _ L b l > + 
+         < T o t a l _ L b l   E l e m e n t T y p e = " C o l u m n "   E l e m e n t I d = " 1 2 1 0 1 0 0 8 7 8 "   D a t a T y p e = " T e x t C o n s t " > T o t a l _ L b l < / T o t a l _ L b l > + 
+         < T o t a l C O 2 e _ L b l   E l e m e n t T y p e = " C o l u m n "   E l e m e n t I d = " 1 0 3 0 5 9 5 2 5 5 "   D a t a T y p e = " T e x t " > T o t a l C O 2 e _ L b l < / T o t a l C O 2 e _ L b l > + 
+         < V A T A m o u n t _ L b l   E l e m e n t T y p e = " C o l u m n "   E l e m e n t I d = " 1 0 9 4 6 5 7 2 9 "   D a t a T y p e = " T e x t C o n s t " > V A T A m o u n t _ L b l < / V A T A m o u n t _ L b l > + 
+         < V A T A m o u n t S p e c i f i c a t i o n _ L b l   E l e m e n t T y p e = " C o l u m n "   E l e m e n t I d = " 8 7 8 7 0 6 8 4 6 "   D a t a T y p e = " T e x t C o n s t " > V A T A m o u n t S p e c i f i c a t i o n _ L b l < / V A T A m o u n t S p e c i f i c a t i o n _ L b l > + 
+         < V A T B a s e _ L b l   E l e m e n t T y p e = " C o l u m n "   E l e m e n t I d = " 1 8 6 6 1 5 8 2 7 8 "   D a t a T y p e = " T e x t C o n s t " > V A T B a s e _ L b l < / V A T B a s e _ L b l > + 
+         < V A T C l a u s e _ L b l   E l e m e n t T y p e = " C o l u m n "   E l e m e n t I d = " 1 5 7 0 4 9 5 4 9 0 "   D a t a T y p e = " S t r i n g " > V A T C l a u s e _ L b l < / V A T C l a u s e _ L b l > + 
+         < V A T C l a u s e s _ L b l   E l e m e n t T y p e = " C o l u m n "   E l e m e n t I d = " 1 3 8 3 9 2 0 0 1 9 "   D a t a T y p e = " T e x t C o n s t " > V A T C l a u s e s _ L b l < / V A T C l a u s e s _ L b l > + 
+         < V A T I d e n t i f i e r _ L b l   E l e m e n t T y p e = " C o l u m n "   E l e m e n t I d = " 1 6 8 6 6 2 3 9 8 4 "   D a t a T y p e = " T e x t C o n s t " > V A T I d e n t i f i e r _ L b l < / V A T I d e n t i f i e r _ L b l > + 
+         < V A T P e r c e n t a g e _ L b l   E l e m e n t T y p e = " C o l u m n "   E l e m e n t I d = " 6 7 6 6 5 4 5 6 5 "   D a t a T y p e = " T e x t C o n s t " > V A T P e r c e n t a g e _ L b l < / V A T P e r c e n t a g e _ L b l > + 
+         < V A T R e g i s t r a t i o n N o   E l e m e n t T y p e = " C o l u m n "   E l e m e n t I d = " 1 8 8 9 1 9 5 4 0 2 "   D a t a T y p e = " T e x t " > V A T R e g i s t r a t i o n N o < / V A T R e g i s t r a t i o n N o > + 
+         < V A T R e g i s t r a t i o n N o _ L b l   E l e m e n t T y p e = " C o l u m n "   E l e m e n t I d = " 1 4 2 4 6 1 6 0 8 5 "   D a t a T y p e = " T e x t " > V A T R e g i s t r a t i o n N o _ L b l < / V A T R e g i s t r a t i o n N o _ L b l > + 
+         < Y o u r D o c u m e n t T i t l e _ L b l   E l e m e n t T y p e = " C o l u m n "   E l e m e n t I d = " 1 8 2 1 7 1 6 9 3 4 "   D a t a T y p e = " T e x t C o n s t " > Y o u r D o c u m e n t T i t l e _ L b l < / Y o u r D o c u m e n t T i t l e _ L b l > + 
+         < Y o u r R e f e r e n c e   E l e m e n t T y p e = " C o l u m n "   E l e m e n t I d = " 1 1 0 3 9 9 5 1 "   D a t a T y p e = " T e x t " > Y o u r R e f e r e n c e < / Y o u r R e f e r e n c e > + 
+         < Y o u r R e f e r e n c e _ L b l   E l e m e n t T y p e = " C o l u m n "   E l e m e n t I d = " 4 6 5 4 7 7 4 2 6 "   D a t a T y p e = " S t r i n g " > Y o u r R e f e r e n c e _ L b l < / Y o u r R e f e r e n c e _ L b l > + 
+         < L i n e   E l e m e n t T y p e = " D a t a I t e m "   E l e m e n t I d = " 4 1 1 9 7 6 1 3 3 " > + 
+             < A m o u n t E x c l u d i n g V A T _ L i n e   E l e m e n t T y p e = " C o l u m n "   E l e m e n t I d = " 1 0 6 2 4 6 0 0 4 0 "   D a t a T y p e = " D e c i m a l " > A m o u n t E x c l u d i n g V A T _ L i n e < / A m o u n t E x c l u d i n g V A T _ L i n e > + 
+             < A m o u n t E x c l u d i n g V A T _ L i n e _ L b l   E l e m e n t T y p e = " C o l u m n "   E l e m e n t I d = " 2 0 0 2 8 7 4 4 7 5 "   D a t a T y p e = " S t r i n g " > A m o u n t E x c l u d i n g V A T _ L i n e _ L b l < / A m o u n t E x c l u d i n g V A T _ L i n e _ L b l > + 
+             < A m o u n t I n c l u d i n g V A T _ L i n e   E l e m e n t T y p e = " C o l u m n "   E l e m e n t I d = " 7 7 0 9 2 8 4 0 2 "   D a t a T y p e = " D e c i m a l " > A m o u n t I n c l u d i n g V A T _ L i n e < / A m o u n t I n c l u d i n g V A T _ L i n e > + 
+             < A m o u n t I n c l u d i n g V A T _ L i n e _ L b l   E l e m e n t T y p e = " C o l u m n "   E l e m e n t I d = " 9 3 0 7 4 7 3 1 3 "   D a t a T y p e = " S t r i n g " > A m o u n t I n c l u d i n g V A T _ L i n e _ L b l < / A m o u n t I n c l u d i n g V A T _ L i n e _ L b l > + 
+             < C O 2 e P e r U n i t _ L i n e   E l e m e n t T y p e = " C o l u m n "   E l e m e n t I d = " 1 3 2 0 1 7 0 3 0 2 "   D a t a T y p e = " T e x t " > C O 2 e P e r U n i t _ L i n e < / C O 2 e P e r U n i t _ L i n e > + 
+             < C o n t r a c t L i n e N o   E l e m e n t T y p e = " C o l u m n "   E l e m e n t I d = " 3 0 7 6 6 9 2 4 8 "   D a t a T y p e = " I n t e g e r " > C o n t r a c t L i n e N o < / C o n t r a c t L i n e N o > + 
+             < C o n t r a c t N o   E l e m e n t T y p e = " C o l u m n "   E l e m e n t I d = " 1 9 5 9 3 0 8 7 1 8 "   D a t a T y p e = " C o d e " > C o n t r a c t N o < / C o n t r a c t N o > + 
+             < D e s c r i p t i o n _ L i n e   E l e m e n t T y p e = " C o l u m n "   E l e m e n t I d = " 1 4 0 6 8 2 2 3 1 0 "   D a t a T y p e = " T e x t " > D e s c r i p t i o n _ L i n e < / D e s c r i p t i o n _ L i n e > + 
+             < D e s c r i p t i o n _ L i n e _ L b l   E l e m e n t T y p e = " C o l u m n "   E l e m e n t I d = " 2 1 1 8 9 5 1 4 9 5 "   D a t a T y p e = " S t r i n g " > D e s c r i p t i o n _ L i n e _ L b l < / D e s c r i p t i o n _ L i n e _ L b l > + 
+             < I t e m N o _ L i n e   E l e m e n t T y p e = " C o l u m n "   E l e m e n t I d = " 1 9 1 0 2 9 6 2 8 8 "   D a t a T y p e = " C o d e " > I t e m N o _ L i n e < / I t e m N o _ L i n e > + 
+             < I t e m N o _ L i n e _ L b l   E l e m e n t T y p e = " C o l u m n "   E l e m e n t I d = " 1 3 4 0 0 7 9 6 1 3 "   D a t a T y p e = " S t r i n g " > I t e m N o _ L i n e _ L b l < / I t e m N o _ L i n e _ L b l > + 
+             < I t e m R e f e r e n c e N o _ L i n e   E l e m e n t T y p e = " C o l u m n "   E l e m e n t I d = " 9 2 7 2 3 5 7 "   D a t a T y p e = " C o d e " > I t e m R e f e r e n c e N o _ L i n e < / I t e m R e f e r e n c e N o _ L i n e > + 
+             < I t e m R e f e r e n c e N o _ L i n e _ L b l   E l e m e n t T y p e = " C o l u m n "   E l e m e n t I d = " 1 9 8 0 6 3 1 1 3 0 "   D a t a T y p e = " S t r i n g " > I t e m R e f e r e n c e N o _ L i n e _ L b l < / I t e m R e f e r e n c e N o _ L i n e _ L b l > + 
+             < J o b N o   E l e m e n t T y p e = " C o l u m n "   E l e m e n t I d = " 1 8 1 5 5 8 0 3 6 5 "   D a t a T y p e = " C o d e " > J o b N o < / J o b N o > + 
+             < J o b N o _ L b l   E l e m e n t T y p e = " C o l u m n "   E l e m e n t I d = " 1 8 9 7 0 9 4 2 6 "   D a t a T y p e = " T e x t " > J o b N o _ L b l < / J o b N o _ L b l > + 
+             < J o b T a s k D e s c _ L b l   E l e m e n t T y p e = " C o l u m n "   E l e m e n t I d = " 5 4 8 3 1 0 0 2 7 "   D a t a T y p e = " T e x t C o n s t " > J o b T a s k D e s c _ L b l < / J o b T a s k D e s c _ L b l > + 
+             < J o b T a s k D e s c r i p t i o n   E l e m e n t T y p e = " C o l u m n "   E l e m e n t I d = " 1 0 6 5 5 0 2 3 4 3 "   D a t a T y p e = " T e x t " > J o b T a s k D e s c r i p t i o n < / J o b T a s k D e s c r i p t i o n > + 
+             < J o b T a s k N o   E l e m e n t T y p e = " C o l u m n "   E l e m e n t I d = " 9 4 0 0 8 9 4 5 8 "   D a t a T y p e = " C o d e " > J o b T a s k N o < / J o b T a s k N o > + 
+             < J o b T a s k N o _ L b l   E l e m e n t T y p e = " C o l u m n "   E l e m e n t I d = " 6 2 2 6 5 1 9 4 9 "   D a t a T y p e = " T e x t " > J o b T a s k N o _ L b l < / J o b T a s k N o _ L b l > + 
+             < L i n e A m o u n t _ L i n e   E l e m e n t T y p e = " C o l u m n "   E l e m e n t I d = " 2 6 8 9 3 7 1 6 2 "   D a t a T y p e = " T e x t " > L i n e A m o u n t _ L i n e < / L i n e A m o u n t _ L i n e > + 
+             < L i n e A m o u n t _ L i n e _ L b l   E l e m e n t T y p e = " C o l u m n "   E l e m e n t I d = " 9 9 2 9 0 1 8 4 5 "   D a t a T y p e = " S t r i n g " > L i n e A m o u n t _ L i n e _ L b l < / L i n e A m o u n t _ L i n e _ L b l > + 
+             < L i n e D i s c o u n t P e r c e n t _ L i n e   E l e m e n t T y p e = " C o l u m n "   E l e m e n t I d = " 9 0 7 8 2 7 4 3 6 "   D a t a T y p e = " D e c i m a l " > L i n e D i s c o u n t P e r c e n t _ L i n e < / L i n e D i s c o u n t P e r c e n t _ L i n e > + 
+             < L i n e D i s c o u n t P e r c e n t T e x t _ L i n e   E l e m e n t T y p e = " C o l u m n "   E l e m e n t I d = " 6 1 3 1 3 5 1 9 "   D a t a T y p e = " T e x t " > L i n e D i s c o u n t P e r c e n t T e x t _ L i n e < / L i n e D i s c o u n t P e r c e n t T e x t _ L i n e > + 
+             < L i n e N o _ L i n e   E l e m e n t T y p e = " C o l u m n "   E l e m e n t I d = " 6 9 8 9 8 5 9 7 9 "   D a t a T y p e = " I n t e g e r " > L i n e N o _ L i n e < / L i n e N o _ L i n e > + 
+             < P r i c e _ L b l   E l e m e n t T y p e = " C o l u m n "   E l e m e n t I d = " 2 1 2 6 7 6 4 9 2 5 "   D a t a T y p e = " T e x t C o n s t " > P r i c e _ L b l < / P r i c e _ L b l > + 
+             < P r i c e P e r _ L b l   E l e m e n t T y p e = " C o l u m n "   E l e m e n t I d = " 9 7 3 2 8 0 1 3 4 "   D a t a T y p e = " T e x t C o n s t " > P r i c e P e r _ L b l < / P r i c e P e r _ L b l > + 
+             < Q t y _ L b l   E l e m e n t T y p e = " C o l u m n "   E l e m e n t I d = " 2 6 3 6 7 3 7 6 4 "   D a t a T y p e = " T e x t C o n s t " > Q t y _ L b l < / Q t y _ L b l > + 
+             < Q u a n t i t y _ L i n e   E l e m e n t T y p e = " C o l u m n "   E l e m e n t I d = " 1 0 6 8 5 4 3 5 3 7 "   D a t a T y p e = " T e x t " > Q u a n t i t y _ L i n e < / Q u a n t i t y _ L i n e > + 
+             < Q u a n t i t y _ L i n e _ L b l   E l e m e n t T y p e = " C o l u m n "   E l e m e n t I d = " 2 0 3 4 5 0 6 8 0 2 "   D a t a T y p e = " S t r i n g " > Q u a n t i t y _ L i n e _ L b l < / Q u a n t i t y _ L i n e _ L b l > + 
+             < R e c u r r i n g B i l l i n g f r o m   E l e m e n t T y p e = " C o l u m n "   E l e m e n t I d = " 4 7 7 0 0 1 9 2 1 "   D a t a T y p e = " D a t e " > R e c u r r i n g B i l l i n g f r o m < / R e c u r r i n g B i l l i n g f r o m > + 
+             < R e c u r r i n g B i l l i n g t o   E l e m e n t T y p e = " C o l u m n "   E l e m e n t I d = " 1 3 8 4 6 2 3 0 0 4 "   D a t a T y p e = " D a t e " > R e c u r r i n g B i l l i n g t o < / R e c u r r i n g B i l l i n g t o > + 
+             < S h i p m e n t D a t e _ L i n e   E l e m e n t T y p e = " C o l u m n "   E l e m e n t I d = " 1 6 7 3 3 7 5 4 1 6 "   D a t a T y p e = " S t r i n g " > S h i p m e n t D a t e _ L i n e < / S h i p m e n t D a t e _ L i n e > + 
+             < S h i p m e n t D a t e _ L i n e _ L b l   E l e m e n t T y p e = " C o l u m n "   E l e m e n t I d = " 8 5 3 2 2 4 3 6 3 "   D a t a T y p e = " T e x t C o n s t " > S h i p m e n t D a t e _ L i n e _ L b l < / S h i p m e n t D a t e _ L i n e _ L b l > + 
+             < T r a n s H e a d e r A m o u n t   E l e m e n t T y p e = " C o l u m n "   E l e m e n t I d = " 2 0 2 8 3 0 6 2 7 6 "   D a t a T y p e = " D e c i m a l " > T r a n s H e a d e r A m o u n t < / T r a n s H e a d e r A m o u n t > + 
+             < T y p e _ L i n e   E l e m e n t T y p e = " C o l u m n "   E l e m e n t I d = " 2 7 2 8 0 4 9 2 4 "   D a t a T y p e = " S t r i n g " > T y p e _ L i n e < / T y p e _ L i n e > + 
+             < U n i t _ L b l   E l e m e n t T y p e = " C o l u m n "   E l e m e n t I d = " 8 1 4 3 6 4 3 1 8 "   D a t a T y p e = " T e x t C o n s t " > U n i t _ L b l < / U n i t _ L b l > + 
+             < U n i t O f M e a s u r e   E l e m e n t T y p e = " C o l u m n "   E l e m e n t I d = " 1 8 0 8 2 2 8 0 1 8 "   D a t a T y p e = " T e x t " > U n i t O f M e a s u r e < / U n i t O f M e a s u r e > + 
+             < U n i t O f M e a s u r e _ L b l   E l e m e n t T y p e = " C o l u m n "   E l e m e n t I d = " 9 8 1 9 5 1 2 4 9 "   D a t a T y p e = " S t r i n g " > U n i t O f M e a s u r e _ L b l < / U n i t O f M e a s u r e _ L b l > + 
+             < U n i t P r i c e   E l e m e n t T y p e = " C o l u m n "   E l e m e n t I d = " 1 4 7 8 2 2 1 5 2 6 "   D a t a T y p e = " T e x t " > U n i t P r i c e < / U n i t P r i c e > + 
+             < U n i t P r i c e _ L b l   E l e m e n t T y p e = " C o l u m n "   E l e m e n t I d = " 1 1 6 3 9 2 6 6 0 3 "   D a t a T y p e = " S t r i n g " > U n i t P r i c e _ L b l < / U n i t P r i c e _ L b l > + 
+             < V A T I d e n t i f i e r _ L i n e   E l e m e n t T y p e = " C o l u m n "   E l e m e n t I d = " 1 7 7 3 6 2 2 4 1 2 "   D a t a T y p e = " C o d e " > V A T I d e n t i f i e r _ L i n e < / V A T I d e n t i f i e r _ L i n e > + 
+             < V A T I d e n t i f i e r _ L i n e _ L b l   E l e m e n t T y p e = " C o l u m n "   E l e m e n t I d = " 5 3 3 7 8 2 7 0 3 "   D a t a T y p e = " S t r i n g " > V A T I d e n t i f i e r _ L i n e _ L b l < / V A T I d e n t i f i e r _ L i n e _ L b l > + 
+             < V A T P c t _ L i n e   E l e m e n t T y p e = " C o l u m n "   E l e m e n t I d = " 1 9 7 4 0 0 1 9 4 4 "   D a t a T y p e = " T e x t " > V A T P c t _ L i n e < / V A T P c t _ L i n e > + 
+             < V A T P c t _ L i n e _ L b l   E l e m e n t T y p e = " C o l u m n "   E l e m e n t I d = " 1 2 0 7 5 2 9 9 1 5 "   D a t a T y p e = " S t r i n g " > V A T P c t _ L i n e _ L b l < / V A T P c t _ L i n e _ L b l > + 
+             < S h i p m e n t L i n e   E l e m e n t T y p e = " D a t a I t e m "   E l e m e n t I d = " 2 0 1 5 9 9 6 0 5 1 " > + 
+                 < D o c u m e n t N o _ S h i p m e n t L i n e   E l e m e n t T y p e = " C o l u m n "   E l e m e n t I d = " 1 2 4 3 7 6 7 7 6 2 "   D a t a T y p e = " C o d e " > D o c u m e n t N o _ S h i p m e n t L i n e < / D o c u m e n t N o _ S h i p m e n t L i n e > + 
+                 < P o s t i n g D a t e _ S h i p m e n t L i n e   E l e m e n t T y p e = " C o l u m n "   E l e m e n t I d = " 1 8 3 4 0 0 3 2 0 "   D a t a T y p e = " S t r i n g " > P o s t i n g D a t e _ S h i p m e n t L i n e < / P o s t i n g D a t e _ S h i p m e n t L i n e > + 
+                 < P o s t i n g D a t e _ S h i p m e n t L i n e _ L b l   E l e m e n t T y p e = " C o l u m n "   E l e m e n t I d = " 1 0 9 0 0 6 9 0 2 7 "   D a t a T y p e = " S t r i n g " > P o s t i n g D a t e _ S h i p m e n t L i n e _ L b l < / P o s t i n g D a t e _ S h i p m e n t L i n e _ L b l > + 
+                 < Q u a n t i t y _ S h i p m e n t L i n e   E l e m e n t T y p e = " C o l u m n "   E l e m e n t I d = " 1 6 3 7 0 3 4 2 4 7 "   D a t a T y p e = " D e c i m a l " > Q u a n t i t y _ S h i p m e n t L i n e < / Q u a n t i t y _ S h i p m e n t L i n e > + 
+                 < Q u a n t i t y _ S h i p m e n t L i n e _ L b l   E l e m e n t T y p e = " C o l u m n "   E l e m e n t I d = " 1 6 0 2 6 6 7 3 8 6 "   D a t a T y p e = " S t r i n g " > Q u a n t i t y _ S h i p m e n t L i n e _ L b l < / Q u a n t i t y _ S h i p m e n t L i n e _ L b l > + 
+             < / S h i p m e n t L i n e > + 
+             < A s s e m b l y L i n e   E l e m e n t T y p e = " D a t a I t e m "   E l e m e n t I d = " 1 2 0 5 9 4 2 8 5 " > + 
+                 < D e s c r i p t i o n _ A s s e m b l y L i n e   E l e m e n t T y p e = " C o l u m n "   E l e m e n t I d = " 2 8 0 7 4 3 7 9 6 "   D a t a T y p e = " T e x t " > D e s c r i p t i o n _ A s s e m b l y L i n e < / D e s c r i p t i o n _ A s s e m b l y L i n e > + 
+                 < L i n e N o _ A s s e m b l y L i n e   E l e m e n t T y p e = " C o l u m n "   E l e m e n t I d = " 6 4 0 5 8 3 8 9 1 "   D a t a T y p e = " C o d e " > L i n e N o _ A s s e m b l y L i n e < / L i n e N o _ A s s e m b l y L i n e > + 
+                 < Q u a n t i t y _ A s s e m b l y L i n e   E l e m e n t T y p e = " C o l u m n "   E l e m e n t I d = " 1 9 5 7 6 4 8 2 3 1 "   D a t a T y p e = " D e c i m a l " > Q u a n t i t y _ A s s e m b l y L i n e < / Q u a n t i t y _ A s s e m b l y L i n e > + 
+                 < U n i t O f M e a s u r e _ A s s e m b l y L i n e   E l e m e n t T y p e = " C o l u m n "   E l e m e n t I d = " 1 6 4 9 1 2 3 7 7 3 "   D a t a T y p e = " T e x t " > U n i t O f M e a s u r e _ A s s e m b l y L i n e < / U n i t O f M e a s u r e _ A s s e m b l y L i n e > + 
+                 < V a r i a n t C o d e _ A s s e m b l y L i n e   E l e m e n t T y p e = " C o l u m n "   E l e m e n t I d = " 1 8 6 9 4 0 7 6 7 2 "   D a t a T y p e = " C o d e " > V a r i a n t C o d e _ A s s e m b l y L i n e < / V a r i a n t C o d e _ A s s e m b l y L i n e > + 
+             < / A s s e m b l y L i n e > + 
+         < / L i n e > + 
+         < W o r k D e s c r i p t i o n L i n e s   E l e m e n t T y p e = " D a t a I t e m "   E l e m e n t I d = " 2 7 6 8 1 9 4 4 7 " > + 
+             < W o r k D e s c r i p t i o n L i n e   E l e m e n t T y p e = " C o l u m n "   E l e m e n t I d = " 1 9 4 7 6 2 1 6 7 6 "   D a t a T y p e = " T e x t " > W o r k D e s c r i p t i o n L i n e < / W o r k D e s c r i p t i o n L i n e > + 
+             < W o r k D e s c r i p t i o n L i n e N u m b e r   E l e m e n t T y p e = " C o l u m n "   E l e m e n t I d = " 7 9 7 3 0 7 2 2 3 "   D a t a T y p e = " I n t e g e r " > W o r k D e s c r i p t i o n L i n e N u m b e r < / W o r k D e s c r i p t i o n L i n e N u m b e r > + 
+         < / W o r k D e s c r i p t i o n L i n e s > + 
+         < V A T A m o u n t L i n e   E l e m e n t T y p e = " D a t a I t e m "   E l e m e n t I d = " 8 2 7 5 3 4 3 4 8 " > + 
+             < I n v o i c e D i s c o u n t A m o u n t _ V A T A m o u n t L i n e   E l e m e n t T y p e = " C o l u m n "   E l e m e n t I d = " 8 2 4 7 3 0 1 4 1 "   D a t a T y p e = " D e c i m a l " > I n v o i c e D i s c o u n t A m o u n t _ V A T A m o u n t L i n e < / I n v o i c e D i s c o u n t A m o u n t _ V A T A m o u n t L i n e > + 
+             < I n v o i c e D i s c o u n t A m o u n t _ V A T A m o u n t L i n e _ L b l   E l e m e n t T y p e = " C o l u m n "   E l e m e n t I d = " 1 5 6 2 2 0 0 0 3 4 "   D a t a T y p e = " S t r i n g " > I n v o i c e D i s c o u n t A m o u n t _ V A T A m o u n t L i n e _ L b l < / I n v o i c e D i s c o u n t A m o u n t _ V A T A m o u n t L i n e _ L b l > + 
+             < I n v o i c e D i s c o u n t B a s e A m o u n t _ V A T A m o u n t L i n e   E l e m e n t T y p e = " C o l u m n "   E l e m e n t I d = " 2 0 4 0 3 3 2 2 6 6 "   D a t a T y p e = " D e c i m a l " > I n v o i c e D i s c o u n t B a s e A m o u n t _ V A T A m o u n t L i n e < / I n v o i c e D i s c o u n t B a s e A m o u n t _ V A T A m o u n t L i n e > + 
+             < I n v o i c e D i s c o u n t B a s e A m o u n t _ V A T A m o u n t L i n e _ L b l   E l e m e n t T y p e = " C o l u m n "   E l e m e n t I d = " 4 0 5 9 6 0 3 3 1 "   D a t a T y p e = " S t r i n g " > I n v o i c e D i s c o u n t B a s e A m o u n t _ V A T A m o u n t L i n e _ L b l < / I n v o i c e D i s c o u n t B a s e A m o u n t _ V A T A m o u n t L i n e _ L b l > + 
+             < L i n e A m o u n t _ V a t A m o u n t L i n e   E l e m e n t T y p e = " C o l u m n "   E l e m e n t I d = " 2 1 4 6 5 4 0 1 "   D a t a T y p e = " D e c i m a l " > L i n e A m o u n t _ V a t A m o u n t L i n e < / L i n e A m o u n t _ V a t A m o u n t L i n e > + 
+             < L i n e A m o u n t _ V a t A m o u n t L i n e _ L b l   E l e m e n t T y p e = " C o l u m n "   E l e m e n t I d = " 1 1 1 0 9 1 2 1 2 4 "   D a t a T y p e = " S t r i n g " > L i n e A m o u n t _ V a t A m o u n t L i n e _ L b l < / L i n e A m o u n t _ V a t A m o u n t L i n e _ L b l > + 
+             < N o O f V A T I d e n t i f i e r s   E l e m e n t T y p e = " C o l u m n "   E l e m e n t I d = " 1 1 5 3 2 6 3 0 2 6 "   D a t a T y p e = " I n t e g e r " > N o O f V A T I d e n t i f i e r s < / N o O f V A T I d e n t i f i e r s > + 
+             < V A T A m o u n t _ V a t A m o u n t L i n e   E l e m e n t T y p e = " C o l u m n "   E l e m e n t I d = " 1 8 9 1 8 2 0 6 2 0 "   D a t a T y p e = " D e c i m a l " > V A T A m o u n t _ V a t A m o u n t L i n e < / V A T A m o u n t _ V a t A m o u n t L i n e > + 
+             < V A T A m o u n t _ V a t A m o u n t L i n e _ L b l   E l e m e n t T y p e = " C o l u m n "   E l e m e n t I d = " 1 5 1 3 5 5 5 4 7 3 "   D a t a T y p e = " S t r i n g " > V A T A m o u n t _ V a t A m o u n t L i n e _ L b l < / V A T A m o u n t _ V a t A m o u n t L i n e _ L b l > + 
+             < V A T A m o u n t L C Y _ V A T A m o u n t L i n e   E l e m e n t T y p e = " C o l u m n "   E l e m e n t I d = " 1 5 8 1 9 9 4 3 5 0 "   D a t a T y p e = " D e c i m a l " > V A T A m o u n t L C Y _ V A T A m o u n t L i n e < / V A T A m o u n t L C Y _ V A T A m o u n t L i n e > + 
+             < V A T A m o u n t L C Y _ V A T A m o u n t L i n e _ L b l   E l e m e n t T y p e = " C o l u m n "   E l e m e n t I d = " 9 2 3 0 0 3 3 7 "   D a t a T y p e = " T e x t C o n s t " > V A T A m o u n t L C Y _ V A T A m o u n t L i n e _ L b l < / V A T A m o u n t L C Y _ V A T A m o u n t L i n e _ L b l > + 
+             < V A T B a s e _ V a t A m o u n t L i n e   E l e m e n t T y p e = " C o l u m n "   E l e m e n t I d = " 1 4 5 8 9 3 7 8 1 9 "   D a t a T y p e = " D e c i m a l " > V A T B a s e _ V a t A m o u n t L i n e < / V A T B a s e _ V a t A m o u n t L i n e > + 
+             < V A T B a s e _ V a t A m o u n t L i n e _ L b l   E l e m e n t T y p e = " C o l u m n "   E l e m e n t I d = " 1 6 9 1 3 0 2 4 8 8 "   D a t a T y p e = " S t r i n g " > V A T B a s e _ V a t A m o u n t L i n e _ L b l < / V A T B a s e _ V a t A m o u n t L i n e _ L b l > + 
+             < V A T B a s e L C Y _ V A T A m o u n t L i n e   E l e m e n t T y p e = " C o l u m n "   E l e m e n t I d = " 1 8 6 0 9 4 5 6 3 5 "   D a t a T y p e = " D e c i m a l " > V A T B a s e L C Y _ V A T A m o u n t L i n e < / V A T B a s e L C Y _ V A T A m o u n t L i n e > + 
+             < V A T B a s e L C Y _ V A T A m o u n t L i n e _ L b l   E l e m e n t T y p e = " C o l u m n "   E l e m e n t I d = " 1 2 3 6 4 6 7 9 9 8 "   D a t a T y p e = " T e x t C o n s t " > V A T B a s e L C Y _ V A T A m o u n t L i n e _ L b l < / V A T B a s e L C Y _ V A T A m o u n t L i n e _ L b l > + 
+             < V A T I d e n t i f i e r _ V a t A m o u n t L i n e   E l e m e n t T y p e = " C o l u m n "   E l e m e n t I d = " 1 1 4 2 0 7 0 0 3 5 "   D a t a T y p e = " C o d e " > V A T I d e n t i f i e r _ V a t A m o u n t L i n e < / V A T I d e n t i f i e r _ V a t A m o u n t L i n e > + 
+             < V A T I d e n t i f i e r _ V a t A m o u n t L i n e _ L b l   E l e m e n t T y p e = " C o l u m n "   E l e m e n t I d = " 8 6 4 5 0 4 5 0 "   D a t a T y p e = " S t r i n g " > V A T I d e n t i f i e r _ V a t A m o u n t L i n e _ L b l < / V A T I d e n t i f i e r _ V a t A m o u n t L i n e _ L b l > + 
+             < V A T P c t _ V a t A m o u n t L i n e   E l e m e n t T y p e = " C o l u m n "   E l e m e n t I d = " 1 4 5 3 5 4 2 7 7 7 "   D a t a T y p e = " D e c i m a l " > V A T P c t _ V a t A m o u n t L i n e < / V A T P c t _ V a t A m o u n t L i n e > + 
+             < V A T P c t _ V a t A m o u n t L i n e _ L b l   E l e m e n t T y p e = " C o l u m n "   E l e m e n t I d = " 6 7 6 3 2 3 7 8 "   D a t a T y p e = " S t r i n g " > V A T P c t _ V a t A m o u n t L i n e _ L b l < / V A T P c t _ V a t A m o u n t L i n e _ L b l > + 
+         < / V A T A m o u n t L i n e > + 
+         < V A T C l a u s e L i n e   E l e m e n t T y p e = " D a t a I t e m "   E l e m e n t I d = " 1 6 6 5 5 0 0 1 6 3 " > + 
+             < C o d e _ V A T C l a u s e L i n e   E l e m e n t T y p e = " C o l u m n "   E l e m e n t I d = " 1 8 2 4 5 8 9 8 4 7 "   D a t a T y p e = " C o d e " > C o d e _ V A T C l a u s e L i n e < / C o d e _ V A T C l a u s e L i n e > + 
+             < C o d e _ V A T C l a u s e L i n e _ L b l   E l e m e n t T y p e = " C o l u m n "   E l e m e n t I d = " 4 6 1 5 3 3 0 2 "   D a t a T y p e = " S t r i n g " > C o d e _ V A T C l a u s e L i n e _ L b l < / C o d e _ V A T C l a u s e L i n e _ L b l > + 
+             < D e s c r i p t i o n _ V A T C l a u s e L i n e   E l e m e n t T y p e = " C o l u m n "   E l e m e n t I d = " 1 3 0 5 5 4 5 9 2 4 "   D a t a T y p e = " T e x t " > D e s c r i p t i o n _ V A T C l a u s e L i n e < / D e s c r i p t i o n _ V A T C l a u s e L i n e > + 
+             < D e s c r i p t i o n 2 _ V A T C l a u s e L i n e   E l e m e n t T y p e = " C o l u m n "   E l e m e n t I d = " 1 3 7 9 6 6 7 4 7 0 "   D a t a T y p e = " T e x t " > D e s c r i p t i o n 2 _ V A T C l a u s e L i n e < / D e s c r i p t i o n 2 _ V A T C l a u s e L i n e > + 
+             < N o O f V A T C l a u s e s   E l e m e n t T y p e = " C o l u m n "   E l e m e n t I d = " 7 5 6 4 1 7 3 9 2 "   D a t a T y p e = " I n t e g e r " > N o O f V A T C l a u s e s < / N o O f V A T C l a u s e s > + 
+             < V A T A m o u n t _ V A T C l a u s e L i n e   E l e m e n t T y p e = " C o l u m n "   E l e m e n t I d = " 2 2 2 4 6 9 0 5 9 "   D a t a T y p e = " D e c i m a l " > V A T A m o u n t _ V A T C l a u s e L i n e < / V A T A m o u n t _ V A T C l a u s e L i n e > + 
+             < V A T C l a u s e s H e a d e r   E l e m e n t T y p e = " C o l u m n "   E l e m e n t I d = " 1 9 7 2 4 0 9 9 2 9 "   D a t a T y p e = " T e x t " > V A T C l a u s e s H e a d e r < / V A T C l a u s e s H e a d e r > + 
+             < V A T I d e n t i f i e r _ V A T C l a u s e L i n e   E l e m e n t T y p e = " C o l u m n "   E l e m e n t I d = " 1 4 6 4 4 7 2 4 7 8 "   D a t a T y p e = " C o d e " > V A T I d e n t i f i e r _ V A T C l a u s e L i n e < / V A T I d e n t i f i e r _ V A T C l a u s e L i n e > + 
+         < / V A T C l a u s e L i n e > + 
+         < R e p o r t T o t a l s L i n e   E l e m e n t T y p e = " D a t a I t e m "   E l e m e n t I d = " 2 1 2 2 5 4 9 8 3 6 " > + 
+             < A m o u n t _ R e p o r t T o t a l s L i n e   E l e m e n t T y p e = " C o l u m n "   E l e m e n t I d = " 4 1 9 9 1 8 3 6 9 "   D a t a T y p e = " D e c i m a l " > A m o u n t _ R e p o r t T o t a l s L i n e < / A m o u n t _ R e p o r t T o t a l s L i n e > + 
+             < A m o u n t F o r m a t t e d _ R e p o r t T o t a l s L i n e   E l e m e n t T y p e = " C o l u m n "   E l e m e n t I d = " 1 5 0 6 1 3 6 8 2 5 "   D a t a T y p e = " T e x t " > A m o u n t F o r m a t t e d _ R e p o r t T o t a l s L i n e < / A m o u n t F o r m a t t e d _ R e p o r t T o t a l s L i n e > + 
+             < D e s c r i p t i o n _ R e p o r t T o t a l s L i n e   E l e m e n t T y p e = " C o l u m n "   E l e m e n t I d = " 5 8 1 9 9 6 0 6 7 "   D a t a T y p e = " T e x t " > D e s c r i p t i o n _ R e p o r t T o t a l s L i n e < / D e s c r i p t i o n _ R e p o r t T o t a l s L i n e > + 
+             < F o n t B o l d _ R e p o r t T o t a l s L i n e   E l e m e n t T y p e = " C o l u m n "   E l e m e n t I d = " 9 4 6 5 4 0 5 4 9 "   D a t a T y p e = " B o o l e a n " > F o n t B o l d _ R e p o r t T o t a l s L i n e < / F o n t B o l d _ R e p o r t T o t a l s L i n e > + 
+             < F o n t U n d e r l i n e _ R e p o r t T o t a l s L i n e   E l e m e n t T y p e = " C o l u m n "   E l e m e n t I d = " 2 0 2 1 5 3 3 6 9 4 "   D a t a T y p e = " B o o l e a n " > F o n t U n d e r l i n e _ R e p o r t T o t a l s L i n e < / F o n t U n d e r l i n e _ R e p o r t T o t a l s L i n e > + 
+         < / R e p o r t T o t a l s L i n e > + 
+         < C o n t r a c t B i l l i n g D e t a i l s M a p p i n g   E l e m e n t T y p e = " D a t a I t e m "   E l e m e n t I d = " 1 2 8 3 6 2 7 9 0 6 " > + 
+             < C o n t r a c t B i l l i n g D e t a i l s C o n t r a c t N o L b l   E l e m e n t T y p e = " C o l u m n "   E l e m e n t I d = " 1 7 9 3 4 8 1 5 9 1 "   D a t a T y p e = " T e x t C o n s t " > C o n t r a c t B i l l i n g D e t a i l s C o n t r a c t N o L b l < / C o n t r a c t B i l l i n g D e t a i l s C o n t r a c t N o L b l > + 
+             < C o n t r a c t B i l l i n g D e t a i l s C u s t o m e r L b l   E l e m e n t T y p e = " C o l u m n "   E l e m e n t I d = " 5 0 1 8 2 5 5 2 0 "   D a t a T y p e = " T e x t C o n s t " > C o n t r a c t B i l l i n g D e t a i l s C u s t o m e r L b l < / C o n t r a c t B i l l i n g D e t a i l s C u s t o m e r L b l > + 
+             < C o n t r a c t B i l l i n g D e t a i l s P o s i t i o n D e s c r i p t i o n L b l   E l e m e n t T y p e = " C o l u m n "   E l e m e n t I d = " 1 1 8 2 4 1 2 7 1 7 "   D a t a T y p e = " S t r i n g " > C o n t r a c t B i l l i n g D e t a i l s P o s i t i o n D e s c r i p t i o n L b l < / C o n t r a c t B i l l i n g D e t a i l s P o s i t i o n D e s c r i p t i o n L b l > + 
+             < C o n t r a c t B i l l i n g D e t a i l s P o s i t i o n N o L b l   E l e m e n t T y p e = " C o l u m n "   E l e m e n t I d = " 9 8 8 2 8 7 5 4 8 "   D a t a T y p e = " T e x t C o n s t " > C o n t r a c t B i l l i n g D e t a i l s P o s i t i o n N o L b l < / C o n t r a c t B i l l i n g D e t a i l s P o s i t i o n N o L b l > + 
+             < C o n t r a c t B i l l i n g D e t a i l s G r o u p i n g   E l e m e n t T y p e = " D a t a I t e m "   E l e m e n t I d = " 6 1 7 2 4 6 9 2 7 " > + 
+                 < C o n t r a c t B i l l i n g D e t a i l s A m o u n t L b l   E l e m e n t T y p e = " C o l u m n "   E l e m e n t I d = " 1 7 7 6 3 7 0 2 1 6 "   D a t a T y p e = " T e x t " > C o n t r a c t B i l l i n g D e t a i l s A m o u n t L b l < / C o n t r a c t B i l l i n g D e t a i l s A m o u n t L b l > + 
+                 < C o n t r a c t B i l l i n g D e t a i l s C o n t r a c t N o   E l e m e n t T y p e = " C o l u m n "   E l e m e n t I d = " 1 0 4 0 5 4 0 8 6 1 "   D a t a T y p e = " C o d e " > C o n t r a c t B i l l i n g D e t a i l s C o n t r a c t N o < / C o n t r a c t B i l l i n g D e t a i l s C o n t r a c t N o > + 
+                 < C o n t r a c t B i l l i n g D e t a i l s C u r r e n c y C o d e L b l   E l e m e n t T y p e = " C o l u m n "   E l e m e n t I d = " 3 2 4 5 2 4 1 1 4 "   D a t a T y p e = " T e x t " > C o n t r a c t B i l l i n g D e t a i l s C u r r e n c y C o d e L b l < / C o n t r a c t B i l l i n g D e t a i l s C u r r e n c y C o d e L b l > + 
+                 < C o n t r a c t B i l l i n g D e t a i l s C u s t o m e r N a m e   E l e m e n t T y p e = " C o l u m n "   E l e m e n t I d = " 1 7 3 2 1 8 3 8 6 7 "   D a t a T y p e = " T e x t " > C o n t r a c t B i l l i n g D e t a i l s C u s t o m e r N a m e < / C o n t r a c t B i l l i n g D e t a i l s C u s t o m e r N a m e > + 
+                 < C o n t r a c t B i l l i n g D e t a i l s D a y s L b l   E l e m e n t T y p e = " C o l u m n "   E l e m e n t I d = " 7 0 1 3 5 9 8 3 7 "   D a t a T y p e = " T e x t C o n s t " > C o n t r a c t B i l l i n g D e t a i l s D a y s L b l < / C o n t r a c t B i l l i n g D e t a i l s D a y s L b l > + 
+                 < C o n t r a c t B i l l i n g D e t a i l s D e s c r i p t i o n L b l   E l e m e n t T y p e = " C o l u m n "   E l e m e n t I d = " 1 1 4 3 1 2 2 7 0 2 "   D a t a T y p e = " T e x t C o n s t " > C o n t r a c t B i l l i n g D e t a i l s D e s c r i p t i o n L b l < / C o n t r a c t B i l l i n g D e t a i l s D e s c r i p t i o n L b l > + 
+                 < C o n t r a c t B i l l i n g D e t a i l s D i s c o u n t A m o u n t L b l   E l e m e n t T y p e = " C o l u m n "   E l e m e n t I d = " 5 0 8 2 7 5 7 2 3 "   D a t a T y p e = " T e x t " > C o n t r a c t B i l l i n g D e t a i l s D i s c o u n t A m o u n t L b l < / C o n t r a c t B i l l i n g D e t a i l s D i s c o u n t A m o u n t L b l > + 
+                 < C o n t r a c t B i l l i n g D e t a i l s D i s c o u n t P e r c e n t L b l   E l e m e n t T y p e = " C o l u m n "   E l e m e n t I d = " 1 9 3 7 7 3 8 6 3 0 "   D a t a T y p e = " T e x t " > C o n t r a c t B i l l i n g D e t a i l s D i s c o u n t P e r c e n t L b l < / C o n t r a c t B i l l i n g D e t a i l s D i s c o u n t P e r c e n t L b l > + 
+                 < C o n t r a c t B i l l i n g D e t a i l s E n d D a t e L b l   E l e m e n t T y p e = " C o l u m n "   E l e m e n t I d = " 1 5 9 0 2 9 1 0 2 5 "   D a t a T y p e = " T e x t C o n s t " > C o n t r a c t B i l l i n g D e t a i l s E n d D a t e L b l < / C o n t r a c t B i l l i n g D e t a i l s E n d D a t e L b l > + 
+                 < C o n t r a c t B i l l i n g D e t a i l s P o s i t i o n D e s c r i p t i o n   E l e m e n t T y p e = " C o l u m n "   E l e m e n t I d = " 1 3 8 2 4 1 0 9 5 1 "   D a t a T y p e = " T e x t " > C o n t r a c t B i l l i n g D e t a i l s P o s i t i o n D e s c r i p t i o n < / C o n t r a c t B i l l i n g D e t a i l s P o s i t i o n D e s c r i p t i o n > + 
+                 < C o n t r a c t B i l l i n g D e t a i l s P o s i t i o n N o   E l e m e n t T y p e = " C o l u m n "   E l e m e n t I d = " 3 0 5 7 6 7 2 1 8 "   D a t a T y p e = " I n t e g e r " > C o n t r a c t B i l l i n g D e t a i l s P o s i t i o n N o < / C o n t r a c t B i l l i n g D e t a i l s P o s i t i o n N o > + 
+                 < C o n t r a c t B i l l i n g D e t a i l s Q t y L b l   E l e m e n t T y p e = " C o l u m n "   E l e m e n t I d = " 2 3 0 7 8 2 0 7 2 "   D a t a T y p e = " S t r i n g " > C o n t r a c t B i l l i n g D e t a i l s Q t y L b l < / C o n t r a c t B i l l i n g D e t a i l s Q t y L b l > + 
+                 < C o n t r a c t B i l l i n g D e t a i l s S a l e s P r i c e L b l   E l e m e n t T y p e = " C o l u m n "   E l e m e n t I d = " 9 1 4 2 1 9 1 9 1 "   D a t a T y p e = " T e x t " > C o n t r a c t B i l l i n g D e t a i l s S a l e s P r i c e L b l < / C o n t r a c t B i l l i n g D e t a i l s S a l e s P r i c e L b l > + 
+                 < C o n t r a c t B i l l i n g D e t a i l s S t a r t D a t e L b l   E l e m e n t T y p e = " C o l u m n "   E l e m e n t I d = " 1 3 0 2 0 1 8 0 9 6 "   D a t a T y p e = " T e x t C o n s t " > C o n t r a c t B i l l i n g D e t a i l s S t a r t D a t e L b l < / C o n t r a c t B i l l i n g D e t a i l s S t a r t D a t e L b l > + 
+                 < C o n t r a c t B i l l i n g D e t a i l s   E l e m e n t T y p e = " D a t a I t e m "   E l e m e n t I d = " 2 0 7 1 3 9 8 1 8 " > + 
+                     < C o n t r a c t B i l l i n g D e t a i l s B i l l i n g A m o u n t   E l e m e n t T y p e = " C o l u m n "   E l e m e n t I d = " 1 9 8 9 5 6 9 9 8 3 "   D a t a T y p e = " T e x t " > C o n t r a c t B i l l i n g D e t a i l s B i l l i n g A m o u n t < / C o n t r a c t B i l l i n g D e t a i l s B i l l i n g A m o u n t > + 
+                     < C o n t r a c t B i l l i n g D e t a i l s B i l l i n g D i s c o u n t A m o u n t   E l e m e n t T y p e = " C o l u m n "   E l e m e n t I d = " 1 2 2 6 5 3 7 0 0 4 "   D a t a T y p e = " T e x t " > C o n t r a c t B i l l i n g D e t a i l s B i l l i n g D i s c o u n t A m o u n t < / C o n t r a c t B i l l i n g D e t a i l s B i l l i n g D i s c o u n t A m o u n t > + 
+                     < C o n t r a c t B i l l i n g D e t a i l s C u r r e n c y C o d e   E l e m e n t T y p e = " C o l u m n "   E l e m e n t I d = " 8 6 9 7 4 5 7 7 2 "   D a t a T y p e = " C o d e " > C o n t r a c t B i l l i n g D e t a i l s C u r r e n c y C o d e < / C o n t r a c t B i l l i n g D e t a i l s C u r r e n c y C o d e > + 
+                     < C o n t r a c t B i l l i n g D e t a i l s D a y s   E l e m e n t T y p e = " C o l u m n "   E l e m e n t I d = " 1 9 0 1 6 5 8 4 8 7 "   D a t a T y p e = " I n t e g e r " > C o n t r a c t B i l l i n g D e t a i l s D a y s < / C o n t r a c t B i l l i n g D e t a i l s D a y s > + 
+                     < C o n t r a c t B i l l i n g D e t a i l s D e s c r i p t i o n   E l e m e n t T y p e = " C o l u m n "   E l e m e n t I d = " 1 0 1 7 1 4 1 1 6 8 "   D a t a T y p e = " T e x t " > C o n t r a c t B i l l i n g D e t a i l s D e s c r i p t i o n < / C o n t r a c t B i l l i n g D e t a i l s D e s c r i p t i o n > + 
+                     < C o n t r a c t B i l l i n g D e t a i l s D i s c o u n t P e r c e n t   E l e m e n t T y p e = " C o l u m n "   E l e m e n t I d = " 5 0 2 0 9 5 3 8 4 "   D a t a T y p e = " T e x t " > C o n t r a c t B i l l i n g D e t a i l s D i s c o u n t P e r c e n t < / C o n t r a c t B i l l i n g D e t a i l s D i s c o u n t P e r c e n t > + 
+                     < C o n t r a c t B i l l i n g D e t a i l s E n d D a t e   E l e m e n t T y p e = " C o l u m n "   E l e m e n t I d = " 8 0 4 8 9 7 9 0 9 "   D a t a T y p e = " S t r i n g " > C o n t r a c t B i l l i n g D e t a i l s E n d D a t e < / C o n t r a c t B i l l i n g D e t a i l s E n d D a t e > + 
+                     < C o n t r a c t B i l l i n g D e t a i l s Q u a n t i t y   E l e m e n t T y p e = " C o l u m n "   E l e m e n t I d = " 9 7 8 9 3 6 6 9 "   D a t a T y p e = " S t r i n g " > C o n t r a c t B i l l i n g D e t a i l s Q u a n t i t y < / C o n t r a c t B i l l i n g D e t a i l s Q u a n t i t y > + 
+                     < C o n t r a c t B i l l i n g D e t a i l s S a l e s P r i c e   E l e m e n t T y p e = " C o l u m n "   E l e m e n t I d = " 1 5 9 4 8 2 2 5 3 1 "   D a t a T y p e = " T e x t " > C o n t r a c t B i l l i n g D e t a i l s S a l e s P r i c e < / C o n t r a c t B i l l i n g D e t a i l s S a l e s P r i c e > + 
+                     < C o n t r a c t B i l l i n g D e t a i l s S t a r t D a t e   E l e m e n t T y p e = " C o l u m n "   E l e m e n t I d = " 4 3 2 7 5 9 8 7 4 "   D a t a T y p e = " S t r i n g " > C o n t r a c t B i l l i n g D e t a i l s S t a r t D a t e < / C o n t r a c t B i l l i n g D e t a i l s S t a r t D a t e > + 
+                 < / C o n t r a c t B i l l i n g D e t a i l s > + 
+             < / C o n t r a c t B i l l i n g D e t a i l s G r o u p i n g > + 
+         < / C o n t r a c t B i l l i n g D e t a i l s M a p p i n g > + 
+         < L i n e F e e   E l e m e n t T y p e = " D a t a I t e m "   E l e m e n t I d = " 2 6 6 6 3 0 7 3 3 " > + 
+             < L i n e F e e C a p t i o n T e x t   E l e m e n t T y p e = " C o l u m n "   E l e m e n t I d = " 4 3 7 6 4 3 7 9 0 "   D a t a T y p e = " T e x t " > L i n e F e e C a p t i o n T e x t < / L i n e F e e C a p t i o n T e x t > + 
+         < / L i n e F e e > + 
+         < P a y m e n t R e p o r t i n g A r g u m e n t   E l e m e n t T y p e = " D a t a I t e m "   E l e m e n t I d = " 3 1 3 7 4 4 1 9 4 " > + 
+             < P a y m e n t S e r v i c e L o g o   E l e m e n t T y p e = " C o l u m n "   E l e m e n t I d = " 4 1 6 7 9 0 7 6 7 "   D a t a T y p e = " B L O B " / > + 
+             < P a y m e n t S e r v i c e L o g o _ U r l   E l e m e n t T y p e = " C o l u m n "   E l e m e n t I d = " 6 4 4 9 7 5 1 3 9 "   D a t a T y p e = " T e x t " > P a y m e n t S e r v i c e L o g o _ U r l < / P a y m e n t S e r v i c e L o g o _ U r l > + 
+             < P a y m e n t S e r v i c e L o g o _ U r l T e x t   E l e m e n t T y p e = " C o l u m n "   E l e m e n t I d = " 1 4 1 1 7 0 3 9 7 6 "   D a t a T y p e = " T e x t " > P a y m e n t S e r v i c e L o g o _ U r l T e x t < / P a y m e n t S e r v i c e L o g o _ U r l T e x t > + 
+             < P a y m e n t S e r v i c e T e x t _ U r l   E l e m e n t T y p e = " C o l u m n "   E l e m e n t I d = " 1 7 4 2 3 3 4 7 "   D a t a T y p e = " T e x t " > P a y m e n t S e r v i c e T e x t _ U r l < / P a y m e n t S e r v i c e T e x t _ U r l > + 
+             < P a y m e n t S e r v i c e T e x t _ U r l T e x t   E l e m e n t T y p e = " C o l u m n "   E l e m e n t I d = " 1 6 3 6 7 7 2 9 3 4 "   D a t a T y p e = " T e x t " > P a y m e n t S e r v i c e T e x t _ U r l T e x t < / P a y m e n t S e r v i c e T e x t _ U r l T e x t > + 
+         < / P a y m e n t R e p o r t i n g A r g u m e n t > + 
+         < L e f t H e a d e r   E l e m e n t T y p e = " D a t a I t e m "   E l e m e n t I d = " 7 3 4 6 8 0 8 3 3 " > + 
+             < L e f t H e a d e r N a m e   E l e m e n t T y p e = " C o l u m n "   E l e m e n t I d = " 4 3 7 4 2 2 1 8 2 "   D a t a T y p e = " T e x t " > L e f t H e a d e r N a m e < / L e f t H e a d e r N a m e > + 
+             < L e f t H e a d e r V a l u e   E l e m e n t T y p e = " C o l u m n "   E l e m e n t I d = " 2 4 2 1 2 6 3 1 0 "   D a t a T y p e = " T e x t " > L e f t H e a d e r V a l u e < / L e f t H e a d e r V a l u e > + 
+         < / L e f t H e a d e r > + 
+         < R i g h t H e a d e r   E l e m e n t T y p e = " D a t a I t e m "   E l e m e n t I d = " 2 5 4 5 4 4 9 4 6 " > + 
+             < R i g h t H e a d e r N a m e   E l e m e n t T y p e = " C o l u m n "   E l e m e n t I d = " 8 9 8 2 8 7 5 7 "   D a t a T y p e = " T e x t " > R i g h t H e a d e r N a m e < / R i g h t H e a d e r N a m e > + 
+             < R i g h t H e a d e r V a l u e   E l e m e n t T y p e = " C o l u m n "   E l e m e n t I d = " 7 0 6 9 3 8 5 5 9 "   D a t a T y p e = " T e x t " > R i g h t H e a d e r V a l u e < / R i g h t H e a d e r V a l u e > + 
+         < / R i g h t H e a d e r > + 
+         < L e t t e r T e x t   E l e m e n t T y p e = " D a t a I t e m "   E l e m e n t I d = " 1 5 1 0 3 5 3 8 3 4 " > + 
+             < B o d y T e x t   E l e m e n t T y p e = " C o l u m n "   E l e m e n t I d = " 1 4 9 7 5 9 8 0 8 "   D a t a T y p e = " T e x t C o n s t " > B o d y T e x t < / B o d y T e x t > + 
+             < C l o s i n g T e x t   E l e m e n t T y p e = " C o l u m n "   E l e m e n t I d = " 5 1 2 1 3 5 9 0 9 "   D a t a T y p e = " T e x t C o n s t " > C l o s i n g T e x t < / C l o s i n g T e x t > + 
+             < G r e e t i n g T e x t   E l e m e n t T y p e = " C o l u m n "   E l e m e n t I d = " 1 1 7 5 2 7 9 2 8 9 "   D a t a T y p e = " T e x t C o n s t " > G r e e t i n g T e x t < / G r e e t i n g T e x t > + 
+             < P m t D i s c T e x t   E l e m e n t T y p e = " C o l u m n "   E l e m e n t I d = " 2 0 1 3 8 4 9 9 4 8 "   D a t a T y p e = " T e x t " > P m t D i s c T e x t < / P m t D i s c T e x t > + 
+         < / L e t t e r T e x t > + 
+         < T o t a l s   E l e m e n t T y p e = " D a t a I t e m "   E l e m e n t I d = " 1 8 2 3 9 5 0 0 4 4 " > + 
+             < C u r r e n c y C o d e   E l e m e n t T y p e = " C o l u m n "   E l e m e n t I d = " 1 5 7 9 5 9 5 9 2 1 "   D a t a T y p e = " T e x t " > C u r r e n c y C o d e < / C u r r e n c y C o d e > + 
+             < C u r r e n c y S y m b o l   E l e m e n t T y p e = " C o l u m n "   E l e m e n t I d = " 1 1 6 2 5 1 0 7 4 8 "   D a t a T y p e = " T e x t " > C u r r e n c y S y m b o l < / C u r r e n c y S y m b o l > + 
+             < T o t a l A m o u n t E x c l I n c l V A T   E l e m e n t T y p e = " C o l u m n "   E l e m e n t I d = " 5 1 4 3 3 6 1 1 4 "   D a t a T y p e = " S t r i n g " > T o t a l A m o u n t E x c l I n c l V A T < / T o t a l A m o u n t E x c l I n c l V A T > + 
+             < T o t a l A m o u n t E x c l I n c l V A T T e x t   E l e m e n t T y p e = " C o l u m n "   E l e m e n t I d = " 1 5 0 7 8 3 2 9 3 7 "   D a t a T y p e = " T e x t " > T o t a l A m o u n t E x c l I n c l V A T T e x t < / T o t a l A m o u n t E x c l I n c l V A T T e x t > + 
+             < T o t a l A m o u n t I n c l u d i n g V A T   E l e m e n t T y p e = " C o l u m n "   E l e m e n t I d = " 9 1 0 5 1 1 5 7 5 "   D a t a T y p e = " S t r i n g " > T o t a l A m o u n t I n c l u d i n g V A T < / T o t a l A m o u n t I n c l u d i n g V A T > + 
+             < T o t a l C O 2 e   E l e m e n t T y p e = " C o l u m n "   E l e m e n t I d = " 9 5 4 7 1 1 2 1 2 "   D a t a T y p e = " D e c i m a l " > T o t a l C O 2 e < / T o t a l C O 2 e > + 
+             < T o t a l E x c l u d i n g V A T T e x t   E l e m e n t T y p e = " C o l u m n "   E l e m e n t I d = " 1 9 2 2 9 4 6 3 1 0 "   D a t a T y p e = " T e x t " > T o t a l E x c l u d i n g V A T T e x t < / T o t a l E x c l u d i n g V A T T e x t > + 
+             < T o t a l I n c l u d i n g V A T T e x t   E l e m e n t T y p e = " C o l u m n "   E l e m e n t I d = " 1 2 0 4 0 1 6 3 5 2 "   D a t a T y p e = " T e x t " > T o t a l I n c l u d i n g V A T T e x t < / T o t a l I n c l u d i n g V A T T e x t > + 
+             < T o t a l I n v o i c e D i s c o u n t A m o u n t   E l e m e n t T y p e = " C o l u m n "   E l e m e n t I d = " 4 0 2 1 7 7 5 1 "   D a t a T y p e = " S t r i n g " > T o t a l I n v o i c e D i s c o u n t A m o u n t < / T o t a l I n v o i c e D i s c o u n t A m o u n t > + 
+             < T o t a l N e t A m o u n t   E l e m e n t T y p e = " C o l u m n "   E l e m e n t I d = " 4 8 3 1 9 3 3 7 2 "   D a t a T y p e = " S t r i n g " > T o t a l N e t A m o u n t < / T o t a l N e t A m o u n t > + 
+             < T o t a l P a y m e n t D i s c o u n t O n V A T   E l e m e n t T y p e = " C o l u m n "   E l e m e n t I d = " 7 3 6 0 4 1 8 8 6 "   D a t a T y p e = " D e c i m a l " > T o t a l P a y m e n t D i s c o u n t O n V A T < / T o t a l P a y m e n t D i s c o u n t O n V A T > + 
+             < T o t a l S u b T o t a l   E l e m e n t T y p e = " C o l u m n "   E l e m e n t I d = " 2 0 9 7 8 7 6 8 0 1 "   D a t a T y p e = " S t r i n g " > T o t a l S u b T o t a l < / T o t a l S u b T o t a l > + 
+             < T o t a l S u b T o t a l M i n u s I n v o i c e D i s c o u n t   E l e m e n t T y p e = " C o l u m n "   E l e m e n t I d = " 7 6 9 4 3 1 8 8 7 "   D a t a T y p e = " S t r i n g " > T o t a l S u b T o t a l M i n u s I n v o i c e D i s c o u n t < / T o t a l S u b T o t a l M i n u s I n v o i c e D i s c o u n t > + 
+             < T o t a l T e x t   E l e m e n t T y p e = " C o l u m n "   E l e m e n t I d = " 2 3 1 9 1 0 5 1 8 "   D a t a T y p e = " T e x t " > T o t a l T e x t < / T o t a l T e x t > + 
+             < T o t a l V A T A m o u n t   E l e m e n t T y p e = " C o l u m n "   E l e m e n t I d = " 1 6 2 7 1 0 2 3 2 8 "   D a t a T y p e = " S t r i n g " > T o t a l V A T A m o u n t < / T o t a l V A T A m o u n t > + 
+             < T o t a l V A T A m o u n t L C Y   E l e m e n t T y p e = " C o l u m n "   E l e m e n t I d = " 1 5 0 6 5 7 0 2 1 8 "   D a t a T y p e = " D e c i m a l " > T o t a l V A T A m o u n t L C Y < / T o t a l V A T A m o u n t L C Y > + 
+             < T o t a l V A T A m o u n t O n V A T A m t L i n e   E l e m e n t T y p e = " C o l u m n "   E l e m e n t I d = " 9 4 6 9 3 1 8 6 8 "   D a t a T y p e = " D e c i m a l " > T o t a l V A T A m o u n t O n V A T A m t L i n e < / T o t a l V A T A m o u n t O n V A T A m t L i n e > + 
+             < T o t a l V A T A m o u n t T e x t   E l e m e n t T y p e = " C o l u m n "   E l e m e n t I d = " 9 7 3 6 6 6 3 3 9 "   D a t a T y p e = " T e x t " > T o t a l V A T A m o u n t T e x t < / T o t a l V A T A m o u n t T e x t > + 
+             < T o t a l V A T B a s e L C Y   E l e m e n t T y p e = " C o l u m n "   E l e m e n t I d = " 8 3 4 4 5 0 5 2 1 "   D a t a T y p e = " D e c i m a l " > T o t a l V A T B a s e L C Y < / T o t a l V A T B a s e L C Y > + 
+             < T o t a l V A T B a s e O n V A T A m t L i n e   E l e m e n t T y p e = " C o l u m n "   E l e m e n t I d = " 1 0 6 4 7 4 6 3 9 5 "   D a t a T y p e = " D e c i m a l " > T o t a l V A T B a s e O n V A T A m t L i n e < / T o t a l V A T B a s e O n V A T A m t L i n e > + 
+         < / T o t a l s > + 
+     < / H e a d e r >   
  < / N a v W o r d R e p o r t X m l P a r t > 
 </file>
 
-<file path=customXml/item8.xml>��< ? x m l   v e r s i o n = " 1 . 0 "   e n c o d i n g = " u t f - 1 6 " ? > - 
- < N a v W o r d R e p o r t X m l P a r t   x m l n s = " u r n : m i c r o s o f t - d y n a m i c s - b u s i n e s s c e n t r a l / i n t e r n a l / e x t e n d e d / r e p o r t s / C o m p o s i t e _ L a y o u t _ D e s i g n s / 1 1 7 5 / " > +<file path=customXml/item5.xml>��< ? x m l   v e r s i o n = " 1 . 0 "   e n c o d i n g = " u t f - 1 6 " ? > < N a v W o r d R e p o r t X m l P a r t   x m l n s = " u r n : m i c r o s o f t - d y n a m i c s - n a v / r e p o r t s / S t a n d a r d _ S a l e s _ I n v o i c e / 1 3 0 6 / " >   
      < B C R e p o r t I n f o r m a t i o n >   
@@ -4920,8 +4993,6 @@
  
              < R e p o r t N a m e > R e p o r t   N a m e < / R e p o r t N a m e >   
-             < R e p o r t C a p t i o n > R e p o r t   C a p t i o n < / R e p o r t C a p t i o n > - 
              < A b o u t T h i s R e p o r t T i t l e > A b o u t   T h i s   R e p o r t   T i t l e < / A b o u t T h i s R e p o r t T i t l e >   
              < A b o u t T h i s R e p o r t T e x t > A b o u t   T h i s   R e p o r t   T e x t < / A b o u t T h i s R e p o r t T e x t > @@ -4968,92 +5039,720 @@
  
          < / R e p o r t R e q u e s t >   
-         < C o m p a n y M e t a d a t a > - 
-             < C o m p a n y N a m e > C o m p a n y   N a m e < / C o m p a n y N a m e > - 
-             < C o m p a n y D i s p l a y N a m e > C o m p a n y   D i s p l a y   N a m e < / C o m p a n y D i s p l a y N a m e > - 
-             < C o m p a n y A d d r e s s L i n e s > - 
-                 < C o m p a n y A d d r e s s L i n e 1 > C o m p a n y   A d d r e s s   L i n e   1 < / C o m p a n y A d d r e s s L i n e 1 > - 
-                 < C o m p a n y A d d r e s s L i n e 2 > C o m p a n y   A d d r e s s   L i n e   2 < / C o m p a n y A d d r e s s L i n e 2 > - 
-                 < C o m p a n y A d d r e s s L i n e 3 > C o m p a n y   A d d r e s s   L i n e   3 < / C o m p a n y A d d r e s s L i n e 3 > - 
-                 < C o m p a n y A d d r e s s L i n e 4 > C o m p a n y   A d d r e s s   L i n e   4 < / C o m p a n y A d d r e s s L i n e 4 > - 
-                 < C o m p a n y A d d r e s s L i n e 5 > C o m p a n y   A d d r e s s   L i n e   5 < / C o m p a n y A d d r e s s L i n e 5 > - 
-                 < C o m p a n y A d d r e s s L i n e 6 > C o m p a n y   A d d r e s s   L i n e   6 < / C o m p a n y A d d r e s s L i n e 6 > - 
-                 < C o m p a n y A d d r e s s L i n e 7 > C o m p a n y   A d d r e s s   L i n e   7 < / C o m p a n y A d d r e s s L i n e 7 > - 
-                 < C o m p a n y A d d r e s s L i n e 8 > C o m p a n y   A d d r e s s   L i n e   8 < / C o m p a n y A d d r e s s L i n e 8 > - 
-             < / C o m p a n y A d d r e s s L i n e s > - 
-             < C o m p a n y P h o n e > C o m p a n y   P h o n e < / C o m p a n y P h o n e > - 
-             < C o m p a n y P h o n e C a p t i o n > C o m p a n y   P h o n e   C a p t i o n < / C o m p a n y P h o n e C a p t i o n > - 
-             < C o m p a n y F a x N o > C o m p a n y   F a x   N o . < / C o m p a n y F a x N o > - 
-             < C o m p a n y F a x N o C a p t i o n > C o m p a n y   F a x   N o .   C a p t i o n < / C o m p a n y F a x N o C a p t i o n > - 
-             < C o m p a n y E m a i l > C o m p a n y   E m a i l < / C o m p a n y E m a i l > - 
-             < C o m p a n y E m a i l C a p t i o n > C o m p a n y   E m a i l   C a p t i o n < / C o m p a n y E m a i l C a p t i o n > - 
-             < C o m p a n y H o m e P a g e > C o m p a n y   H o m e   P a g e < / C o m p a n y H o m e P a g e > - 
-             < C o m p a n y H o m e P a g e C a p t i o n > C o m p a n y   H o m e   P a g e   C a p t i o n < / C o m p a n y H o m e P a g e C a p t i o n > - 
-             < C o m p a n y L o g o > C o m p a n y   L o g o < / C o m p a n y L o g o > - 
-             < C o m p a n y V A T R e g i s t r a t i o n N o > C o m p a n y   V A T   R e g i s t r a t i o n   N o . < / C o m p a n y V A T R e g i s t r a t i o n N o > - 
-             < C o m p a n y V A T R e g i s t r a t i o n N o C a p t i o n > C o m p a n y   V A T   R e g i s t r a t i o n   N o .   C a p t i o n < / C o m p a n y V A T R e g i s t r a t i o n N o C a p t i o n > - 
-             < C o m p a n y R e g i s t r a t i o n N o > C o m p a n y   R e g i s t r a t i o n   N o . < / C o m p a n y R e g i s t r a t i o n N o > - 
-             < C o m p a n y R e g i s t r a t i o n N o C a p t i o n > C o m p a n y   R e g i s t r a t i o n   N o .   C a p t i o n < / C o m p a n y R e g i s t r a t i o n N o C a p t i o n > - 
-             < C o m p a n y B a n k N a m e > C o m p a n y   B a n k   N a m e < / C o m p a n y B a n k N a m e > - 
-             < C o m p a n y B a n k N a m e C a p t i o n > C o m p a n y   B a n k   N a m e   C a p t i o n < / C o m p a n y B a n k N a m e C a p t i o n > - 
-             < C o m p a n y B a n k A c c o u n t N o > C o m p a n y   B a n k   A c c o u n t   N o . < / C o m p a n y B a n k A c c o u n t N o > - 
-             < C o m p a n y B a n k A c c o u n t N o C a p t i o n > C o m p a n y   B a n k   A c c o u n t   N o .   C a p t i o n < / C o m p a n y B a n k A c c o u n t N o C a p t i o n > - 
-             < C o m p a n y B a n k B r a n c h N o > C o m p a n y   B a n k   B r a n c h   N o . < / C o m p a n y B a n k B r a n c h N o > - 
-             < C o m p a n y B a n k B r a n c h N o C a p t i o n > C o m p a n y   B a n k   B r a n c h   N o .   C a p t i o n < / C o m p a n y B a n k B r a n c h N o C a p t i o n > - 
-             < C o m p a n y I B A N > C o m p a n y   I B A N < / C o m p a n y I B A N > - 
-             < C o m p a n y I B A N C a p t i o n > C o m p a n y   I B A N   C a p t i o n < / C o m p a n y I B A N C a p t i o n > - 
-             < C o m p a n y B a n k S W I F T > C o m p a n y   B a n k   S W I F T < / C o m p a n y B a n k S W I F T > - 
-             < C o m p a n y B a n k S W I F T C a p t i o n > C o m p a n y   B a n k   S W I F T   C a p t i o n < / C o m p a n y B a n k S W I F T C a p t i o n > - 
-             < C o m p a n y G i r o N o > C o m p a n y   G i r o   N o . < / C o m p a n y G i r o N o > - 
-             < C o m p a n y G i r o N o C a p t i o n > C o m p a n y   G i r o   N o .   C a p t i o n < / C o m p a n y G i r o N o C a p t i o n > - 
-         < / C o m p a n y M e t a d a t a > - 
      < / B C R e p o r t I n f o r m a t i o n >   
-     < T o o l t i p s   / > +     < H e a d e r > + 
+         < B i l l e d T o _ L b l > B i l l e d T o _ L b l < / B i l l e d T o _ L b l > + 
+         < B i l l T o C o n t a c t E m a i l > B i l l T o C o n t a c t E m a i l < / B i l l T o C o n t a c t E m a i l > + 
+         < B i l l T o C o n t a c t E m a i l L b l > B i l l T o C o n t a c t E m a i l L b l < / B i l l T o C o n t a c t E m a i l L b l > + 
+         < B i l l T o C o n t a c t M o b i l e P h o n e N o > B i l l T o C o n t a c t M o b i l e P h o n e N o < / B i l l T o C o n t a c t M o b i l e P h o n e N o > + 
+         < B i l l T o C o n t a c t M o b i l e P h o n e N o L b l > B i l l T o C o n t a c t M o b i l e P h o n e N o L b l < / B i l l T o C o n t a c t M o b i l e P h o n e N o L b l > + 
+         < B i l l T o C o n t a c t P h o n e N o > B i l l T o C o n t a c t P h o n e N o < / B i l l T o C o n t a c t P h o n e N o > + 
+         < B i l l T o C o n t a c t P h o n e N o L b l > B i l l T o C o n t a c t P h o n e N o L b l < / B i l l T o C o n t a c t P h o n e N o L b l > + 
+         < B i l l t o C u s t o m e r N o _ L b l > B i l l t o C u s t o m e r N o _ L b l < / B i l l t o C u s t o m e r N o _ L b l > + 
+         < B i l l t o C u s t u m e r N o > B i l l t o C u s t u m e r N o < / B i l l t o C u s t u m e r N o > + 
+         < C h e c k s P a y a b l e _ L b l > C h e c k s P a y a b l e _ L b l < / C h e c k s P a y a b l e _ L b l > + 
+         < C O 2 e P e r U n i t _ L b l > C O 2 e P e r U n i t _ L b l < / C O 2 e P e r U n i t _ L b l > + 
+         < C o m p a n y A d d r e s s 1 > C o m p a n y A d d r e s s 1 < / C o m p a n y A d d r e s s 1 > + 
+         < C o m p a n y A d d r e s s 2 > C o m p a n y A d d r e s s 2 < / C o m p a n y A d d r e s s 2 > + 
+         < C o m p a n y A d d r e s s 3 > C o m p a n y A d d r e s s 3 < / C o m p a n y A d d r e s s 3 > + 
+         < C o m p a n y A d d r e s s 4 > C o m p a n y A d d r e s s 4 < / C o m p a n y A d d r e s s 4 > + 
+         < C o m p a n y A d d r e s s 5 > C o m p a n y A d d r e s s 5 < / C o m p a n y A d d r e s s 5 > + 
+         < C o m p a n y A d d r e s s 6 > C o m p a n y A d d r e s s 6 < / C o m p a n y A d d r e s s 6 > + 
+         < C o m p a n y A d d r e s s 7 > C o m p a n y A d d r e s s 7 < / C o m p a n y A d d r e s s 7 > + 
+         < C o m p a n y A d d r e s s 8 > C o m p a n y A d d r e s s 8 < / C o m p a n y A d d r e s s 8 > + 
+         < C o m p a n y B a n k A c c o u n t N o > C o m p a n y B a n k A c c o u n t N o < / C o m p a n y B a n k A c c o u n t N o > + 
+         < C o m p a n y B a n k A c c o u n t N o _ L b l > C o m p a n y B a n k A c c o u n t N o _ L b l < / C o m p a n y B a n k A c c o u n t N o _ L b l > + 
+         < C o m p a n y B a n k B r a n c h N o > C o m p a n y B a n k B r a n c h N o < / C o m p a n y B a n k B r a n c h N o > + 
+         < C o m p a n y B a n k B r a n c h N o _ L b l > C o m p a n y B a n k B r a n c h N o _ L b l < / C o m p a n y B a n k B r a n c h N o _ L b l > + 
+         < C o m p a n y B a n k N a m e > C o m p a n y B a n k N a m e < / C o m p a n y B a n k N a m e > + 
+         < C o m p a n y B a n k N a m e _ L b l > C o m p a n y B a n k N a m e _ L b l < / C o m p a n y B a n k N a m e _ L b l > + 
+         < C o m p a n y C u s t o m G i r o > C o m p a n y C u s t o m G i r o < / C o m p a n y C u s t o m G i r o > + 
+         < C o m p a n y C u s t o m G i r o _ L b l > C o m p a n y C u s t o m G i r o _ L b l < / C o m p a n y C u s t o m G i r o _ L b l > + 
+         < C o m p a n y E M a i l > C o m p a n y E M a i l < / C o m p a n y E M a i l > + 
+         < C o m p a n y G i r o N o > C o m p a n y G i r o N o < / C o m p a n y G i r o N o > + 
+         < C o m p a n y G i r o N o _ L b l > C o m p a n y G i r o N o _ L b l < / C o m p a n y G i r o N o _ L b l > + 
+         < C o m p a n y H o m e P a g e > C o m p a n y H o m e P a g e < / C o m p a n y H o m e P a g e > + 
+         < C o m p a n y I B A N > C o m p a n y I B A N < / C o m p a n y I B A N > + 
+         < C o m p a n y I B A N _ L b l > C o m p a n y I B A N _ L b l < / C o m p a n y I B A N _ L b l > + 
+         < C o m p a n y L e g a l O f f i c e > C o m p a n y L e g a l O f f i c e < / C o m p a n y L e g a l O f f i c e > + 
+         < C o m p a n y L e g a l O f f i c e _ L b l > C o m p a n y L e g a l O f f i c e _ L b l < / C o m p a n y L e g a l O f f i c e _ L b l > + 
+         < C o m p a n y L e g a l S t a t e m e n t > C o m p a n y L e g a l S t a t e m e n t < / C o m p a n y L e g a l S t a t e m e n t > + 
+         < C o m p a n y L o g o P o s i t i o n > C o m p a n y L o g o P o s i t i o n < / C o m p a n y L o g o P o s i t i o n > + 
+         < C o m p a n y P h o n e N o > C o m p a n y P h o n e N o < / C o m p a n y P h o n e N o > + 
+         < C o m p a n y P h o n e N o _ L b l > C o m p a n y P h o n e N o _ L b l < / C o m p a n y P h o n e N o _ L b l > + 
+         < C o m p a n y P i c t u r e / > + 
+         < C o m p a n y R e g i s t r a t i o n N u m b e r > C o m p a n y R e g i s t r a t i o n N u m b e r < / C o m p a n y R e g i s t r a t i o n N u m b e r > + 
+         < C o m p a n y R e g i s t r a t i o n N u m b e r _ L b l > C o m p a n y R e g i s t r a t i o n N u m b e r _ L b l < / C o m p a n y R e g i s t r a t i o n N u m b e r _ L b l > + 
+         < C o m p a n y S W I F T > C o m p a n y S W I F T < / C o m p a n y S W I F T > + 
+         < C o m p a n y S W I F T _ L b l > C o m p a n y S W I F T _ L b l < / C o m p a n y S W I F T _ L b l > + 
+         < C o m p a n y V A T R e g i s t r a t i o n N o > C o m p a n y V A T R e g i s t r a t i o n N o < / C o m p a n y V A T R e g i s t r a t i o n N o > + 
+         < C o m p a n y V A T R e g i s t r a t i o n N o _ L b l > C o m p a n y V A T R e g i s t r a t i o n N o _ L b l < / C o m p a n y V A T R e g i s t r a t i o n N o _ L b l > + 
+         < C o m p a n y V A T R e g N o > C o m p a n y V A T R e g N o < / C o m p a n y V A T R e g N o > + 
+         < C o m p a n y V A T R e g N o _ L b l > C o m p a n y V A T R e g N o _ L b l < / C o m p a n y V A T R e g N o _ L b l > + 
+         < C o n t a c t _ L b l > C o n t a c t _ L b l < / C o n t a c t _ L b l > + 
+         < C o p y _ L b l > C o p y _ L b l < / C o p y _ L b l > + 
+         < C u s t o m e r A d d r e s s 1 > C u s t o m e r A d d r e s s 1 < / C u s t o m e r A d d r e s s 1 > + 
+         < C u s t o m e r A d d r e s s 2 > C u s t o m e r A d d r e s s 2 < / C u s t o m e r A d d r e s s 2 > + 
+         < C u s t o m e r A d d r e s s 3 > C u s t o m e r A d d r e s s 3 < / C u s t o m e r A d d r e s s 3 > + 
+         < C u s t o m e r A d d r e s s 4 > C u s t o m e r A d d r e s s 4 < / C u s t o m e r A d d r e s s 4 > + 
+         < C u s t o m e r A d d r e s s 5 > C u s t o m e r A d d r e s s 5 < / C u s t o m e r A d d r e s s 5 > + 
+         < C u s t o m e r A d d r e s s 6 > C u s t o m e r A d d r e s s 6 < / C u s t o m e r A d d r e s s 6 > + 
+         < C u s t o m e r A d d r e s s 7 > C u s t o m e r A d d r e s s 7 < / C u s t o m e r A d d r e s s 7 > + 
+         < C u s t o m e r A d d r e s s 8 > C u s t o m e r A d d r e s s 8 < / C u s t o m e r A d d r e s s 8 > + 
+         < C u s t o m e r P o s t a l B a r C o d e > C u s t o m e r P o s t a l B a r C o d e < / C u s t o m e r P o s t a l B a r C o d e > + 
+         < D i s c l a i m e r _ L b l > D i s c l a i m e r _ L b l < / D i s c l a i m e r _ L b l > + 
+         < D i s p l a y A d d i t i o n a l F e e N o t e > D i s p l a y A d d i t i o n a l F e e N o t e < / D i s p l a y A d d i t i o n a l F e e N o t e > + 
+         < D o c u m e n t D a t e > D o c u m e n t D a t e < / D o c u m e n t D a t e > + 
+         < D o c u m e n t D a t e _ L b l > D o c u m e n t D a t e _ L b l < / D o c u m e n t D a t e _ L b l > + 
+         < D o c u m e n t N o > D o c u m e n t N o < / D o c u m e n t N o > + 
+         < D o c u m e n t N o _ L b l > D o c u m e n t N o _ L b l < / D o c u m e n t N o _ L b l > + 
+         < D o c u m e n t T i t l e _ L b l > D o c u m e n t T i t l e _ L b l < / D o c u m e n t T i t l e _ L b l > + 
+         < D u e D a t e > D u e D a t e < / D u e D a t e > + 
+         < D u e D a t e _ L b l > D u e D a t e _ L b l < / D u e D a t e _ L b l > + 
+         < E M a i l _ H e a d e r _ L b l > E M a i l _ H e a d e r _ L b l < / E M a i l _ H e a d e r _ L b l > + 
+         < E x c h a n g e R a t e A s T e x t > E x c h a n g e R a t e A s T e x t < / E x c h a n g e R a t e A s T e x t > + 
+         < E x t e r n a l D o c u m e n t N o > E x t e r n a l D o c u m e n t N o < / E x t e r n a l D o c u m e n t N o > + 
+         < E x t e r n a l D o c u m e n t N o _ L b l > E x t e r n a l D o c u m e n t N o _ L b l < / E x t e r n a l D o c u m e n t N o _ L b l > + 
+         < F r o m _ L b l > F r o m _ L b l < / F r o m _ L b l > + 
+         < G l o b a l L o c a t i o n N u m b e r > G l o b a l L o c a t i o n N u m b e r < / G l o b a l L o c a t i o n N u m b e r > + 
+         < G l o b a l L o c a t i o n N u m b e r _ L b l > G l o b a l L o c a t i o n N u m b e r _ L b l < / G l o b a l L o c a t i o n N u m b e r _ L b l > + 
+         < H o m e P a g e _ H e a d e r _ L b l > H o m e P a g e _ H e a d e r _ L b l < / H o m e P a g e _ H e a d e r _ L b l > + 
+         < I n v o i c e D i s c o u n t A m o u n t _ L b l > I n v o i c e D i s c o u n t A m o u n t _ L b l < / I n v o i c e D i s c o u n t A m o u n t _ L b l > + 
+         < I n v o i c e D i s c o u n t B a s e A m o u n t _ L b l > I n v o i c e D i s c o u n t B a s e A m o u n t _ L b l < / I n v o i c e D i s c o u n t B a s e A m o u n t _ L b l > + 
+         < L e g a l E n t i t y T y p e > L e g a l E n t i t y T y p e < / L e g a l E n t i t y T y p e > + 
+         < L e g a l E n t i t y T y p e _ L b l > L e g a l E n t i t y T y p e _ L b l < / L e g a l E n t i t y T y p e _ L b l > + 
+         < L i n e A m o u n t A f t e r I n v o i c e D i s c o u n t _ L b l > L i n e A m o u n t A f t e r I n v o i c e D i s c o u n t _ L b l < / L i n e A m o u n t A f t e r I n v o i c e D i s c o u n t _ L b l > + 
+         < L o c a l C u r r e n c y _ L b l > L o c a l C u r r e n c y _ L b l < / L o c a l C u r r e n c y _ L b l > + 
+         < O r d e r N o > O r d e r N o < / O r d e r N o > + 
+         < O r d e r N o _ L b l > O r d e r N o _ L b l < / O r d e r N o _ L b l > + 
+         < P a c k a g e T r a c k i n g N o > P a c k a g e T r a c k i n g N o < / P a c k a g e T r a c k i n g N o > + 
+         < P a c k a g e T r a c k i n g N o _ L b l > P a c k a g e T r a c k i n g N o _ L b l < / P a c k a g e T r a c k i n g N o _ L b l > + 
+         < P a g e _ L b l > P a g e _ L b l < / P a g e _ L b l > + 
+         < P a y m e n t I n s t r u c t i o n s _ T x t > P a y m e n t I n s t r u c t i o n s _ T x t < / P a y m e n t I n s t r u c t i o n s _ T x t > + 
+         < P a y m e n t M e t h o d D e s c r i p t i o n > P a y m e n t M e t h o d D e s c r i p t i o n < / P a y m e n t M e t h o d D e s c r i p t i o n > + 
+         < P a y m e n t M e t h o d D e s c r i p t i o n _ L b l > P a y m e n t M e t h o d D e s c r i p t i o n _ L b l < / P a y m e n t M e t h o d D e s c r i p t i o n _ L b l > + 
+         < P a y m e n t R e f e r e n c e > P a y m e n t R e f e r e n c e < / P a y m e n t R e f e r e n c e > + 
+         < P a y m e n t R e f e r e n c e _ L b l > P a y m e n t R e f e r e n c e _ L b l < / P a y m e n t R e f e r e n c e _ L b l > + 
+         < P a y m e n t T e r m s D e s c r i p t i o n > P a y m e n t T e r m s D e s c r i p t i o n < / P a y m e n t T e r m s D e s c r i p t i o n > + 
+         < P a y m e n t T e r m s D e s c r i p t i o n _ L b l > P a y m e n t T e r m s D e s c r i p t i o n _ L b l < / P a y m e n t T e r m s D e s c r i p t i o n _ L b l > + 
+         < P r i c e s I n c l u d i n g V A T > P r i c e s I n c l u d i n g V A T < / P r i c e s I n c l u d i n g V A T > + 
+         < P r i c e s I n c l u d i n g V A T _ L b l > P r i c e s I n c l u d i n g V A T _ L b l < / P r i c e s I n c l u d i n g V A T _ L b l > + 
+         < P r i c e s I n c l u d i n g V A T Y e s N o > P r i c e s I n c l u d i n g V A T Y e s N o < / P r i c e s I n c l u d i n g V A T Y e s N o > + 
+         < Q R _ C o d e _ I m a g e > Q R _ C o d e _ I m a g e < / Q R _ C o d e _ I m a g e > + 
+         < Q R _ C o d e _ I m a g e _ L b l > Q R _ C o d e _ I m a g e _ L b l < / Q R _ C o d e _ I m a g e _ L b l > + 
+         < Q u e s t i o n s _ L b l > Q u e s t i o n s _ L b l < / Q u e s t i o n s _ L b l > + 
+         < R e c u r r i n g B i l l i n g > R e c u r r i n g B i l l i n g < / R e c u r r i n g B i l l i n g > + 
+         < R e m a i n i n g A m o u n t > R e m a i n i n g A m o u n t < / R e m a i n i n g A m o u n t > + 
+         < R e m a i n i n g A m o u n t T e x t > R e m a i n i n g A m o u n t T e x t < / R e m a i n i n g A m o u n t T e x t > + 
+         < S a l e s I n v o i c e L i n e D i s c o u n t _ L b l > S a l e s I n v o i c e L i n e D i s c o u n t _ L b l < / S a l e s I n v o i c e L i n e D i s c o u n t _ L b l > + 
+         < S a l e s P e r s o n _ L b l > S a l e s P e r s o n _ L b l < / S a l e s P e r s o n _ L b l > + 
+         < S a l e s P e r s o n B l a n k _ L b l > S a l e s P e r s o n B l a n k _ L b l < / S a l e s P e r s o n B l a n k _ L b l > + 
+         < S a l e s P e r s o n N a m e > S a l e s P e r s o n N a m e < / S a l e s P e r s o n N a m e > + 
+         < S e l l T o C o n t a c t E m a i l > S e l l T o C o n t a c t E m a i l < / S e l l T o C o n t a c t E m a i l > + 
+         < S e l l T o C o n t a c t E m a i l L b l > S e l l T o C o n t a c t E m a i l L b l < / S e l l T o C o n t a c t E m a i l L b l > + 
+         < S e l l T o C o n t a c t M o b i l e P h o n e N o > S e l l T o C o n t a c t M o b i l e P h o n e N o < / S e l l T o C o n t a c t M o b i l e P h o n e N o > + 
+         < S e l l T o C o n t a c t M o b i l e P h o n e N o L b l > S e l l T o C o n t a c t M o b i l e P h o n e N o L b l < / S e l l T o C o n t a c t M o b i l e P h o n e N o L b l > + 
+         < S e l l T o C o n t a c t P h o n e N o > S e l l T o C o n t a c t P h o n e N o < / S e l l T o C o n t a c t P h o n e N o > + 
+         < S e l l T o C o n t a c t P h o n e N o L b l > S e l l T o C o n t a c t P h o n e N o L b l < / S e l l T o C o n t a c t P h o n e N o L b l > + 
+         < S e l l t o C u s t o m e r N o > S e l l t o C u s t o m e r N o < / S e l l t o C u s t o m e r N o > + 
+         < S e l l t o C u s t o m e r N o _ L b l > S e l l t o C u s t o m e r N o _ L b l < / S e l l t o C u s t o m e r N o _ L b l > + 
+         < S e l l T o F a x N o > S e l l T o F a x N o < / S e l l T o F a x N o > + 
+         < S e l l T o P h o n e N o > S e l l T o P h o n e N o < / S e l l T o P h o n e N o > + 
+         < S h i p m e n t _ L b l > S h i p m e n t _ L b l < / S h i p m e n t _ L b l > + 
+         < S h i p m e n t D a t e > S h i p m e n t D a t e < / S h i p m e n t D a t e > + 
+         < S h i p m e n t D a t e _ L b l > S h i p m e n t D a t e _ L b l < / S h i p m e n t D a t e _ L b l > + 
+         < S h i p m e n t M e t h o d D e s c r i p t i o n > S h i p m e n t M e t h o d D e s c r i p t i o n < / S h i p m e n t M e t h o d D e s c r i p t i o n > + 
+         < S h i p m e n t M e t h o d D e s c r i p t i o n _ L b l > S h i p m e n t M e t h o d D e s c r i p t i o n _ L b l < / S h i p m e n t M e t h o d D e s c r i p t i o n _ L b l > + 
+         < S h i p p i n g A g e n t C o d e > S h i p p i n g A g e n t C o d e < / S h i p p i n g A g e n t C o d e > + 
+         < S h i p p i n g A g e n t C o d e _ L b l > S h i p p i n g A g e n t C o d e _ L b l < / S h i p p i n g A g e n t C o d e _ L b l > + 
+         < S h i p T o A d d r e s s _ L b l > S h i p T o A d d r e s s _ L b l < / S h i p T o A d d r e s s _ L b l > + 
+         < S h i p T o A d d r e s s 1 > S h i p T o A d d r e s s 1 < / S h i p T o A d d r e s s 1 > + 
+         < S h i p T o A d d r e s s 2 > S h i p T o A d d r e s s 2 < / S h i p T o A d d r e s s 2 > + 
+         < S h i p T o A d d r e s s 3 > S h i p T o A d d r e s s 3 < / S h i p T o A d d r e s s 3 > + 
+         < S h i p T o A d d r e s s 4 > S h i p T o A d d r e s s 4 < / S h i p T o A d d r e s s 4 > + 
+         < S h i p T o A d d r e s s 5 > S h i p T o A d d r e s s 5 < / S h i p T o A d d r e s s 5 > + 
+         < S h i p T o A d d r e s s 6 > S h i p T o A d d r e s s 6 < / S h i p T o A d d r e s s 6 > + 
+         < S h i p T o A d d r e s s 7 > S h i p T o A d d r e s s 7 < / S h i p T o A d d r e s s 7 > + 
+         < S h i p T o A d d r e s s 8 > S h i p T o A d d r e s s 8 < / S h i p T o A d d r e s s 8 > + 
+         < S h i p T o P h o n e N o > S h i p T o P h o n e N o < / S h i p T o P h o n e N o > + 
+         < S h o w S h i p p i n g A d d r e s s > S h o w S h i p p i n g A d d r e s s < / S h o w S h i p p i n g A d d r e s s > + 
+         < S h o w W o r k D e s c r i p t i o n > S h o w W o r k D e s c r i p t i o n < / S h o w W o r k D e s c r i p t i o n > + 
+         < S u b t o t a l _ L b l > S u b t o t a l _ L b l < / S u b t o t a l _ L b l > + 
+         < T h a n k s _ L b l > T h a n k s _ L b l < / T h a n k s _ L b l > + 
+         < T o t a l _ L b l > T o t a l _ L b l < / T o t a l _ L b l > + 
+         < T o t a l C O 2 e _ L b l > T o t a l C O 2 e _ L b l < / T o t a l C O 2 e _ L b l > + 
+         < V A T A m o u n t _ L b l > V A T A m o u n t _ L b l < / V A T A m o u n t _ L b l > + 
+         < V A T A m o u n t S p e c i f i c a t i o n _ L b l > V A T A m o u n t S p e c i f i c a t i o n _ L b l < / V A T A m o u n t S p e c i f i c a t i o n _ L b l > + 
+         < V A T B a s e _ L b l > V A T B a s e _ L b l < / V A T B a s e _ L b l > + 
+         < V A T C l a u s e _ L b l > V A T C l a u s e _ L b l < / V A T C l a u s e _ L b l > + 
+         < V A T C l a u s e s _ L b l > V A T C l a u s e s _ L b l < / V A T C l a u s e s _ L b l > + 
+         < V A T I d e n t i f i e r _ L b l > V A T I d e n t i f i e r _ L b l < / V A T I d e n t i f i e r _ L b l > + 
+         < V A T P e r c e n t a g e _ L b l > V A T P e r c e n t a g e _ L b l < / V A T P e r c e n t a g e _ L b l > + 
+         < V A T R e g i s t r a t i o n N o > V A T R e g i s t r a t i o n N o < / V A T R e g i s t r a t i o n N o > + 
+         < V A T R e g i s t r a t i o n N o _ L b l > V A T R e g i s t r a t i o n N o _ L b l < / V A T R e g i s t r a t i o n N o _ L b l > + 
+         < Y o u r D o c u m e n t T i t l e _ L b l > Y o u r D o c u m e n t T i t l e _ L b l < / Y o u r D o c u m e n t T i t l e _ L b l > + 
+         < Y o u r R e f e r e n c e > Y o u r R e f e r e n c e < / Y o u r R e f e r e n c e > + 
+         < Y o u r R e f e r e n c e _ L b l > Y o u r R e f e r e n c e _ L b l < / Y o u r R e f e r e n c e _ L b l > + 
+         < L i n e > + 
+             < A m o u n t E x c l u d i n g V A T _ L i n e > A m o u n t E x c l u d i n g V A T _ L i n e < / A m o u n t E x c l u d i n g V A T _ L i n e > + 
+             < A m o u n t E x c l u d i n g V A T _ L i n e _ L b l > A m o u n t E x c l u d i n g V A T _ L i n e _ L b l < / A m o u n t E x c l u d i n g V A T _ L i n e _ L b l > + 
+             < A m o u n t I n c l u d i n g V A T _ L i n e > A m o u n t I n c l u d i n g V A T _ L i n e < / A m o u n t I n c l u d i n g V A T _ L i n e > + 
+             < A m o u n t I n c l u d i n g V A T _ L i n e _ L b l > A m o u n t I n c l u d i n g V A T _ L i n e _ L b l < / A m o u n t I n c l u d i n g V A T _ L i n e _ L b l > + 
+             < C O 2 e P e r U n i t _ L i n e > C O 2 e P e r U n i t _ L i n e < / C O 2 e P e r U n i t _ L i n e > + 
+             < C o n t r a c t L i n e N o > C o n t r a c t L i n e N o < / C o n t r a c t L i n e N o > + 
+             < C o n t r a c t N o > C o n t r a c t N o < / C o n t r a c t N o > + 
+             < D e s c r i p t i o n _ L i n e > D e s c r i p t i o n _ L i n e < / D e s c r i p t i o n _ L i n e > + 
+             < D e s c r i p t i o n _ L i n e _ L b l > D e s c r i p t i o n _ L i n e _ L b l < / D e s c r i p t i o n _ L i n e _ L b l > + 
+             < I t e m N o _ L i n e > I t e m N o _ L i n e < / I t e m N o _ L i n e > + 
+             < I t e m N o _ L i n e _ L b l > I t e m N o _ L i n e _ L b l < / I t e m N o _ L i n e _ L b l > + 
+             < I t e m R e f e r e n c e N o _ L i n e > I t e m R e f e r e n c e N o _ L i n e < / I t e m R e f e r e n c e N o _ L i n e > + 
+             < I t e m R e f e r e n c e N o _ L i n e _ L b l > I t e m R e f e r e n c e N o _ L i n e _ L b l < / I t e m R e f e r e n c e N o _ L i n e _ L b l > + 
+             < J o b N o > J o b N o < / J o b N o > + 
+             < J o b N o _ L b l > J o b N o _ L b l < / J o b N o _ L b l > + 
+             < J o b T a s k D e s c _ L b l > J o b T a s k D e s c _ L b l < / J o b T a s k D e s c _ L b l > + 
+             < J o b T a s k D e s c r i p t i o n > J o b T a s k D e s c r i p t i o n < / J o b T a s k D e s c r i p t i o n > + 
+             < J o b T a s k N o > J o b T a s k N o < / J o b T a s k N o > + 
+             < J o b T a s k N o _ L b l > J o b T a s k N o _ L b l < / J o b T a s k N o _ L b l > + 
+             < L i n e A m o u n t _ L i n e > L i n e A m o u n t _ L i n e < / L i n e A m o u n t _ L i n e > + 
+             < L i n e A m o u n t _ L i n e _ L b l > L i n e A m o u n t _ L i n e _ L b l < / L i n e A m o u n t _ L i n e _ L b l > + 
+             < L i n e D i s c o u n t P e r c e n t _ L i n e > L i n e D i s c o u n t P e r c e n t _ L i n e < / L i n e D i s c o u n t P e r c e n t _ L i n e > + 
+             < L i n e D i s c o u n t P e r c e n t T e x t _ L i n e > L i n e D i s c o u n t P e r c e n t T e x t _ L i n e < / L i n e D i s c o u n t P e r c e n t T e x t _ L i n e > + 
+             < L i n e N o _ L i n e > L i n e N o _ L i n e < / L i n e N o _ L i n e > + 
+             < P r i c e _ L b l > P r i c e _ L b l < / P r i c e _ L b l > + 
+             < P r i c e P e r _ L b l > P r i c e P e r _ L b l < / P r i c e P e r _ L b l > + 
+             < Q t y _ L b l > Q t y _ L b l < / Q t y _ L b l > + 
+             < Q u a n t i t y _ L i n e > Q u a n t i t y _ L i n e < / Q u a n t i t y _ L i n e > + 
+             < Q u a n t i t y _ L i n e _ L b l > Q u a n t i t y _ L i n e _ L b l < / Q u a n t i t y _ L i n e _ L b l > + 
+             < R e c u r r i n g B i l l i n g f r o m > R e c u r r i n g B i l l i n g f r o m < / R e c u r r i n g B i l l i n g f r o m > + 
+             < R e c u r r i n g B i l l i n g t o > R e c u r r i n g B i l l i n g t o < / R e c u r r i n g B i l l i n g t o > + 
+             < S h i p m e n t D a t e _ L i n e > S h i p m e n t D a t e _ L i n e < / S h i p m e n t D a t e _ L i n e > + 
+             < S h i p m e n t D a t e _ L i n e _ L b l > S h i p m e n t D a t e _ L i n e _ L b l < / S h i p m e n t D a t e _ L i n e _ L b l > + 
+             < T r a n s H e a d e r A m o u n t > T r a n s H e a d e r A m o u n t < / T r a n s H e a d e r A m o u n t > + 
+             < T y p e _ L i n e > T y p e _ L i n e < / T y p e _ L i n e > + 
+             < U n i t _ L b l > U n i t _ L b l < / U n i t _ L b l > + 
+             < U n i t O f M e a s u r e > U n i t O f M e a s u r e < / U n i t O f M e a s u r e > + 
+             < U n i t O f M e a s u r e _ L b l > U n i t O f M e a s u r e _ L b l < / U n i t O f M e a s u r e _ L b l > + 
+             < U n i t P r i c e > U n i t P r i c e < / U n i t P r i c e > + 
+             < U n i t P r i c e _ L b l > U n i t P r i c e _ L b l < / U n i t P r i c e _ L b l > + 
+             < V A T I d e n t i f i e r _ L i n e > V A T I d e n t i f i e r _ L i n e < / V A T I d e n t i f i e r _ L i n e > + 
+             < V A T I d e n t i f i e r _ L i n e _ L b l > V A T I d e n t i f i e r _ L i n e _ L b l < / V A T I d e n t i f i e r _ L i n e _ L b l > + 
+             < V A T P c t _ L i n e > V A T P c t _ L i n e < / V A T P c t _ L i n e > + 
+             < V A T P c t _ L i n e _ L b l > V A T P c t _ L i n e _ L b l < / V A T P c t _ L i n e _ L b l > + 
+             < S h i p m e n t L i n e > + 
+                 < D o c u m e n t N o _ S h i p m e n t L i n e > D o c u m e n t N o _ S h i p m e n t L i n e < / D o c u m e n t N o _ S h i p m e n t L i n e > + 
+                 < P o s t i n g D a t e _ S h i p m e n t L i n e > P o s t i n g D a t e _ S h i p m e n t L i n e < / P o s t i n g D a t e _ S h i p m e n t L i n e > + 
+                 < P o s t i n g D a t e _ S h i p m e n t L i n e _ L b l > P o s t i n g D a t e _ S h i p m e n t L i n e _ L b l < / P o s t i n g D a t e _ S h i p m e n t L i n e _ L b l > + 
+                 < Q u a n t i t y _ S h i p m e n t L i n e > Q u a n t i t y _ S h i p m e n t L i n e < / Q u a n t i t y _ S h i p m e n t L i n e > + 
+                 < Q u a n t i t y _ S h i p m e n t L i n e _ L b l > Q u a n t i t y _ S h i p m e n t L i n e _ L b l < / Q u a n t i t y _ S h i p m e n t L i n e _ L b l > + 
+             < / S h i p m e n t L i n e > + 
+             < A s s e m b l y L i n e > + 
+                 < D e s c r i p t i o n _ A s s e m b l y L i n e > D e s c r i p t i o n _ A s s e m b l y L i n e < / D e s c r i p t i o n _ A s s e m b l y L i n e > + 
+                 < L i n e N o _ A s s e m b l y L i n e > L i n e N o _ A s s e m b l y L i n e < / L i n e N o _ A s s e m b l y L i n e > + 
+                 < Q u a n t i t y _ A s s e m b l y L i n e > Q u a n t i t y _ A s s e m b l y L i n e < / Q u a n t i t y _ A s s e m b l y L i n e > + 
+                 < U n i t O f M e a s u r e _ A s s e m b l y L i n e > U n i t O f M e a s u r e _ A s s e m b l y L i n e < / U n i t O f M e a s u r e _ A s s e m b l y L i n e > + 
+                 < V a r i a n t C o d e _ A s s e m b l y L i n e > V a r i a n t C o d e _ A s s e m b l y L i n e < / V a r i a n t C o d e _ A s s e m b l y L i n e > + 
+             < / A s s e m b l y L i n e > + 
+         < / L i n e > + 
+         < W o r k D e s c r i p t i o n L i n e s > + 
+             < W o r k D e s c r i p t i o n L i n e > W o r k D e s c r i p t i o n L i n e < / W o r k D e s c r i p t i o n L i n e > + 
+             < W o r k D e s c r i p t i o n L i n e N u m b e r > W o r k D e s c r i p t i o n L i n e N u m b e r < / W o r k D e s c r i p t i o n L i n e N u m b e r > + 
+         < / W o r k D e s c r i p t i o n L i n e s > + 
+         < V A T A m o u n t L i n e > + 
+             < I n v o i c e D i s c o u n t A m o u n t _ V A T A m o u n t L i n e > I n v o i c e D i s c o u n t A m o u n t _ V A T A m o u n t L i n e < / I n v o i c e D i s c o u n t A m o u n t _ V A T A m o u n t L i n e > + 
+             < I n v o i c e D i s c o u n t A m o u n t _ V A T A m o u n t L i n e _ L b l > I n v o i c e D i s c o u n t A m o u n t _ V A T A m o u n t L i n e _ L b l < / I n v o i c e D i s c o u n t A m o u n t _ V A T A m o u n t L i n e _ L b l > + 
+             < I n v o i c e D i s c o u n t B a s e A m o u n t _ V A T A m o u n t L i n e > I n v o i c e D i s c o u n t B a s e A m o u n t _ V A T A m o u n t L i n e < / I n v o i c e D i s c o u n t B a s e A m o u n t _ V A T A m o u n t L i n e > + 
+             < I n v o i c e D i s c o u n t B a s e A m o u n t _ V A T A m o u n t L i n e _ L b l > I n v o i c e D i s c o u n t B a s e A m o u n t _ V A T A m o u n t L i n e _ L b l < / I n v o i c e D i s c o u n t B a s e A m o u n t _ V A T A m o u n t L i n e _ L b l > + 
+             < L i n e A m o u n t _ V a t A m o u n t L i n e > L i n e A m o u n t _ V a t A m o u n t L i n e < / L i n e A m o u n t _ V a t A m o u n t L i n e > + 
+             < L i n e A m o u n t _ V a t A m o u n t L i n e _ L b l > L i n e A m o u n t _ V a t A m o u n t L i n e _ L b l < / L i n e A m o u n t _ V a t A m o u n t L i n e _ L b l > + 
+             < N o O f V A T I d e n t i f i e r s > N o O f V A T I d e n t i f i e r s < / N o O f V A T I d e n t i f i e r s > + 
+             < V A T A m o u n t _ V a t A m o u n t L i n e > V A T A m o u n t _ V a t A m o u n t L i n e < / V A T A m o u n t _ V a t A m o u n t L i n e > + 
+             < V A T A m o u n t _ V a t A m o u n t L i n e _ L b l > V A T A m o u n t _ V a t A m o u n t L i n e _ L b l < / V A T A m o u n t _ V a t A m o u n t L i n e _ L b l > + 
+             < V A T A m o u n t L C Y _ V A T A m o u n t L i n e > V A T A m o u n t L C Y _ V A T A m o u n t L i n e < / V A T A m o u n t L C Y _ V A T A m o u n t L i n e > + 
+             < V A T A m o u n t L C Y _ V A T A m o u n t L i n e _ L b l > V A T A m o u n t L C Y _ V A T A m o u n t L i n e _ L b l < / V A T A m o u n t L C Y _ V A T A m o u n t L i n e _ L b l > + 
+             < V A T B a s e _ V a t A m o u n t L i n e > V A T B a s e _ V a t A m o u n t L i n e < / V A T B a s e _ V a t A m o u n t L i n e > + 
+             < V A T B a s e _ V a t A m o u n t L i n e _ L b l > V A T B a s e _ V a t A m o u n t L i n e _ L b l < / V A T B a s e _ V a t A m o u n t L i n e _ L b l > + 
+             < V A T B a s e L C Y _ V A T A m o u n t L i n e > V A T B a s e L C Y _ V A T A m o u n t L i n e < / V A T B a s e L C Y _ V A T A m o u n t L i n e > + 
+             < V A T B a s e L C Y _ V A T A m o u n t L i n e _ L b l > V A T B a s e L C Y _ V A T A m o u n t L i n e _ L b l < / V A T B a s e L C Y _ V A T A m o u n t L i n e _ L b l > + 
+             < V A T I d e n t i f i e r _ V a t A m o u n t L i n e > V A T I d e n t i f i e r _ V a t A m o u n t L i n e < / V A T I d e n t i f i e r _ V a t A m o u n t L i n e > + 
+             < V A T I d e n t i f i e r _ V a t A m o u n t L i n e _ L b l > V A T I d e n t i f i e r _ V a t A m o u n t L i n e _ L b l < / V A T I d e n t i f i e r _ V a t A m o u n t L i n e _ L b l > + 
+             < V A T P c t _ V a t A m o u n t L i n e > V A T P c t _ V a t A m o u n t L i n e < / V A T P c t _ V a t A m o u n t L i n e > + 
+             < V A T P c t _ V a t A m o u n t L i n e _ L b l > V A T P c t _ V a t A m o u n t L i n e _ L b l < / V A T P c t _ V a t A m o u n t L i n e _ L b l > + 
+         < / V A T A m o u n t L i n e > + 
+         < V A T C l a u s e L i n e > + 
+             < C o d e _ V A T C l a u s e L i n e > C o d e _ V A T C l a u s e L i n e < / C o d e _ V A T C l a u s e L i n e > + 
+             < C o d e _ V A T C l a u s e L i n e _ L b l > C o d e _ V A T C l a u s e L i n e _ L b l < / C o d e _ V A T C l a u s e L i n e _ L b l > + 
+             < D e s c r i p t i o n _ V A T C l a u s e L i n e > D e s c r i p t i o n _ V A T C l a u s e L i n e < / D e s c r i p t i o n _ V A T C l a u s e L i n e > + 
+             < D e s c r i p t i o n 2 _ V A T C l a u s e L i n e > D e s c r i p t i o n 2 _ V A T C l a u s e L i n e < / D e s c r i p t i o n 2 _ V A T C l a u s e L i n e > + 
+             < N o O f V A T C l a u s e s > N o O f V A T C l a u s e s < / N o O f V A T C l a u s e s > + 
+             < V A T A m o u n t _ V A T C l a u s e L i n e > V A T A m o u n t _ V A T C l a u s e L i n e < / V A T A m o u n t _ V A T C l a u s e L i n e > + 
+             < V A T C l a u s e s H e a d e r > V A T C l a u s e s H e a d e r < / V A T C l a u s e s H e a d e r > + 
+             < V A T I d e n t i f i e r _ V A T C l a u s e L i n e > V A T I d e n t i f i e r _ V A T C l a u s e L i n e < / V A T I d e n t i f i e r _ V A T C l a u s e L i n e > + 
+         < / V A T C l a u s e L i n e > + 
+         < R e p o r t T o t a l s L i n e > + 
+             < A m o u n t _ R e p o r t T o t a l s L i n e > A m o u n t _ R e p o r t T o t a l s L i n e < / A m o u n t _ R e p o r t T o t a l s L i n e > + 
+             < A m o u n t F o r m a t t e d _ R e p o r t T o t a l s L i n e > A m o u n t F o r m a t t e d _ R e p o r t T o t a l s L i n e < / A m o u n t F o r m a t t e d _ R e p o r t T o t a l s L i n e > + 
+             < D e s c r i p t i o n _ R e p o r t T o t a l s L i n e > D e s c r i p t i o n _ R e p o r t T o t a l s L i n e < / D e s c r i p t i o n _ R e p o r t T o t a l s L i n e > + 
+             < F o n t B o l d _ R e p o r t T o t a l s L i n e > F o n t B o l d _ R e p o r t T o t a l s L i n e < / F o n t B o l d _ R e p o r t T o t a l s L i n e > + 
+             < F o n t U n d e r l i n e _ R e p o r t T o t a l s L i n e > F o n t U n d e r l i n e _ R e p o r t T o t a l s L i n e < / F o n t U n d e r l i n e _ R e p o r t T o t a l s L i n e > + 
+         < / R e p o r t T o t a l s L i n e > + 
+         < C o n t r a c t B i l l i n g D e t a i l s M a p p i n g > + 
+             < C o n t r a c t B i l l i n g D e t a i l s C o n t r a c t N o L b l > C o n t r a c t B i l l i n g D e t a i l s C o n t r a c t N o L b l < / C o n t r a c t B i l l i n g D e t a i l s C o n t r a c t N o L b l > + 
+             < C o n t r a c t B i l l i n g D e t a i l s C u s t o m e r L b l > C o n t r a c t B i l l i n g D e t a i l s C u s t o m e r L b l < / C o n t r a c t B i l l i n g D e t a i l s C u s t o m e r L b l > + 
+             < C o n t r a c t B i l l i n g D e t a i l s P o s i t i o n D e s c r i p t i o n L b l > C o n t r a c t B i l l i n g D e t a i l s P o s i t i o n D e s c r i p t i o n L b l < / C o n t r a c t B i l l i n g D e t a i l s P o s i t i o n D e s c r i p t i o n L b l > + 
+             < C o n t r a c t B i l l i n g D e t a i l s P o s i t i o n N o L b l > C o n t r a c t B i l l i n g D e t a i l s P o s i t i o n N o L b l < / C o n t r a c t B i l l i n g D e t a i l s P o s i t i o n N o L b l > + 
+             < C o n t r a c t B i l l i n g D e t a i l s G r o u p i n g > + 
+                 < C o n t r a c t B i l l i n g D e t a i l s A m o u n t L b l > C o n t r a c t B i l l i n g D e t a i l s A m o u n t L b l < / C o n t r a c t B i l l i n g D e t a i l s A m o u n t L b l > + 
+                 < C o n t r a c t B i l l i n g D e t a i l s C o n t r a c t N o > C o n t r a c t B i l l i n g D e t a i l s C o n t r a c t N o < / C o n t r a c t B i l l i n g D e t a i l s C o n t r a c t N o > + 
+                 < C o n t r a c t B i l l i n g D e t a i l s C u r r e n c y C o d e L b l > C o n t r a c t B i l l i n g D e t a i l s C u r r e n c y C o d e L b l < / C o n t r a c t B i l l i n g D e t a i l s C u r r e n c y C o d e L b l > + 
+                 < C o n t r a c t B i l l i n g D e t a i l s C u s t o m e r N a m e > C o n t r a c t B i l l i n g D e t a i l s C u s t o m e r N a m e < / C o n t r a c t B i l l i n g D e t a i l s C u s t o m e r N a m e > + 
+                 < C o n t r a c t B i l l i n g D e t a i l s D a y s L b l > C o n t r a c t B i l l i n g D e t a i l s D a y s L b l < / C o n t r a c t B i l l i n g D e t a i l s D a y s L b l > + 
+                 < C o n t r a c t B i l l i n g D e t a i l s D e s c r i p t i o n L b l > C o n t r a c t B i l l i n g D e t a i l s D e s c r i p t i o n L b l < / C o n t r a c t B i l l i n g D e t a i l s D e s c r i p t i o n L b l > + 
+                 < C o n t r a c t B i l l i n g D e t a i l s D i s c o u n t A m o u n t L b l > C o n t r a c t B i l l i n g D e t a i l s D i s c o u n t A m o u n t L b l < / C o n t r a c t B i l l i n g D e t a i l s D i s c o u n t A m o u n t L b l > + 
+                 < C o n t r a c t B i l l i n g D e t a i l s D i s c o u n t P e r c e n t L b l > C o n t r a c t B i l l i n g D e t a i l s D i s c o u n t P e r c e n t L b l < / C o n t r a c t B i l l i n g D e t a i l s D i s c o u n t P e r c e n t L b l > + 
+                 < C o n t r a c t B i l l i n g D e t a i l s E n d D a t e L b l > C o n t r a c t B i l l i n g D e t a i l s E n d D a t e L b l < / C o n t r a c t B i l l i n g D e t a i l s E n d D a t e L b l > + 
+                 < C o n t r a c t B i l l i n g D e t a i l s P o s i t i o n D e s c r i p t i o n > C o n t r a c t B i l l i n g D e t a i l s P o s i t i o n D e s c r i p t i o n < / C o n t r a c t B i l l i n g D e t a i l s P o s i t i o n D e s c r i p t i o n > + 
+                 < C o n t r a c t B i l l i n g D e t a i l s P o s i t i o n N o > C o n t r a c t B i l l i n g D e t a i l s P o s i t i o n N o < / C o n t r a c t B i l l i n g D e t a i l s P o s i t i o n N o > + 
+                 < C o n t r a c t B i l l i n g D e t a i l s Q t y L b l > C o n t r a c t B i l l i n g D e t a i l s Q t y L b l < / C o n t r a c t B i l l i n g D e t a i l s Q t y L b l > + 
+                 < C o n t r a c t B i l l i n g D e t a i l s S a l e s P r i c e L b l > C o n t r a c t B i l l i n g D e t a i l s S a l e s P r i c e L b l < / C o n t r a c t B i l l i n g D e t a i l s S a l e s P r i c e L b l > + 
+                 < C o n t r a c t B i l l i n g D e t a i l s S t a r t D a t e L b l > C o n t r a c t B i l l i n g D e t a i l s S t a r t D a t e L b l < / C o n t r a c t B i l l i n g D e t a i l s S t a r t D a t e L b l > + 
+                 < C o n t r a c t B i l l i n g D e t a i l s > + 
+                     < C o n t r a c t B i l l i n g D e t a i l s B i l l i n g A m o u n t > C o n t r a c t B i l l i n g D e t a i l s B i l l i n g A m o u n t < / C o n t r a c t B i l l i n g D e t a i l s B i l l i n g A m o u n t > + 
+                     < C o n t r a c t B i l l i n g D e t a i l s B i l l i n g D i s c o u n t A m o u n t > C o n t r a c t B i l l i n g D e t a i l s B i l l i n g D i s c o u n t A m o u n t < / C o n t r a c t B i l l i n g D e t a i l s B i l l i n g D i s c o u n t A m o u n t > + 
+                     < C o n t r a c t B i l l i n g D e t a i l s C u r r e n c y C o d e > C o n t r a c t B i l l i n g D e t a i l s C u r r e n c y C o d e < / C o n t r a c t B i l l i n g D e t a i l s C u r r e n c y C o d e > + 
+                     < C o n t r a c t B i l l i n g D e t a i l s D a y s > C o n t r a c t B i l l i n g D e t a i l s D a y s < / C o n t r a c t B i l l i n g D e t a i l s D a y s > + 
+                     < C o n t r a c t B i l l i n g D e t a i l s D e s c r i p t i o n > C o n t r a c t B i l l i n g D e t a i l s D e s c r i p t i o n < / C o n t r a c t B i l l i n g D e t a i l s D e s c r i p t i o n > + 
+                     < C o n t r a c t B i l l i n g D e t a i l s D i s c o u n t P e r c e n t > C o n t r a c t B i l l i n g D e t a i l s D i s c o u n t P e r c e n t < / C o n t r a c t B i l l i n g D e t a i l s D i s c o u n t P e r c e n t > + 
+                     < C o n t r a c t B i l l i n g D e t a i l s E n d D a t e > C o n t r a c t B i l l i n g D e t a i l s E n d D a t e < / C o n t r a c t B i l l i n g D e t a i l s E n d D a t e > + 
+                     < C o n t r a c t B i l l i n g D e t a i l s Q u a n t i t y > C o n t r a c t B i l l i n g D e t a i l s Q u a n t i t y < / C o n t r a c t B i l l i n g D e t a i l s Q u a n t i t y > + 
+                     < C o n t r a c t B i l l i n g D e t a i l s S a l e s P r i c e > C o n t r a c t B i l l i n g D e t a i l s S a l e s P r i c e < / C o n t r a c t B i l l i n g D e t a i l s S a l e s P r i c e > + 
+                     < C o n t r a c t B i l l i n g D e t a i l s S t a r t D a t e > C o n t r a c t B i l l i n g D e t a i l s S t a r t D a t e < / C o n t r a c t B i l l i n g D e t a i l s S t a r t D a t e > + 
+                 < / C o n t r a c t B i l l i n g D e t a i l s > + 
+             < / C o n t r a c t B i l l i n g D e t a i l s G r o u p i n g > + 
+         < / C o n t r a c t B i l l i n g D e t a i l s M a p p i n g > + 
+         < L i n e F e e > + 
+             < L i n e F e e C a p t i o n T e x t > L i n e F e e C a p t i o n T e x t < / L i n e F e e C a p t i o n T e x t > + 
+         < / L i n e F e e > + 
+         < P a y m e n t R e p o r t i n g A r g u m e n t > + 
+             < P a y m e n t S e r v i c e L o g o / > + 
+             < P a y m e n t S e r v i c e L o g o _ U r l > P a y m e n t S e r v i c e L o g o _ U r l < / P a y m e n t S e r v i c e L o g o _ U r l > + 
+             < P a y m e n t S e r v i c e L o g o _ U r l T e x t > P a y m e n t S e r v i c e L o g o _ U r l T e x t < / P a y m e n t S e r v i c e L o g o _ U r l T e x t > + 
+             < P a y m e n t S e r v i c e T e x t _ U r l > P a y m e n t S e r v i c e T e x t _ U r l < / P a y m e n t S e r v i c e T e x t _ U r l > + 
+             < P a y m e n t S e r v i c e T e x t _ U r l T e x t > P a y m e n t S e r v i c e T e x t _ U r l T e x t < / P a y m e n t S e r v i c e T e x t _ U r l T e x t > + 
+         < / P a y m e n t R e p o r t i n g A r g u m e n t > + 
+         < L e f t H e a d e r > + 
+             < L e f t H e a d e r N a m e > L e f t H e a d e r N a m e < / L e f t H e a d e r N a m e > + 
+             < L e f t H e a d e r V a l u e > L e f t H e a d e r V a l u e < / L e f t H e a d e r V a l u e > + 
+         < / L e f t H e a d e r > + 
+         < R i g h t H e a d e r > + 
+             < R i g h t H e a d e r N a m e > R i g h t H e a d e r N a m e < / R i g h t H e a d e r N a m e > + 
+             < R i g h t H e a d e r V a l u e > R i g h t H e a d e r V a l u e < / R i g h t H e a d e r V a l u e > + 
+         < / R i g h t H e a d e r > + 
+         < L e t t e r T e x t > + 
+             < B o d y T e x t > B o d y T e x t < / B o d y T e x t > + 
+             < C l o s i n g T e x t > C l o s i n g T e x t < / C l o s i n g T e x t > + 
+             < G r e e t i n g T e x t > G r e e t i n g T e x t < / G r e e t i n g T e x t > + 
+             < P m t D i s c T e x t > P m t D i s c T e x t < / P m t D i s c T e x t > + 
+         < / L e t t e r T e x t > + 
+         < T o t a l s > + 
+             < C u r r e n c y C o d e > C u r r e n c y C o d e < / C u r r e n c y C o d e > + 
+             < C u r r e n c y S y m b o l > C u r r e n c y S y m b o l < / C u r r e n c y S y m b o l > + 
+             < T o t a l A m o u n t E x c l I n c l V A T > T o t a l A m o u n t E x c l I n c l V A T < / T o t a l A m o u n t E x c l I n c l V A T > + 
+             < T o t a l A m o u n t E x c l I n c l V A T T e x t > T o t a l A m o u n t E x c l I n c l V A T T e x t < / T o t a l A m o u n t E x c l I n c l V A T T e x t > + 
+             < T o t a l A m o u n t I n c l u d i n g V A T > T o t a l A m o u n t I n c l u d i n g V A T < / T o t a l A m o u n t I n c l u d i n g V A T > + 
+             < T o t a l C O 2 e > T o t a l C O 2 e < / T o t a l C O 2 e > + 
+             < T o t a l E x c l u d i n g V A T T e x t > T o t a l E x c l u d i n g V A T T e x t < / T o t a l E x c l u d i n g V A T T e x t > + 
+             < T o t a l I n c l u d i n g V A T T e x t > T o t a l I n c l u d i n g V A T T e x t < / T o t a l I n c l u d i n g V A T T e x t > + 
+             < T o t a l I n v o i c e D i s c o u n t A m o u n t > T o t a l I n v o i c e D i s c o u n t A m o u n t < / T o t a l I n v o i c e D i s c o u n t A m o u n t > + 
+             < T o t a l N e t A m o u n t > T o t a l N e t A m o u n t < / T o t a l N e t A m o u n t > + 
+             < T o t a l P a y m e n t D i s c o u n t O n V A T > T o t a l P a y m e n t D i s c o u n t O n V A T < / T o t a l P a y m e n t D i s c o u n t O n V A T > + 
+             < T o t a l S u b T o t a l > T o t a l S u b T o t a l < / T o t a l S u b T o t a l > + 
+             < T o t a l S u b T o t a l M i n u s I n v o i c e D i s c o u n t > T o t a l S u b T o t a l M i n u s I n v o i c e D i s c o u n t < / T o t a l S u b T o t a l M i n u s I n v o i c e D i s c o u n t > + 
+             < T o t a l T e x t > T o t a l T e x t < / T o t a l T e x t > + 
+             < T o t a l V A T A m o u n t > T o t a l V A T A m o u n t < / T o t a l V A T A m o u n t > + 
+             < T o t a l V A T A m o u n t L C Y > T o t a l V A T A m o u n t L C Y < / T o t a l V A T A m o u n t L C Y > + 
+             < T o t a l V A T A m o u n t O n V A T A m t L i n e > T o t a l V A T A m o u n t O n V A T A m t L i n e < / T o t a l V A T A m o u n t O n V A T A m t L i n e > + 
+             < T o t a l V A T A m o u n t T e x t > T o t a l V A T A m o u n t T e x t < / T o t a l V A T A m o u n t T e x t > + 
+             < T o t a l V A T B a s e L C Y > T o t a l V A T B a s e L C Y < / T o t a l V A T B a s e L C Y > + 
+             < T o t a l V A T B a s e O n V A T A m t L i n e > T o t a l V A T B a s e O n V A T A m t L i n e < / T o t a l V A T B a s e O n V A T A m t L i n e > + 
+         < / T o t a l s > + 
+     < / H e a d e r >   
  < / N a v W o r d R e p o r t X m l P a r t > 
 </file>
 
+<file path=customXml/item6.xml><?xml version="1.0" encoding="utf-8"?>
+<p:properties xmlns:p="http://schemas.microsoft.com/office/2006/metadata/properties" xmlns:xsi="http://www.w3.org/2001/XMLSchema-instance" xmlns:pc="http://schemas.microsoft.com/office/infopath/2007/PartnerControls">
+  <documentManagement>
+    <Package xmlns="178f68d8-b893-4efd-8406-fab0f21873e4" xsi:nil="true"/>
+    <lcf76f155ced4ddcb4097134ff3c332f xmlns="178f68d8-b893-4efd-8406-fab0f21873e4">
+      <Terms xmlns="http://schemas.microsoft.com/office/infopath/2007/PartnerControls"/>
+    </lcf76f155ced4ddcb4097134ff3c332f>
+    <_ip_UnifiedCompliancePolicyUIAction xmlns="http://schemas.microsoft.com/sharepoint/v3" xsi:nil="true"/>
+    <TaxCatchAll xmlns="b83e059f-de16-406c-a902-3d56d4e79ec8" xsi:nil="true"/>
+    <Audience xmlns="178f68d8-b893-4efd-8406-fab0f21873e4" xsi:nil="true"/>
+    <_ip_UnifiedCompliancePolicyProperties xmlns="http://schemas.microsoft.com/sharepoint/v3" xsi:nil="true"/>
+    <DocumentType xmlns="178f68d8-b893-4efd-8406-fab0f21873e4" xsi:nil="true"/>
+  </documentManagement>
+</p:properties>
+</file>
+
 <file path=customXml/itemProps1.xml><?xml version="1.0" encoding="utf-8"?>
+<ds:datastoreItem xmlns:ds="http://schemas.openxmlformats.org/officeDocument/2006/customXml" ds:itemID="{5DC62924-D53F-4D62-B713-57D2474A4953}">
+  <ds:schemaRefs>
+    <ds:schemaRef ds:uri="http://schemas.microsoft.com/office/2006/metadata/contentType"/>
+    <ds:schemaRef ds:uri="http://schemas.microsoft.com/office/2006/metadata/properties/metaAttributes"/>
+    <ds:schemaRef ds:uri="http://www.w3.org/2001/XMLSchema"/>
+    <ds:schemaRef ds:uri="http://schemas.microsoft.com/office/2006/metadata/properties"/>
+    <ds:schemaRef ds:uri="http://schemas.microsoft.com/sharepoint/v3"/>
+    <ds:schemaRef ds:uri="178f68d8-b893-4efd-8406-fab0f21873e4"/>
+    <ds:schemaRef ds:uri="b83e059f-de16-406c-a902-3d56d4e79ec8"/>
+    <ds:schemaRef ds:uri="http://schemas.microsoft.com/office/2006/documentManagement/types"/>
+    <ds:schemaRef ds:uri="http://schemas.microsoft.com/office/infopath/2007/PartnerControls"/>
+    <ds:schemaRef ds:uri="http://schemas.openxmlformats.org/package/2006/metadata/core-properties"/>
+    <ds:schemaRef ds:uri="http://purl.org/dc/elements/1.1/"/>
+    <ds:schemaRef ds:uri="http://purl.org/dc/terms/"/>
+    <ds:schemaRef ds:uri="http://schemas.microsoft.com/internal/obd"/>
+  </ds:schemaRefs>
+</ds:datastoreItem>
+</file>
+
+<file path=customXml/itemProps2.xml><?xml version="1.0" encoding="utf-8"?>
 <ds:datastoreItem xmlns:ds="http://schemas.openxmlformats.org/officeDocument/2006/customXml" ds:itemID="{7AEC2198-F042-4C71-9FA1-0766E4DE10D1}">
   <ds:schemaRefs>
     <ds:schemaRef ds:uri="http://schemas.microsoft.com/sharepoint/v3/contenttype/forms"/>
@@ -5061,7 +5760,7 @@
 </ds:datastoreItem>
 </file>
 
-<file path=customXml/itemProps2.xml><?xml version="1.0" encoding="utf-8"?>
+<file path=customXml/itemProps3.xml><?xml version="1.0" encoding="utf-8"?>
 <ds:datastoreItem xmlns:ds="http://schemas.openxmlformats.org/officeDocument/2006/customXml" ds:itemID="{89DB96BF-8133-438A-AAD3-A3C21079AEB1}">
   <ds:schemaRefs>
     <ds:schemaRef ds:uri="http://schemas.openxmlformats.org/officeDocument/2006/bibliography"/>
@@ -5069,7 +5768,23 @@
 </ds:datastoreItem>
 </file>
 
+<file path=customXml/itemProps4.xml><?xml version="1.0" encoding="utf-8"?>
+<ds:datastoreItem xmlns:ds="http://schemas.openxmlformats.org/officeDocument/2006/customXml" ds:itemID="{049B7810-1F08-44BD-8C92-120EB79841E6}">
+  <ds:schemaRefs>
+    <ds:schemaRef ds:uri="urn:microsoft-dynamics-businesscentral/internal/extended/reports/Standard_Sales_Invoice/1306/"/>
+  </ds:schemaRefs>
+</ds:datastoreItem>
+</file>
+
 <file path=customXml/itemProps5.xml><?xml version="1.0" encoding="utf-8"?>
+<ds:datastoreItem xmlns:ds="http://schemas.openxmlformats.org/officeDocument/2006/customXml" ds:itemID="{AF7A6226-6056-400F-ADDA-E1ADA7C08250}">
+  <ds:schemaRefs>
+    <ds:schemaRef ds:uri="urn:microsoft-dynamics-nav/reports/Standard_Sales_Invoice/1306/"/>
+  </ds:schemaRefs>
+</ds:datastoreItem>
+</file>
+
+<file path=customXml/itemProps6.xml><?xml version="1.0" encoding="utf-8"?>
 <ds:datastoreItem xmlns:ds="http://schemas.openxmlformats.org/officeDocument/2006/customXml" ds:itemID="{A86F1D83-C9A8-49B5-A7A4-4B754CFBD1D9}">
   <ds:schemaRefs>
     <ds:schemaRef ds:uri="http://schemas.microsoft.com/office/2006/metadata/properties"/>
@@ -5081,10 +5796,6 @@
 </ds:datastoreItem>
 </file>
 
-<file path=customXml/itemProps6.xml><?xml version="1.0" encoding="utf-8"?>
-<ds:datastoreItem xmlns:ds="http://schemas.openxmlformats.org/officeDocument/2006/customXml" ds:itemID="{5DC62924-D53F-4D62-B713-57D2474A4953}"/>
-</file>
-
 <file path=docMetadata/LabelInfo.xml><?xml version="1.0" encoding="utf-8"?>
 <clbl:labelList xmlns:clbl="http://schemas.microsoft.com/office/2020/mipLabelMetadata">
   <clbl:label id="{f42aa342-8706-4288-bd11-ebb85995028c}" enabled="1" method="Standard" siteId="{72f988bf-86f1-41af-91ab-2d7cd011db47}" contentBits="0" removed="0"/>

</xml_diff>